<commit_message>
Embed ERD, isolation, access-role and lifecycle diagrams in the database design document (v0.2)
- tools/dbgen/erd.py: diagrams generated from the model's real foreign keys (core tenancy, isolation, roles, request lifecycle, 12 module ERDs), PNG quantized to keep the Word file small
- docs/20-database-design.md: figures in 3.1 (isolation), 3.7 (core relations), 9.1 (roles), 10.2 (module ERDs), 11.1 (request lifecycle); changelog C-10
- tools/md2docx: embeds PNG images with captions
- dbgen: ERD in docs/22 no longer emits placeholder entities

Claude-Session: https://claude.ai/code/session_012HHcRrzuvMBTL2FYxXtsyv
</commit_message>
<xml_diff>
--- a/treasury-platform/docs/20-database-design.docx
+++ b/treasury-platform/docs/20-database-design.docx
@@ -1096,7 +1096,7 @@
         <w:spacing w:after="50" w:before="0"/>
         <w:ind w:left="0"/>
       </w:pPr>
-      <w:hyperlink w:history="1" w:anchor="_sec11">
+      <w:hyperlink w:history="1" w:anchor="_sec12">
         <w:r>
           <w:rPr>
             <w:rFonts w:ascii="Arial" w:cs="Arial" w:eastAsia="Arial" w:hAnsi="Arial"/>
@@ -1117,7 +1117,7 @@
         <w:spacing w:after="50" w:before="0"/>
         <w:ind w:left="0"/>
       </w:pPr>
-      <w:hyperlink w:history="1" w:anchor="_sec12">
+      <w:hyperlink w:history="1" w:anchor="_sec13">
         <w:r>
           <w:rPr>
             <w:rFonts w:ascii="Arial" w:cs="Arial" w:eastAsia="Arial" w:hAnsi="Arial"/>
@@ -1138,7 +1138,7 @@
         <w:spacing w:after="50" w:before="0"/>
         <w:ind w:left="0"/>
       </w:pPr>
-      <w:hyperlink w:history="1" w:anchor="_sec16">
+      <w:hyperlink w:history="1" w:anchor="_sec17">
         <w:r>
           <w:rPr>
             <w:rFonts w:ascii="Arial" w:cs="Arial" w:eastAsia="Arial" w:hAnsi="Arial"/>
@@ -1159,7 +1159,7 @@
         <w:spacing w:after="50" w:before="0"/>
         <w:ind w:left="0"/>
       </w:pPr>
-      <w:hyperlink w:history="1" w:anchor="_sec21">
+      <w:hyperlink w:history="1" w:anchor="_sec22">
         <w:r>
           <w:rPr>
             <w:rFonts w:ascii="Arial" w:cs="Arial" w:eastAsia="Arial" w:hAnsi="Arial"/>
@@ -1180,7 +1180,7 @@
         <w:spacing w:after="50" w:before="0"/>
         <w:ind w:left="0"/>
       </w:pPr>
-      <w:hyperlink w:history="1" w:anchor="_sec23">
+      <w:hyperlink w:history="1" w:anchor="_sec24">
         <w:r>
           <w:rPr>
             <w:rFonts w:ascii="Arial" w:cs="Arial" w:eastAsia="Arial" w:hAnsi="Arial"/>
@@ -1201,7 +1201,7 @@
         <w:spacing w:after="50" w:before="0"/>
         <w:ind w:left="0"/>
       </w:pPr>
-      <w:hyperlink w:history="1" w:anchor="_sec24">
+      <w:hyperlink w:history="1" w:anchor="_sec25">
         <w:r>
           <w:rPr>
             <w:rFonts w:ascii="Arial" w:cs="Arial" w:eastAsia="Arial" w:hAnsi="Arial"/>
@@ -1222,7 +1222,7 @@
         <w:spacing w:after="50" w:before="0"/>
         <w:ind w:left="0"/>
       </w:pPr>
-      <w:hyperlink w:history="1" w:anchor="_sec29">
+      <w:hyperlink w:history="1" w:anchor="_sec30">
         <w:r>
           <w:rPr>
             <w:rFonts w:ascii="Arial" w:cs="Arial" w:eastAsia="Arial" w:hAnsi="Arial"/>
@@ -1243,7 +1243,7 @@
         <w:spacing w:after="50" w:before="0"/>
         <w:ind w:left="0"/>
       </w:pPr>
-      <w:hyperlink w:history="1" w:anchor="_sec31">
+      <w:hyperlink w:history="1" w:anchor="_sec45">
         <w:r>
           <w:rPr>
             <w:rFonts w:ascii="Arial" w:cs="Arial" w:eastAsia="Arial" w:hAnsi="Arial"/>
@@ -1264,7 +1264,7 @@
         <w:spacing w:after="50" w:before="0"/>
         <w:ind w:left="0"/>
       </w:pPr>
-      <w:hyperlink w:history="1" w:anchor="_sec33">
+      <w:hyperlink w:history="1" w:anchor="_sec47">
         <w:r>
           <w:rPr>
             <w:rFonts w:ascii="Arial" w:cs="Arial" w:eastAsia="Arial" w:hAnsi="Arial"/>
@@ -1285,7 +1285,7 @@
         <w:spacing w:after="50" w:before="0"/>
         <w:ind w:left="0"/>
       </w:pPr>
-      <w:hyperlink w:history="1" w:anchor="_sec38">
+      <w:hyperlink w:history="1" w:anchor="_sec52">
         <w:r>
           <w:rPr>
             <w:rFonts w:ascii="Arial" w:cs="Arial" w:eastAsia="Arial" w:hAnsi="Arial"/>
@@ -1306,7 +1306,7 @@
         <w:spacing w:after="50" w:before="0"/>
         <w:ind w:left="0"/>
       </w:pPr>
-      <w:hyperlink w:history="1" w:anchor="_sec39">
+      <w:hyperlink w:history="1" w:anchor="_sec53">
         <w:r>
           <w:rPr>
             <w:rFonts w:ascii="Arial" w:cs="Arial" w:eastAsia="Arial" w:hAnsi="Arial"/>
@@ -1327,7 +1327,7 @@
         <w:spacing w:after="50" w:before="0"/>
         <w:ind w:left="0"/>
       </w:pPr>
-      <w:hyperlink w:history="1" w:anchor="_sec40">
+      <w:hyperlink w:history="1" w:anchor="_sec54">
         <w:r>
           <w:rPr>
             <w:rFonts w:ascii="Arial" w:cs="Arial" w:eastAsia="Arial" w:hAnsi="Arial"/>
@@ -1348,7 +1348,7 @@
         <w:spacing w:after="50" w:before="0"/>
         <w:ind w:left="0"/>
       </w:pPr>
-      <w:hyperlink w:history="1" w:anchor="_sec41">
+      <w:hyperlink w:history="1" w:anchor="_sec55">
         <w:r>
           <w:rPr>
             <w:rFonts w:ascii="Arial" w:cs="Arial" w:eastAsia="Arial" w:hAnsi="Arial"/>
@@ -1369,7 +1369,7 @@
         <w:spacing w:after="50" w:before="0"/>
         <w:ind w:left="0"/>
       </w:pPr>
-      <w:hyperlink w:history="1" w:anchor="_sec42">
+      <w:hyperlink w:history="1" w:anchor="_sec56">
         <w:r>
           <w:rPr>
             <w:rFonts w:ascii="Arial" w:cs="Arial" w:eastAsia="Arial" w:hAnsi="Arial"/>
@@ -1441,8 +1441,8 @@
       </w:tblPr>
       <w:tblGrid>
         <w:gridCol w:w="1000"/>
-        <w:gridCol w:w="4770"/>
-        <w:gridCol w:w="4094"/>
+        <w:gridCol w:w="4845"/>
+        <w:gridCol w:w="4019"/>
       </w:tblGrid>
       <w:tr>
         <w:trPr>
@@ -1489,7 +1489,7 @@
         </w:tc>
         <w:tc>
           <w:tcPr>
-            <w:tcW w:type="dxa" w:w="4770"/>
+            <w:tcW w:type="dxa" w:w="4845"/>
             <w:tcBorders>
               <w:top w:val="single" w:color="BFC9D6" w:sz="4"/>
               <w:left w:val="single" w:color="BFC9D6" w:sz="4"/>
@@ -1527,7 +1527,7 @@
         </w:tc>
         <w:tc>
           <w:tcPr>
-            <w:tcW w:type="dxa" w:w="4094"/>
+            <w:tcW w:type="dxa" w:w="4019"/>
             <w:tcBorders>
               <w:top w:val="single" w:color="BFC9D6" w:sz="4"/>
               <w:left w:val="single" w:color="BFC9D6" w:sz="4"/>
@@ -1606,7 +1606,7 @@
         </w:tc>
         <w:tc>
           <w:tcPr>
-            <w:tcW w:type="dxa" w:w="4770"/>
+            <w:tcW w:type="dxa" w:w="4845"/>
             <w:tcBorders>
               <w:top w:val="single" w:color="BFC9D6" w:sz="4"/>
               <w:left w:val="single" w:color="BFC9D6" w:sz="4"/>
@@ -1677,7 +1677,7 @@
         </w:tc>
         <w:tc>
           <w:tcPr>
-            <w:tcW w:type="dxa" w:w="4094"/>
+            <w:tcW w:type="dxa" w:w="4019"/>
             <w:tcBorders>
               <w:top w:val="single" w:color="BFC9D6" w:sz="4"/>
               <w:left w:val="single" w:color="BFC9D6" w:sz="4"/>
@@ -1755,7 +1755,7 @@
         </w:tc>
         <w:tc>
           <w:tcPr>
-            <w:tcW w:type="dxa" w:w="4770"/>
+            <w:tcW w:type="dxa" w:w="4845"/>
             <w:tcBorders>
               <w:top w:val="single" w:color="BFC9D6" w:sz="4"/>
               <w:left w:val="single" w:color="BFC9D6" w:sz="4"/>
@@ -1838,7 +1838,7 @@
         </w:tc>
         <w:tc>
           <w:tcPr>
-            <w:tcW w:type="dxa" w:w="4094"/>
+            <w:tcW w:type="dxa" w:w="4019"/>
             <w:tcBorders>
               <w:top w:val="single" w:color="BFC9D6" w:sz="4"/>
               <w:left w:val="single" w:color="BFC9D6" w:sz="4"/>
@@ -2012,7 +2012,7 @@
         </w:tc>
         <w:tc>
           <w:tcPr>
-            <w:tcW w:type="dxa" w:w="4770"/>
+            <w:tcW w:type="dxa" w:w="4845"/>
             <w:tcBorders>
               <w:top w:val="single" w:color="BFC9D6" w:sz="4"/>
               <w:left w:val="single" w:color="BFC9D6" w:sz="4"/>
@@ -2133,7 +2133,7 @@
         </w:tc>
         <w:tc>
           <w:tcPr>
-            <w:tcW w:type="dxa" w:w="4094"/>
+            <w:tcW w:type="dxa" w:w="4019"/>
             <w:tcBorders>
               <w:top w:val="single" w:color="BFC9D6" w:sz="4"/>
               <w:left w:val="single" w:color="BFC9D6" w:sz="4"/>
@@ -2211,7 +2211,7 @@
         </w:tc>
         <w:tc>
           <w:tcPr>
-            <w:tcW w:type="dxa" w:w="4770"/>
+            <w:tcW w:type="dxa" w:w="4845"/>
             <w:tcBorders>
               <w:top w:val="single" w:color="BFC9D6" w:sz="4"/>
               <w:left w:val="single" w:color="BFC9D6" w:sz="4"/>
@@ -2261,7 +2261,7 @@
         </w:tc>
         <w:tc>
           <w:tcPr>
-            <w:tcW w:type="dxa" w:w="4094"/>
+            <w:tcW w:type="dxa" w:w="4019"/>
             <w:tcBorders>
               <w:top w:val="single" w:color="BFC9D6" w:sz="4"/>
               <w:left w:val="single" w:color="BFC9D6" w:sz="4"/>
@@ -2339,7 +2339,7 @@
         </w:tc>
         <w:tc>
           <w:tcPr>
-            <w:tcW w:type="dxa" w:w="4770"/>
+            <w:tcW w:type="dxa" w:w="4845"/>
             <w:tcBorders>
               <w:top w:val="single" w:color="BFC9D6" w:sz="4"/>
               <w:left w:val="single" w:color="BFC9D6" w:sz="4"/>
@@ -2375,7 +2375,7 @@
         </w:tc>
         <w:tc>
           <w:tcPr>
-            <w:tcW w:type="dxa" w:w="4094"/>
+            <w:tcW w:type="dxa" w:w="4019"/>
             <w:tcBorders>
               <w:top w:val="single" w:color="BFC9D6" w:sz="4"/>
               <w:left w:val="single" w:color="BFC9D6" w:sz="4"/>
@@ -2453,7 +2453,7 @@
         </w:tc>
         <w:tc>
           <w:tcPr>
-            <w:tcW w:type="dxa" w:w="4770"/>
+            <w:tcW w:type="dxa" w:w="4845"/>
             <w:tcBorders>
               <w:top w:val="single" w:color="BFC9D6" w:sz="4"/>
               <w:left w:val="single" w:color="BFC9D6" w:sz="4"/>
@@ -2490,7 +2490,7 @@
         </w:tc>
         <w:tc>
           <w:tcPr>
-            <w:tcW w:type="dxa" w:w="4094"/>
+            <w:tcW w:type="dxa" w:w="4019"/>
             <w:tcBorders>
               <w:top w:val="single" w:color="BFC9D6" w:sz="4"/>
               <w:left w:val="single" w:color="BFC9D6" w:sz="4"/>
@@ -2568,7 +2568,7 @@
         </w:tc>
         <w:tc>
           <w:tcPr>
-            <w:tcW w:type="dxa" w:w="4770"/>
+            <w:tcW w:type="dxa" w:w="4845"/>
             <w:tcBorders>
               <w:top w:val="single" w:color="BFC9D6" w:sz="4"/>
               <w:left w:val="single" w:color="BFC9D6" w:sz="4"/>
@@ -2663,7 +2663,7 @@
         </w:tc>
         <w:tc>
           <w:tcPr>
-            <w:tcW w:type="dxa" w:w="4094"/>
+            <w:tcW w:type="dxa" w:w="4019"/>
             <w:tcBorders>
               <w:top w:val="single" w:color="BFC9D6" w:sz="4"/>
               <w:left w:val="single" w:color="BFC9D6" w:sz="4"/>
@@ -2741,7 +2741,7 @@
         </w:tc>
         <w:tc>
           <w:tcPr>
-            <w:tcW w:type="dxa" w:w="4770"/>
+            <w:tcW w:type="dxa" w:w="4845"/>
             <w:tcBorders>
               <w:top w:val="single" w:color="BFC9D6" w:sz="4"/>
               <w:left w:val="single" w:color="BFC9D6" w:sz="4"/>
@@ -2802,7 +2802,7 @@
         </w:tc>
         <w:tc>
           <w:tcPr>
-            <w:tcW w:type="dxa" w:w="4094"/>
+            <w:tcW w:type="dxa" w:w="4019"/>
             <w:tcBorders>
               <w:top w:val="single" w:color="BFC9D6" w:sz="4"/>
               <w:left w:val="single" w:color="BFC9D6" w:sz="4"/>
@@ -2880,7 +2880,7 @@
         </w:tc>
         <w:tc>
           <w:tcPr>
-            <w:tcW w:type="dxa" w:w="4770"/>
+            <w:tcW w:type="dxa" w:w="4845"/>
             <w:tcBorders>
               <w:top w:val="single" w:color="BFC9D6" w:sz="4"/>
               <w:left w:val="single" w:color="BFC9D6" w:sz="4"/>
@@ -2940,7 +2940,7 @@
         </w:tc>
         <w:tc>
           <w:tcPr>
-            <w:tcW w:type="dxa" w:w="4094"/>
+            <w:tcW w:type="dxa" w:w="4019"/>
             <w:tcBorders>
               <w:top w:val="single" w:color="BFC9D6" w:sz="4"/>
               <w:left w:val="single" w:color="BFC9D6" w:sz="4"/>
@@ -2971,6 +2971,146 @@
                 <w:rtl/>
               </w:rPr>
               <w:t xml:space="preserve">لا يُعتمد على المراجعة اليدوية وحدها</w:t>
+            </w:r>
+          </w:p>
+        </w:tc>
+      </w:tr>
+      <w:tr>
+        <w:trPr>
+          <w:cantSplit/>
+        </w:trPr>
+        <w:tc>
+          <w:tcPr>
+            <w:tcW w:type="dxa" w:w="1000"/>
+            <w:tcBorders>
+              <w:top w:val="single" w:color="BFC9D6" w:sz="4"/>
+              <w:left w:val="single" w:color="BFC9D6" w:sz="4"/>
+              <w:bottom w:val="single" w:color="BFC9D6" w:sz="4"/>
+              <w:right w:val="single" w:color="BFC9D6" w:sz="4"/>
+            </w:tcBorders>
+            <w:shd w:fill="F5F8FC" w:color="auto" w:val="clear"/>
+            <w:tcMar>
+              <w:top w:type="dxa" w:w="50"/>
+              <w:left w:type="dxa" w:w="90"/>
+              <w:bottom w:type="dxa" w:w="50"/>
+              <w:right w:type="dxa" w:w="90"/>
+            </w:tcMar>
+            <w:vAlign w:val="top"/>
+          </w:tcPr>
+          <w:p>
+            <w:pPr>
+              <w:keepNext w:val="false"/>
+              <w:bidi/>
+              <w:spacing w:after="30" w:before="30" w:line="264"/>
+            </w:pPr>
+            <w:r>
+              <w:rPr>
+                <w:rFonts w:ascii="Arial" w:cs="Arial" w:eastAsia="Arial" w:hAnsi="Arial"/>
+                <w:b w:val="false"/>
+                <w:bCs w:val="false"/>
+                <w:sz w:val="18"/>
+                <w:szCs w:val="18"/>
+                <w:rtl/>
+              </w:rPr>
+              <w:t xml:space="preserve">C-10</w:t>
+            </w:r>
+          </w:p>
+        </w:tc>
+        <w:tc>
+          <w:tcPr>
+            <w:tcW w:type="dxa" w:w="4845"/>
+            <w:tcBorders>
+              <w:top w:val="single" w:color="BFC9D6" w:sz="4"/>
+              <w:left w:val="single" w:color="BFC9D6" w:sz="4"/>
+              <w:bottom w:val="single" w:color="BFC9D6" w:sz="4"/>
+              <w:right w:val="single" w:color="BFC9D6" w:sz="4"/>
+            </w:tcBorders>
+            <w:shd w:fill="F5F8FC" w:color="auto" w:val="clear"/>
+            <w:tcMar>
+              <w:top w:type="dxa" w:w="50"/>
+              <w:left w:type="dxa" w:w="90"/>
+              <w:bottom w:type="dxa" w:w="50"/>
+              <w:right w:type="dxa" w:w="90"/>
+            </w:tcMar>
+            <w:vAlign w:val="top"/>
+          </w:tcPr>
+          <w:p>
+            <w:pPr>
+              <w:keepNext w:val="false"/>
+              <w:bidi/>
+              <w:spacing w:after="30" w:before="30" w:line="264"/>
+            </w:pPr>
+            <w:r>
+              <w:rPr>
+                <w:rFonts w:ascii="Arial" w:cs="Arial" w:eastAsia="Arial" w:hAnsi="Arial"/>
+                <w:b w:val="false"/>
+                <w:bCs w:val="false"/>
+                <w:sz w:val="18"/>
+                <w:szCs w:val="18"/>
+                <w:rtl/>
+              </w:rPr>
+              <w:t xml:space="preserve">إضافة مخططات العلاقات والعزل والأدوار ودورة الطلب (صور تُولَّد من النموذج بـ</w:t>
+            </w:r>
+            <w:r>
+              <w:rPr>
+                <w:rFonts w:ascii="Courier New" w:cs="Courier New" w:eastAsia="Courier New" w:hAnsi="Courier New"/>
+                <w:b w:val="false"/>
+                <w:bCs w:val="false"/>
+                <w:color w:val="1F2937"/>
+                <w:sz w:val="16"/>
+                <w:szCs w:val="16"/>
+                <w:shd w:fill="F1F3F5" w:color="auto" w:val="clear"/>
+                <w:rtl/>
+              </w:rPr>
+              <w:t xml:space="preserve">‎tools/dbgen/erd.py‎</w:t>
+            </w:r>
+            <w:r>
+              <w:rPr>
+                <w:rFonts w:ascii="Arial" w:cs="Arial" w:eastAsia="Arial" w:hAnsi="Arial"/>
+                <w:b w:val="false"/>
+                <w:bCs w:val="false"/>
+                <w:sz w:val="18"/>
+                <w:szCs w:val="18"/>
+                <w:rtl/>
+              </w:rPr>
+              <w:t xml:space="preserve">)، ومنها مخطط العلاقات الأساسية في §3.7 ومخططات الوحدات في §10.2</w:t>
+            </w:r>
+          </w:p>
+        </w:tc>
+        <w:tc>
+          <w:tcPr>
+            <w:tcW w:type="dxa" w:w="4019"/>
+            <w:tcBorders>
+              <w:top w:val="single" w:color="BFC9D6" w:sz="4"/>
+              <w:left w:val="single" w:color="BFC9D6" w:sz="4"/>
+              <w:bottom w:val="single" w:color="BFC9D6" w:sz="4"/>
+              <w:right w:val="single" w:color="BFC9D6" w:sz="4"/>
+            </w:tcBorders>
+            <w:shd w:fill="F5F8FC" w:color="auto" w:val="clear"/>
+            <w:tcMar>
+              <w:top w:type="dxa" w:w="50"/>
+              <w:left w:type="dxa" w:w="90"/>
+              <w:bottom w:type="dxa" w:w="50"/>
+              <w:right w:type="dxa" w:w="90"/>
+            </w:tcMar>
+            <w:vAlign w:val="top"/>
+          </w:tcPr>
+          <w:p>
+            <w:pPr>
+              <w:keepNext w:val="false"/>
+              <w:bidi/>
+              <w:spacing w:after="30" w:before="30" w:line="264"/>
+            </w:pPr>
+            <w:r>
+              <w:rPr>
+                <w:rFonts w:ascii="Arial" w:cs="Arial" w:eastAsia="Arial" w:hAnsi="Arial"/>
+                <w:b w:val="false"/>
+                <w:bCs w:val="false"/>
+                <w:sz w:val="18"/>
+                <w:szCs w:val="18"/>
+                <w:rtl/>
+              </w:rPr>
+              <w:t xml:space="preserve">طُلب توضيح العلاقات بين الجداول وعزل المشتركين بمخطط لا بنص وحده</w:t>
             </w:r>
           </w:p>
         </w:tc>
@@ -7039,6 +7179,75 @@
           <w:rtl/>
         </w:rPr>
         <w:t xml:space="preserve"> (انظر الحد المتبقي في §3.2).</w:t>
+      </w:r>
+    </w:p>
+    <w:p>
+      <w:pPr>
+        <w:keepNext/>
+        <w:bidi/>
+        <w:spacing w:after="60" w:before="160"/>
+        <w:jc w:val="center"/>
+      </w:pPr>
+      <w:r>
+        <w:drawing>
+          <wp:inline distT="0" distB="0" distL="0" distR="0">
+            <wp:extent cx="6096000" cy="3219450"/>
+            <wp:effectExtent t="0" r="0" b="0" l="0"/>
+            <wp:docPr id="1" name="diagrams/erd_01_isolation.png" descr="مخطط العزل: مشتركان بجداول متطابقة، والسهم بينهما مرفوض بالمفتاح المركّب" title="مخطط العزل: مشتركان بجداول متطابقة، والسهم بينهما مرفوض بالمفتاح المركّب"/>
+            <wp:cNvGraphicFramePr>
+              <a:graphicFrameLocks xmlns:a="http://schemas.openxmlformats.org/drawingml/2006/main" noChangeAspect="1"/>
+            </wp:cNvGraphicFramePr>
+            <a:graphic xmlns:a="http://schemas.openxmlformats.org/drawingml/2006/main">
+              <a:graphicData uri="http://schemas.openxmlformats.org/drawingml/2006/picture">
+                <pic:pic xmlns:pic="http://schemas.openxmlformats.org/drawingml/2006/picture">
+                  <pic:nvPicPr>
+                    <pic:cNvPr id="0" name="" descr=""/>
+                    <pic:cNvPicPr>
+                      <a:picLocks noChangeAspect="1" noChangeArrowheads="1"/>
+                    </pic:cNvPicPr>
+                  </pic:nvPicPr>
+                  <pic:blipFill>
+                    <a:blip r:embed="rId9" cstate="none"/>
+                    <a:srcRect/>
+                    <a:stretch>
+                      <a:fillRect/>
+                    </a:stretch>
+                  </pic:blipFill>
+                  <pic:spPr bwMode="auto">
+                    <a:xfrm>
+                      <a:off x="0" y="0"/>
+                      <a:ext cx="6096000" cy="3219450"/>
+                    </a:xfrm>
+                    <a:prstGeom prst="rect">
+                      <a:avLst/>
+                    </a:prstGeom>
+                  </pic:spPr>
+                </pic:pic>
+              </a:graphicData>
+            </a:graphic>
+          </wp:inline>
+        </w:drawing>
+      </w:r>
+    </w:p>
+    <w:p>
+      <w:pPr>
+        <w:bidi/>
+        <w:spacing w:after="220" w:before="0"/>
+        <w:jc w:val="center"/>
+      </w:pPr>
+      <w:r>
+        <w:rPr>
+          <w:rFonts w:ascii="Arial" w:cs="Arial" w:eastAsia="Arial" w:hAnsi="Arial"/>
+          <w:b w:val="false"/>
+          <w:bCs w:val="false"/>
+          <w:i/>
+          <w:iCs/>
+          <w:color w:val="5B6670"/>
+          <w:sz w:val="17"/>
+          <w:szCs w:val="17"/>
+          <w:rtl/>
+        </w:rPr>
+        <w:t xml:space="preserve">مخطط العزل: مشتركان بجداول متطابقة، والسهم بينهما مرفوض بالمفتاح المركّب</w:t>
       </w:r>
     </w:p>
     <w:p>
@@ -10055,10 +10264,210 @@
     </w:p>
     <w:p>
       <w:pPr>
+        <w:pStyle w:val="Heading2"/>
+        <w:bidi/>
+      </w:pPr>
+      <w:bookmarkStart w:name="_sec11" w:id="11"/>
+      <w:r>
+        <w:rPr>
+          <w:rFonts w:ascii="Arial" w:cs="Arial" w:eastAsia="Arial" w:hAnsi="Arial"/>
+          <w:b/>
+          <w:bCs/>
+          <w:color w:val="2B5C8A"/>
+          <w:sz w:val="26"/>
+          <w:szCs w:val="26"/>
+          <w:rtl/>
+        </w:rPr>
+        <w:t xml:space="preserve">3.7 العلاقات الأساسية: المشترك والمستخدمون والصلاحيات</w:t>
+      </w:r>
+      <w:bookmarkEnd w:id="11"/>
+    </w:p>
+    <w:p>
+      <w:pPr>
+        <w:bidi/>
+        <w:spacing w:after="110" w:before="0" w:line="312"/>
+      </w:pPr>
+      <w:r>
+        <w:rPr>
+          <w:rFonts w:ascii="Arial" w:cs="Arial" w:eastAsia="Arial" w:hAnsi="Arial"/>
+          <w:b w:val="false"/>
+          <w:bCs w:val="false"/>
+          <w:sz w:val="21"/>
+          <w:szCs w:val="21"/>
+          <w:rtl/>
+        </w:rPr>
+        <w:t xml:space="preserve">يوضح المخطط كيف يرتبط المشترك (</w:t>
+      </w:r>
+      <w:r>
+        <w:rPr>
+          <w:rFonts w:ascii="Courier New" w:cs="Courier New" w:eastAsia="Courier New" w:hAnsi="Courier New"/>
+          <w:b w:val="false"/>
+          <w:bCs w:val="false"/>
+          <w:color w:val="1F2937"/>
+          <w:sz w:val="18"/>
+          <w:szCs w:val="18"/>
+          <w:shd w:fill="F1F3F5" w:color="auto" w:val="clear"/>
+          <w:rtl/>
+        </w:rPr>
+        <w:t xml:space="preserve">‎plat.Tenant‎</w:t>
+      </w:r>
+      <w:r>
+        <w:rPr>
+          <w:rFonts w:ascii="Arial" w:cs="Arial" w:eastAsia="Arial" w:hAnsi="Arial"/>
+          <w:b w:val="false"/>
+          <w:bCs w:val="false"/>
+          <w:sz w:val="21"/>
+          <w:szCs w:val="21"/>
+          <w:rtl/>
+        </w:rPr>
+        <w:t xml:space="preserve">، المركز المميَّز بالأصفر) بالمستخدمين والأدوار والصلاحيات ومفتاح تشفيره وشركاته. الأسهم المتصلة </w:t>
+      </w:r>
+      <w:r>
+        <w:rPr>
+          <w:rFonts w:ascii="Arial" w:cs="Arial" w:eastAsia="Arial" w:hAnsi="Arial"/>
+          <w:b/>
+          <w:bCs/>
+          <w:sz w:val="21"/>
+          <w:szCs w:val="21"/>
+          <w:rtl/>
+        </w:rPr>
+        <w:t xml:space="preserve">مفاتيح أجنبية فعلية</w:t>
+      </w:r>
+      <w:r>
+        <w:rPr>
+          <w:rFonts w:ascii="Arial" w:cs="Arial" w:eastAsia="Arial" w:hAnsi="Arial"/>
+          <w:b w:val="false"/>
+          <w:bCs w:val="false"/>
+          <w:sz w:val="21"/>
+          <w:szCs w:val="21"/>
+          <w:rtl/>
+        </w:rPr>
+        <w:t xml:space="preserve"> مع اسم العمود عليها. الأسهم المتقطعة الذهبية تعني أن الجدول مملوك للمشترك ويحمل </w:t>
+      </w:r>
+      <w:r>
+        <w:rPr>
+          <w:rFonts w:ascii="Courier New" w:cs="Courier New" w:eastAsia="Courier New" w:hAnsi="Courier New"/>
+          <w:b w:val="false"/>
+          <w:bCs w:val="false"/>
+          <w:color w:val="1F2937"/>
+          <w:sz w:val="18"/>
+          <w:szCs w:val="18"/>
+          <w:shd w:fill="F1F3F5" w:color="auto" w:val="clear"/>
+          <w:rtl/>
+        </w:rPr>
+        <w:t xml:space="preserve">‎TenantId‎</w:t>
+      </w:r>
+      <w:r>
+        <w:rPr>
+          <w:rFonts w:ascii="Arial" w:cs="Arial" w:eastAsia="Arial" w:hAnsi="Arial"/>
+          <w:b w:val="false"/>
+          <w:bCs w:val="false"/>
+          <w:sz w:val="21"/>
+          <w:szCs w:val="21"/>
+          <w:rtl/>
+        </w:rPr>
+        <w:t xml:space="preserve"> يشير إلى </w:t>
+      </w:r>
+      <w:r>
+        <w:rPr>
+          <w:rFonts w:ascii="Courier New" w:cs="Courier New" w:eastAsia="Courier New" w:hAnsi="Courier New"/>
+          <w:b w:val="false"/>
+          <w:bCs w:val="false"/>
+          <w:color w:val="1F2937"/>
+          <w:sz w:val="18"/>
+          <w:szCs w:val="18"/>
+          <w:shd w:fill="F1F3F5" w:color="auto" w:val="clear"/>
+          <w:rtl/>
+        </w:rPr>
+        <w:t xml:space="preserve">‎plat.Tenant‎</w:t>
+      </w:r>
+      <w:r>
+        <w:rPr>
+          <w:rFonts w:ascii="Arial" w:cs="Arial" w:eastAsia="Arial" w:hAnsi="Arial"/>
+          <w:b w:val="false"/>
+          <w:bCs w:val="false"/>
+          <w:sz w:val="21"/>
+          <w:szCs w:val="21"/>
+          <w:rtl/>
+        </w:rPr>
+        <w:t xml:space="preserve">؛ رسمها لكل جدول يجعل الصورة أكثر ازدحامًا، لذا تُذكر هنا بالدلالة فقط.</w:t>
+      </w:r>
+    </w:p>
+    <w:p>
+      <w:pPr>
+        <w:keepNext/>
+        <w:bidi/>
+        <w:spacing w:after="60" w:before="160"/>
+        <w:jc w:val="center"/>
+      </w:pPr>
+      <w:r>
+        <w:drawing>
+          <wp:inline distT="0" distB="0" distL="0" distR="0">
+            <wp:extent cx="6096000" cy="4572000"/>
+            <wp:effectExtent t="0" r="0" b="0" l="0"/>
+            <wp:docPr id="1" name="diagrams/erd_00_core_tenancy.png" descr="العلاقات الأساسية: المشترك والمستخدمون والأدوار والصلاحيات والمفاتيح" title="العلاقات الأساسية: المشترك والمستخدمون والأدوار والصلاحيات والمفاتيح"/>
+            <wp:cNvGraphicFramePr>
+              <a:graphicFrameLocks xmlns:a="http://schemas.openxmlformats.org/drawingml/2006/main" noChangeAspect="1"/>
+            </wp:cNvGraphicFramePr>
+            <a:graphic xmlns:a="http://schemas.openxmlformats.org/drawingml/2006/main">
+              <a:graphicData uri="http://schemas.openxmlformats.org/drawingml/2006/picture">
+                <pic:pic xmlns:pic="http://schemas.openxmlformats.org/drawingml/2006/picture">
+                  <pic:nvPicPr>
+                    <pic:cNvPr id="0" name="" descr=""/>
+                    <pic:cNvPicPr>
+                      <a:picLocks noChangeAspect="1" noChangeArrowheads="1"/>
+                    </pic:cNvPicPr>
+                  </pic:nvPicPr>
+                  <pic:blipFill>
+                    <a:blip r:embed="rId10" cstate="none"/>
+                    <a:srcRect/>
+                    <a:stretch>
+                      <a:fillRect/>
+                    </a:stretch>
+                  </pic:blipFill>
+                  <pic:spPr bwMode="auto">
+                    <a:xfrm>
+                      <a:off x="0" y="0"/>
+                      <a:ext cx="6096000" cy="4572000"/>
+                    </a:xfrm>
+                    <a:prstGeom prst="rect">
+                      <a:avLst/>
+                    </a:prstGeom>
+                  </pic:spPr>
+                </pic:pic>
+              </a:graphicData>
+            </a:graphic>
+          </wp:inline>
+        </w:drawing>
+      </w:r>
+    </w:p>
+    <w:p>
+      <w:pPr>
+        <w:bidi/>
+        <w:spacing w:after="220" w:before="0"/>
+        <w:jc w:val="center"/>
+      </w:pPr>
+      <w:r>
+        <w:rPr>
+          <w:rFonts w:ascii="Arial" w:cs="Arial" w:eastAsia="Arial" w:hAnsi="Arial"/>
+          <w:b w:val="false"/>
+          <w:bCs w:val="false"/>
+          <w:i/>
+          <w:iCs/>
+          <w:color w:val="5B6670"/>
+          <w:sz w:val="17"/>
+          <w:szCs w:val="17"/>
+          <w:rtl/>
+        </w:rPr>
+        <w:t xml:space="preserve">العلاقات الأساسية: المشترك والمستخدمون والأدوار والصلاحيات والمفاتيح</w:t>
+      </w:r>
+    </w:p>
+    <w:p>
+      <w:pPr>
         <w:pStyle w:val="Heading1"/>
         <w:bidi/>
       </w:pPr>
-      <w:bookmarkStart w:name="_sec11" w:id="11"/>
+      <w:bookmarkStart w:name="_sec12" w:id="12"/>
       <w:r>
         <w:rPr>
           <w:rFonts w:ascii="Arial" w:cs="Arial" w:eastAsia="Arial" w:hAnsi="Arial"/>
@@ -10071,7 +10480,7 @@
         </w:rPr>
         <w:t xml:space="preserve">4. الاتفاقيات (Conventions)</w:t>
       </w:r>
-      <w:bookmarkEnd w:id="11"/>
+      <w:bookmarkEnd w:id="12"/>
     </w:p>
     <w:tbl>
       <w:tblPr>
@@ -12041,7 +12450,7 @@
         <w:pStyle w:val="Heading1"/>
         <w:bidi/>
       </w:pPr>
-      <w:bookmarkStart w:name="_sec12" w:id="12"/>
+      <w:bookmarkStart w:name="_sec13" w:id="13"/>
       <w:r>
         <w:rPr>
           <w:rFonts w:ascii="Arial" w:cs="Arial" w:eastAsia="Arial" w:hAnsi="Arial"/>
@@ -12054,210 +12463,7 @@
         </w:rPr>
         <w:t xml:space="preserve">5. التاريخ والمراجعات ومصدر القيمة</w:t>
       </w:r>
-      <w:bookmarkEnd w:id="12"/>
-    </w:p>
-    <w:p>
-      <w:pPr>
-        <w:pStyle w:val="Heading2"/>
-        <w:bidi/>
-      </w:pPr>
-      <w:bookmarkStart w:name="_sec13" w:id="13"/>
-      <w:r>
-        <w:rPr>
-          <w:rFonts w:ascii="Arial" w:cs="Arial" w:eastAsia="Arial" w:hAnsi="Arial"/>
-          <w:b/>
-          <w:bCs/>
-          <w:color w:val="2B5C8A"/>
-          <w:sz w:val="26"/>
-          <w:szCs w:val="26"/>
-          <w:rtl/>
-        </w:rPr>
-        <w:t xml:space="preserve">5.1 الصفوف المراجَعة </w:t>
-      </w:r>
-      <w:r>
-        <w:rPr>
-          <w:rFonts w:ascii="Courier New" w:cs="Courier New" w:eastAsia="Courier New" w:hAnsi="Courier New"/>
-          <w:b/>
-          <w:bCs/>
-          <w:color w:val="1F2937"/>
-          <w:sz w:val="22"/>
-          <w:szCs w:val="22"/>
-          <w:rtl/>
-        </w:rPr>
-        <w:t xml:space="preserve">‎rev‎</w:t>
-      </w:r>
-      <w:r>
-        <w:rPr>
-          <w:rFonts w:ascii="Arial" w:cs="Arial" w:eastAsia="Arial" w:hAnsi="Arial"/>
-          <w:b/>
-          <w:bCs/>
-          <w:color w:val="2B5C8A"/>
-          <w:sz w:val="26"/>
-          <w:szCs w:val="26"/>
-          <w:rtl/>
-        </w:rPr>
-        <w:t xml:space="preserve"> (13 جدولًا)</w:t>
-      </w:r>
       <w:bookmarkEnd w:id="13"/>
-    </w:p>
-    <w:p>
-      <w:pPr>
-        <w:bidi/>
-        <w:spacing w:after="110" w:before="0" w:line="312"/>
-      </w:pPr>
-      <w:r>
-        <w:rPr>
-          <w:rFonts w:ascii="Arial" w:cs="Arial" w:eastAsia="Arial" w:hAnsi="Arial"/>
-          <w:b w:val="false"/>
-          <w:bCs w:val="false"/>
-          <w:sz w:val="21"/>
-          <w:szCs w:val="21"/>
-          <w:rtl/>
-        </w:rPr>
-        <w:t xml:space="preserve">الأعمدة: </w:t>
-      </w:r>
-      <w:r>
-        <w:rPr>
-          <w:rFonts w:ascii="Courier New" w:cs="Courier New" w:eastAsia="Courier New" w:hAnsi="Courier New"/>
-          <w:b w:val="false"/>
-          <w:bCs w:val="false"/>
-          <w:color w:val="1F2937"/>
-          <w:sz w:val="18"/>
-          <w:szCs w:val="18"/>
-          <w:shd w:fill="F1F3F5" w:color="auto" w:val="clear"/>
-          <w:rtl/>
-        </w:rPr>
-        <w:t xml:space="preserve">‎FromRevision‎</w:t>
-      </w:r>
-      <w:r>
-        <w:rPr>
-          <w:rFonts w:ascii="Arial" w:cs="Arial" w:eastAsia="Arial" w:hAnsi="Arial"/>
-          <w:b w:val="false"/>
-          <w:bCs w:val="false"/>
-          <w:sz w:val="21"/>
-          <w:szCs w:val="21"/>
-          <w:rtl/>
-        </w:rPr>
-        <w:t xml:space="preserve">, </w:t>
-      </w:r>
-      <w:r>
-        <w:rPr>
-          <w:rFonts w:ascii="Courier New" w:cs="Courier New" w:eastAsia="Courier New" w:hAnsi="Courier New"/>
-          <w:b w:val="false"/>
-          <w:bCs w:val="false"/>
-          <w:color w:val="1F2937"/>
-          <w:sz w:val="18"/>
-          <w:szCs w:val="18"/>
-          <w:shd w:fill="F1F3F5" w:color="auto" w:val="clear"/>
-          <w:rtl/>
-        </w:rPr>
-        <w:t xml:space="preserve">‎ToRevision‎</w:t>
-      </w:r>
-      <w:r>
-        <w:rPr>
-          <w:rFonts w:ascii="Arial" w:cs="Arial" w:eastAsia="Arial" w:hAnsi="Arial"/>
-          <w:b w:val="false"/>
-          <w:bCs w:val="false"/>
-          <w:sz w:val="21"/>
-          <w:szCs w:val="21"/>
-          <w:rtl/>
-        </w:rPr>
-        <w:t xml:space="preserve"> (NULL = الجاري), </w:t>
-      </w:r>
-      <w:r>
-        <w:rPr>
-          <w:rFonts w:ascii="Courier New" w:cs="Courier New" w:eastAsia="Courier New" w:hAnsi="Courier New"/>
-          <w:b w:val="false"/>
-          <w:bCs w:val="false"/>
-          <w:color w:val="1F2937"/>
-          <w:sz w:val="18"/>
-          <w:szCs w:val="18"/>
-          <w:shd w:fill="F1F3F5" w:color="auto" w:val="clear"/>
-          <w:rtl/>
-        </w:rPr>
-        <w:t xml:space="preserve">‎SupersedesId‎</w:t>
-      </w:r>
-      <w:r>
-        <w:rPr>
-          <w:rFonts w:ascii="Arial" w:cs="Arial" w:eastAsia="Arial" w:hAnsi="Arial"/>
-          <w:b w:val="false"/>
-          <w:bCs w:val="false"/>
-          <w:sz w:val="21"/>
-          <w:szCs w:val="21"/>
-          <w:rtl/>
-        </w:rPr>
-        <w:t xml:space="preserve">. التعديل </w:t>
-      </w:r>
-      <w:r>
-        <w:rPr>
-          <w:rFonts w:ascii="Arial" w:cs="Arial" w:eastAsia="Arial" w:hAnsi="Arial"/>
-          <w:b/>
-          <w:bCs/>
-          <w:sz w:val="21"/>
-          <w:szCs w:val="21"/>
-          <w:rtl/>
-        </w:rPr>
-        <w:t xml:space="preserve">يُنشئ صفًا جديدًا</w:t>
-      </w:r>
-      <w:r>
-        <w:rPr>
-          <w:rFonts w:ascii="Arial" w:cs="Arial" w:eastAsia="Arial" w:hAnsi="Arial"/>
-          <w:b w:val="false"/>
-          <w:bCs w:val="false"/>
-          <w:sz w:val="21"/>
-          <w:szCs w:val="21"/>
-          <w:rtl/>
-        </w:rPr>
-        <w:t xml:space="preserve"> ويغلق السابق. الفرادة تُصفّى على الجاري (</w:t>
-      </w:r>
-      <w:r>
-        <w:rPr>
-          <w:rFonts w:ascii="Courier New" w:cs="Courier New" w:eastAsia="Courier New" w:hAnsi="Courier New"/>
-          <w:b w:val="false"/>
-          <w:bCs w:val="false"/>
-          <w:color w:val="1F2937"/>
-          <w:sz w:val="18"/>
-          <w:szCs w:val="18"/>
-          <w:shd w:fill="F1F3F5" w:color="auto" w:val="clear"/>
-          <w:rtl/>
-        </w:rPr>
-        <w:t xml:space="preserve">‎WHERE ToRevision IS NULL‎</w:t>
-      </w:r>
-      <w:r>
-        <w:rPr>
-          <w:rFonts w:ascii="Arial" w:cs="Arial" w:eastAsia="Arial" w:hAnsi="Arial"/>
-          <w:b w:val="false"/>
-          <w:bCs w:val="false"/>
-          <w:sz w:val="21"/>
-          <w:szCs w:val="21"/>
-          <w:rtl/>
-        </w:rPr>
-        <w:t xml:space="preserve">). التسهيل يملك رأسًا واحدًا + </w:t>
-      </w:r>
-      <w:r>
-        <w:rPr>
-          <w:rFonts w:ascii="Courier New" w:cs="Courier New" w:eastAsia="Courier New" w:hAnsi="Courier New"/>
-          <w:b w:val="false"/>
-          <w:bCs w:val="false"/>
-          <w:color w:val="1F2937"/>
-          <w:sz w:val="18"/>
-          <w:szCs w:val="18"/>
-          <w:shd w:fill="F1F3F5" w:color="auto" w:val="clear"/>
-          <w:rtl/>
-        </w:rPr>
-        <w:t xml:space="preserve">‎fac.FacilityRevision‎</w:t>
-      </w:r>
-      <w:r>
-        <w:rPr>
-          <w:rFonts w:ascii="Arial" w:cs="Arial" w:eastAsia="Arial" w:hAnsi="Arial"/>
-          <w:b w:val="false"/>
-          <w:bCs w:val="false"/>
-          <w:sz w:val="21"/>
-          <w:szCs w:val="21"/>
-          <w:rtl/>
-        </w:rPr>
-        <w:t xml:space="preserve"> (مسودة/تقديم/رفض/اعتماد؛ مراجعة مفتوحة واحدة لكل تسهيل عبر فهرس فريد مصفّى).</w:t>
-      </w:r>
     </w:p>
     <w:p>
       <w:pPr>
@@ -12275,7 +12481,7 @@
           <w:szCs w:val="26"/>
           <w:rtl/>
         </w:rPr>
-        <w:t xml:space="preserve">5.2 ختم المصدر </w:t>
+        <w:t xml:space="preserve">5.1 الصفوف المراجَعة </w:t>
       </w:r>
       <w:r>
         <w:rPr>
@@ -12287,7 +12493,7 @@
           <w:szCs w:val="22"/>
           <w:rtl/>
         </w:rPr>
-        <w:t xml:space="preserve">‎src‎</w:t>
+        <w:t xml:space="preserve">‎rev‎</w:t>
       </w:r>
       <w:r>
         <w:rPr>
@@ -12299,9 +12505,212 @@
           <w:szCs w:val="26"/>
           <w:rtl/>
         </w:rPr>
+        <w:t xml:space="preserve"> (13 جدولًا)</w:t>
+      </w:r>
+      <w:bookmarkEnd w:id="14"/>
+    </w:p>
+    <w:p>
+      <w:pPr>
+        <w:bidi/>
+        <w:spacing w:after="110" w:before="0" w:line="312"/>
+      </w:pPr>
+      <w:r>
+        <w:rPr>
+          <w:rFonts w:ascii="Arial" w:cs="Arial" w:eastAsia="Arial" w:hAnsi="Arial"/>
+          <w:b w:val="false"/>
+          <w:bCs w:val="false"/>
+          <w:sz w:val="21"/>
+          <w:szCs w:val="21"/>
+          <w:rtl/>
+        </w:rPr>
+        <w:t xml:space="preserve">الأعمدة: </w:t>
+      </w:r>
+      <w:r>
+        <w:rPr>
+          <w:rFonts w:ascii="Courier New" w:cs="Courier New" w:eastAsia="Courier New" w:hAnsi="Courier New"/>
+          <w:b w:val="false"/>
+          <w:bCs w:val="false"/>
+          <w:color w:val="1F2937"/>
+          <w:sz w:val="18"/>
+          <w:szCs w:val="18"/>
+          <w:shd w:fill="F1F3F5" w:color="auto" w:val="clear"/>
+          <w:rtl/>
+        </w:rPr>
+        <w:t xml:space="preserve">‎FromRevision‎</w:t>
+      </w:r>
+      <w:r>
+        <w:rPr>
+          <w:rFonts w:ascii="Arial" w:cs="Arial" w:eastAsia="Arial" w:hAnsi="Arial"/>
+          <w:b w:val="false"/>
+          <w:bCs w:val="false"/>
+          <w:sz w:val="21"/>
+          <w:szCs w:val="21"/>
+          <w:rtl/>
+        </w:rPr>
+        <w:t xml:space="preserve">, </w:t>
+      </w:r>
+      <w:r>
+        <w:rPr>
+          <w:rFonts w:ascii="Courier New" w:cs="Courier New" w:eastAsia="Courier New" w:hAnsi="Courier New"/>
+          <w:b w:val="false"/>
+          <w:bCs w:val="false"/>
+          <w:color w:val="1F2937"/>
+          <w:sz w:val="18"/>
+          <w:szCs w:val="18"/>
+          <w:shd w:fill="F1F3F5" w:color="auto" w:val="clear"/>
+          <w:rtl/>
+        </w:rPr>
+        <w:t xml:space="preserve">‎ToRevision‎</w:t>
+      </w:r>
+      <w:r>
+        <w:rPr>
+          <w:rFonts w:ascii="Arial" w:cs="Arial" w:eastAsia="Arial" w:hAnsi="Arial"/>
+          <w:b w:val="false"/>
+          <w:bCs w:val="false"/>
+          <w:sz w:val="21"/>
+          <w:szCs w:val="21"/>
+          <w:rtl/>
+        </w:rPr>
+        <w:t xml:space="preserve"> (NULL = الجاري), </w:t>
+      </w:r>
+      <w:r>
+        <w:rPr>
+          <w:rFonts w:ascii="Courier New" w:cs="Courier New" w:eastAsia="Courier New" w:hAnsi="Courier New"/>
+          <w:b w:val="false"/>
+          <w:bCs w:val="false"/>
+          <w:color w:val="1F2937"/>
+          <w:sz w:val="18"/>
+          <w:szCs w:val="18"/>
+          <w:shd w:fill="F1F3F5" w:color="auto" w:val="clear"/>
+          <w:rtl/>
+        </w:rPr>
+        <w:t xml:space="preserve">‎SupersedesId‎</w:t>
+      </w:r>
+      <w:r>
+        <w:rPr>
+          <w:rFonts w:ascii="Arial" w:cs="Arial" w:eastAsia="Arial" w:hAnsi="Arial"/>
+          <w:b w:val="false"/>
+          <w:bCs w:val="false"/>
+          <w:sz w:val="21"/>
+          <w:szCs w:val="21"/>
+          <w:rtl/>
+        </w:rPr>
+        <w:t xml:space="preserve">. التعديل </w:t>
+      </w:r>
+      <w:r>
+        <w:rPr>
+          <w:rFonts w:ascii="Arial" w:cs="Arial" w:eastAsia="Arial" w:hAnsi="Arial"/>
+          <w:b/>
+          <w:bCs/>
+          <w:sz w:val="21"/>
+          <w:szCs w:val="21"/>
+          <w:rtl/>
+        </w:rPr>
+        <w:t xml:space="preserve">يُنشئ صفًا جديدًا</w:t>
+      </w:r>
+      <w:r>
+        <w:rPr>
+          <w:rFonts w:ascii="Arial" w:cs="Arial" w:eastAsia="Arial" w:hAnsi="Arial"/>
+          <w:b w:val="false"/>
+          <w:bCs w:val="false"/>
+          <w:sz w:val="21"/>
+          <w:szCs w:val="21"/>
+          <w:rtl/>
+        </w:rPr>
+        <w:t xml:space="preserve"> ويغلق السابق. الفرادة تُصفّى على الجاري (</w:t>
+      </w:r>
+      <w:r>
+        <w:rPr>
+          <w:rFonts w:ascii="Courier New" w:cs="Courier New" w:eastAsia="Courier New" w:hAnsi="Courier New"/>
+          <w:b w:val="false"/>
+          <w:bCs w:val="false"/>
+          <w:color w:val="1F2937"/>
+          <w:sz w:val="18"/>
+          <w:szCs w:val="18"/>
+          <w:shd w:fill="F1F3F5" w:color="auto" w:val="clear"/>
+          <w:rtl/>
+        </w:rPr>
+        <w:t xml:space="preserve">‎WHERE ToRevision IS NULL‎</w:t>
+      </w:r>
+      <w:r>
+        <w:rPr>
+          <w:rFonts w:ascii="Arial" w:cs="Arial" w:eastAsia="Arial" w:hAnsi="Arial"/>
+          <w:b w:val="false"/>
+          <w:bCs w:val="false"/>
+          <w:sz w:val="21"/>
+          <w:szCs w:val="21"/>
+          <w:rtl/>
+        </w:rPr>
+        <w:t xml:space="preserve">). التسهيل يملك رأسًا واحدًا + </w:t>
+      </w:r>
+      <w:r>
+        <w:rPr>
+          <w:rFonts w:ascii="Courier New" w:cs="Courier New" w:eastAsia="Courier New" w:hAnsi="Courier New"/>
+          <w:b w:val="false"/>
+          <w:bCs w:val="false"/>
+          <w:color w:val="1F2937"/>
+          <w:sz w:val="18"/>
+          <w:szCs w:val="18"/>
+          <w:shd w:fill="F1F3F5" w:color="auto" w:val="clear"/>
+          <w:rtl/>
+        </w:rPr>
+        <w:t xml:space="preserve">‎fac.FacilityRevision‎</w:t>
+      </w:r>
+      <w:r>
+        <w:rPr>
+          <w:rFonts w:ascii="Arial" w:cs="Arial" w:eastAsia="Arial" w:hAnsi="Arial"/>
+          <w:b w:val="false"/>
+          <w:bCs w:val="false"/>
+          <w:sz w:val="21"/>
+          <w:szCs w:val="21"/>
+          <w:rtl/>
+        </w:rPr>
+        <w:t xml:space="preserve"> (مسودة/تقديم/رفض/اعتماد؛ مراجعة مفتوحة واحدة لكل تسهيل عبر فهرس فريد مصفّى).</w:t>
+      </w:r>
+    </w:p>
+    <w:p>
+      <w:pPr>
+        <w:pStyle w:val="Heading2"/>
+        <w:bidi/>
+      </w:pPr>
+      <w:bookmarkStart w:name="_sec15" w:id="15"/>
+      <w:r>
+        <w:rPr>
+          <w:rFonts w:ascii="Arial" w:cs="Arial" w:eastAsia="Arial" w:hAnsi="Arial"/>
+          <w:b/>
+          <w:bCs/>
+          <w:color w:val="2B5C8A"/>
+          <w:sz w:val="26"/>
+          <w:szCs w:val="26"/>
+          <w:rtl/>
+        </w:rPr>
+        <w:t xml:space="preserve">5.2 ختم المصدر </w:t>
+      </w:r>
+      <w:r>
+        <w:rPr>
+          <w:rFonts w:ascii="Courier New" w:cs="Courier New" w:eastAsia="Courier New" w:hAnsi="Courier New"/>
+          <w:b/>
+          <w:bCs/>
+          <w:color w:val="1F2937"/>
+          <w:sz w:val="22"/>
+          <w:szCs w:val="22"/>
+          <w:rtl/>
+        </w:rPr>
+        <w:t xml:space="preserve">‎src‎</w:t>
+      </w:r>
+      <w:r>
+        <w:rPr>
+          <w:rFonts w:ascii="Arial" w:cs="Arial" w:eastAsia="Arial" w:hAnsi="Arial"/>
+          <w:b/>
+          <w:bCs/>
+          <w:color w:val="2B5C8A"/>
+          <w:sz w:val="26"/>
+          <w:szCs w:val="26"/>
+          <w:rtl/>
+        </w:rPr>
         <w:t xml:space="preserve"> (11 جدولًا)</w:t>
       </w:r>
-      <w:bookmarkEnd w:id="14"/>
+      <w:bookmarkEnd w:id="15"/>
     </w:p>
     <w:p>
       <w:pPr>
@@ -12709,7 +13118,7 @@
         <w:pStyle w:val="Heading2"/>
         <w:bidi/>
       </w:pPr>
-      <w:bookmarkStart w:name="_sec15" w:id="15"/>
+      <w:bookmarkStart w:name="_sec16" w:id="16"/>
       <w:r>
         <w:rPr>
           <w:rFonts w:ascii="Arial" w:cs="Arial" w:eastAsia="Arial" w:hAnsi="Arial"/>
@@ -12722,7 +13131,7 @@
         </w:rPr>
         <w:t xml:space="preserve">5.3 التدقيق وحدوده</w:t>
       </w:r>
-      <w:bookmarkEnd w:id="15"/>
+      <w:bookmarkEnd w:id="16"/>
     </w:p>
     <w:p>
       <w:pPr>
@@ -13212,7 +13621,7 @@
         <w:pStyle w:val="Heading1"/>
         <w:bidi/>
       </w:pPr>
-      <w:bookmarkStart w:name="_sec16" w:id="16"/>
+      <w:bookmarkStart w:name="_sec17" w:id="17"/>
       <w:r>
         <w:rPr>
           <w:rFonts w:ascii="Arial" w:cs="Arial" w:eastAsia="Arial" w:hAnsi="Arial"/>
@@ -13225,14 +13634,14 @@
         </w:rPr>
         <w:t xml:space="preserve">6. حماية البيانات الحساسة</w:t>
       </w:r>
-      <w:bookmarkEnd w:id="16"/>
+      <w:bookmarkEnd w:id="17"/>
     </w:p>
     <w:p>
       <w:pPr>
         <w:pStyle w:val="Heading2"/>
         <w:bidi/>
       </w:pPr>
-      <w:bookmarkStart w:name="_sec17" w:id="17"/>
+      <w:bookmarkStart w:name="_sec18" w:id="18"/>
       <w:r>
         <w:rPr>
           <w:rFonts w:ascii="Arial" w:cs="Arial" w:eastAsia="Arial" w:hAnsi="Arial"/>
@@ -13245,7 +13654,7 @@
         </w:rPr>
         <w:t xml:space="preserve">6.1 ما يُخزَّن</w:t>
       </w:r>
-      <w:bookmarkEnd w:id="17"/>
+      <w:bookmarkEnd w:id="18"/>
     </w:p>
     <w:tbl>
       <w:tblPr>
@@ -14790,7 +15199,7 @@
         <w:pStyle w:val="Heading2"/>
         <w:bidi/>
       </w:pPr>
-      <w:bookmarkStart w:name="_sec18" w:id="18"/>
+      <w:bookmarkStart w:name="_sec19" w:id="19"/>
       <w:r>
         <w:rPr>
           <w:rFonts w:ascii="Arial" w:cs="Arial" w:eastAsia="Arial" w:hAnsi="Arial"/>
@@ -14803,7 +15212,7 @@
         </w:rPr>
         <w:t xml:space="preserve">6.2 شكل الغلاف المشفّر (إلزامي لطبقة التطبيق)</w:t>
       </w:r>
-      <w:bookmarkEnd w:id="18"/>
+      <w:bookmarkEnd w:id="19"/>
     </w:p>
     <w:p>
       <w:pPr>
@@ -15830,7 +16239,7 @@
         <w:pStyle w:val="Heading2"/>
         <w:bidi/>
       </w:pPr>
-      <w:bookmarkStart w:name="_sec19" w:id="19"/>
+      <w:bookmarkStart w:name="_sec20" w:id="20"/>
       <w:r>
         <w:rPr>
           <w:rFonts w:ascii="Arial" w:cs="Arial" w:eastAsia="Arial" w:hAnsi="Arial"/>
@@ -15843,7 +16252,7 @@
         </w:rPr>
         <w:t xml:space="preserve">6.3 التدوير وإعادة التشفير</w:t>
       </w:r>
-      <w:bookmarkEnd w:id="19"/>
+      <w:bookmarkEnd w:id="20"/>
     </w:p>
     <w:p>
       <w:pPr>
@@ -16217,7 +16626,7 @@
         <w:pStyle w:val="Heading2"/>
         <w:bidi/>
       </w:pPr>
-      <w:bookmarkStart w:name="_sec20" w:id="20"/>
+      <w:bookmarkStart w:name="_sec21" w:id="21"/>
       <w:r>
         <w:rPr>
           <w:rFonts w:ascii="Arial" w:cs="Arial" w:eastAsia="Arial" w:hAnsi="Arial"/>
@@ -16230,7 +16639,7 @@
         </w:rPr>
         <w:t xml:space="preserve">6.4 مفاتيح وأغلفة أخرى</w:t>
       </w:r>
-      <w:bookmarkEnd w:id="20"/>
+      <w:bookmarkEnd w:id="21"/>
     </w:p>
     <w:tbl>
       <w:tblPr>
@@ -17391,7 +17800,7 @@
         <w:pStyle w:val="Heading1"/>
         <w:bidi/>
       </w:pPr>
-      <w:bookmarkStart w:name="_sec21" w:id="21"/>
+      <w:bookmarkStart w:name="_sec22" w:id="22"/>
       <w:r>
         <w:rPr>
           <w:rFonts w:ascii="Arial" w:cs="Arial" w:eastAsia="Arial" w:hAnsi="Arial"/>
@@ -17404,7 +17813,7 @@
         </w:rPr>
         <w:t xml:space="preserve">7. استراتيجية سلامة البيانات</w:t>
       </w:r>
-      <w:bookmarkEnd w:id="21"/>
+      <w:bookmarkEnd w:id="22"/>
     </w:p>
     <w:tbl>
       <w:tblPr>
@@ -18658,7 +19067,7 @@
         <w:pStyle w:val="Heading2"/>
         <w:bidi/>
       </w:pPr>
-      <w:bookmarkStart w:name="_sec22" w:id="22"/>
+      <w:bookmarkStart w:name="_sec23" w:id="23"/>
       <w:r>
         <w:rPr>
           <w:rFonts w:ascii="Arial" w:cs="Arial" w:eastAsia="Arial" w:hAnsi="Arial"/>
@@ -18671,7 +19080,7 @@
         </w:rPr>
         <w:t xml:space="preserve">7.1 الحجز الذري للحدود (شرط في طبقة التطبيق)</w:t>
       </w:r>
-      <w:bookmarkEnd w:id="22"/>
+      <w:bookmarkEnd w:id="23"/>
     </w:p>
     <w:p>
       <w:pPr>
@@ -19128,7 +19537,7 @@
         <w:pStyle w:val="Heading1"/>
         <w:bidi/>
       </w:pPr>
-      <w:bookmarkStart w:name="_sec23" w:id="23"/>
+      <w:bookmarkStart w:name="_sec24" w:id="24"/>
       <w:r>
         <w:rPr>
           <w:rFonts w:ascii="Arial" w:cs="Arial" w:eastAsia="Arial" w:hAnsi="Arial"/>
@@ -19141,7 +19550,7 @@
         </w:rPr>
         <w:t xml:space="preserve">8. الفهرسة</w:t>
       </w:r>
-      <w:bookmarkEnd w:id="23"/>
+      <w:bookmarkEnd w:id="24"/>
     </w:p>
     <w:tbl>
       <w:tblPr>
@@ -20104,7 +20513,7 @@
         <w:pStyle w:val="Heading1"/>
         <w:bidi/>
       </w:pPr>
-      <w:bookmarkStart w:name="_sec24" w:id="24"/>
+      <w:bookmarkStart w:name="_sec25" w:id="25"/>
       <w:r>
         <w:rPr>
           <w:rFonts w:ascii="Arial" w:cs="Arial" w:eastAsia="Arial" w:hAnsi="Arial"/>
@@ -20117,14 +20526,14 @@
         </w:rPr>
         <w:t xml:space="preserve">9. الأدوار والصلاحيات (على مستوى القاعدة)</w:t>
       </w:r>
-      <w:bookmarkEnd w:id="24"/>
+      <w:bookmarkEnd w:id="25"/>
     </w:p>
     <w:p>
       <w:pPr>
         <w:pStyle w:val="Heading2"/>
         <w:bidi/>
       </w:pPr>
-      <w:bookmarkStart w:name="_sec25" w:id="25"/>
+      <w:bookmarkStart w:name="_sec26" w:id="26"/>
       <w:r>
         <w:rPr>
           <w:rFonts w:ascii="Arial" w:cs="Arial" w:eastAsia="Arial" w:hAnsi="Arial"/>
@@ -20137,7 +20546,7 @@
         </w:rPr>
         <w:t xml:space="preserve">9.1 الأدوار</w:t>
       </w:r>
-      <w:bookmarkEnd w:id="25"/>
+      <w:bookmarkEnd w:id="26"/>
     </w:p>
     <w:tbl>
       <w:tblPr>
@@ -21505,10 +21914,79 @@
     </w:p>
     <w:p>
       <w:pPr>
+        <w:keepNext/>
+        <w:bidi/>
+        <w:spacing w:after="60" w:before="160"/>
+        <w:jc w:val="center"/>
+      </w:pPr>
+      <w:r>
+        <w:drawing>
+          <wp:inline distT="0" distB="0" distL="0" distR="0">
+            <wp:extent cx="6096000" cy="5124450"/>
+            <wp:effectExtent t="0" r="0" b="0" l="0"/>
+            <wp:docPr id="1" name="diagrams/erd_02_access_roles.png" descr="صلاحيات الأدوار: ما يصل إليه كل دور من كل نوع جداول" title="صلاحيات الأدوار: ما يصل إليه كل دور من كل نوع جداول"/>
+            <wp:cNvGraphicFramePr>
+              <a:graphicFrameLocks xmlns:a="http://schemas.openxmlformats.org/drawingml/2006/main" noChangeAspect="1"/>
+            </wp:cNvGraphicFramePr>
+            <a:graphic xmlns:a="http://schemas.openxmlformats.org/drawingml/2006/main">
+              <a:graphicData uri="http://schemas.openxmlformats.org/drawingml/2006/picture">
+                <pic:pic xmlns:pic="http://schemas.openxmlformats.org/drawingml/2006/picture">
+                  <pic:nvPicPr>
+                    <pic:cNvPr id="0" name="" descr=""/>
+                    <pic:cNvPicPr>
+                      <a:picLocks noChangeAspect="1" noChangeArrowheads="1"/>
+                    </pic:cNvPicPr>
+                  </pic:nvPicPr>
+                  <pic:blipFill>
+                    <a:blip r:embed="rId11" cstate="none"/>
+                    <a:srcRect/>
+                    <a:stretch>
+                      <a:fillRect/>
+                    </a:stretch>
+                  </pic:blipFill>
+                  <pic:spPr bwMode="auto">
+                    <a:xfrm>
+                      <a:off x="0" y="0"/>
+                      <a:ext cx="6096000" cy="5124450"/>
+                    </a:xfrm>
+                    <a:prstGeom prst="rect">
+                      <a:avLst/>
+                    </a:prstGeom>
+                  </pic:spPr>
+                </pic:pic>
+              </a:graphicData>
+            </a:graphic>
+          </wp:inline>
+        </w:drawing>
+      </w:r>
+    </w:p>
+    <w:p>
+      <w:pPr>
+        <w:bidi/>
+        <w:spacing w:after="220" w:before="0"/>
+        <w:jc w:val="center"/>
+      </w:pPr>
+      <w:r>
+        <w:rPr>
+          <w:rFonts w:ascii="Arial" w:cs="Arial" w:eastAsia="Arial" w:hAnsi="Arial"/>
+          <w:b w:val="false"/>
+          <w:bCs w:val="false"/>
+          <w:i/>
+          <w:iCs/>
+          <w:color w:val="5B6670"/>
+          <w:sz w:val="17"/>
+          <w:szCs w:val="17"/>
+          <w:rtl/>
+        </w:rPr>
+        <w:t xml:space="preserve">صلاحيات الأدوار: ما يصل إليه كل دور من كل نوع جداول</w:t>
+      </w:r>
+    </w:p>
+    <w:p>
+      <w:pPr>
         <w:pStyle w:val="Heading2"/>
         <w:bidi/>
       </w:pPr>
-      <w:bookmarkStart w:name="_sec26" w:id="26"/>
+      <w:bookmarkStart w:name="_sec27" w:id="27"/>
       <w:r>
         <w:rPr>
           <w:rFonts w:ascii="Arial" w:cs="Arial" w:eastAsia="Arial" w:hAnsi="Arial"/>
@@ -21521,7 +21999,7 @@
         </w:rPr>
         <w:t xml:space="preserve">9.2 من أين تأتي المنح</w:t>
       </w:r>
-      <w:bookmarkEnd w:id="26"/>
+      <w:bookmarkEnd w:id="27"/>
     </w:p>
     <w:tbl>
       <w:tblPr>
@@ -22395,7 +22873,7 @@
         <w:pStyle w:val="Heading2"/>
         <w:bidi/>
       </w:pPr>
-      <w:bookmarkStart w:name="_sec27" w:id="27"/>
+      <w:bookmarkStart w:name="_sec28" w:id="28"/>
       <w:r>
         <w:rPr>
           <w:rFonts w:ascii="Arial" w:cs="Arial" w:eastAsia="Arial" w:hAnsi="Arial"/>
@@ -22408,7 +22886,7 @@
         </w:rPr>
         <w:t xml:space="preserve">9.3 التحقق الثابت من الصلاحيات</w:t>
       </w:r>
-      <w:bookmarkEnd w:id="27"/>
+      <w:bookmarkEnd w:id="28"/>
     </w:p>
     <w:p>
       <w:pPr>
@@ -23315,7 +23793,7 @@
         <w:pStyle w:val="Heading2"/>
         <w:bidi/>
       </w:pPr>
-      <w:bookmarkStart w:name="_sec28" w:id="28"/>
+      <w:bookmarkStart w:name="_sec29" w:id="29"/>
       <w:r>
         <w:rPr>
           <w:rFonts w:ascii="Arial" w:cs="Arial" w:eastAsia="Arial" w:hAnsi="Arial"/>
@@ -23328,7 +23806,7 @@
         </w:rPr>
         <w:t xml:space="preserve">9.4 قواعد عامة</w:t>
       </w:r>
-      <w:bookmarkEnd w:id="28"/>
+      <w:bookmarkEnd w:id="29"/>
     </w:p>
     <w:p>
       <w:pPr>
@@ -23597,7 +24075,7 @@
         <w:pStyle w:val="Heading1"/>
         <w:bidi/>
       </w:pPr>
-      <w:bookmarkStart w:name="_sec29" w:id="29"/>
+      <w:bookmarkStart w:name="_sec30" w:id="30"/>
       <w:r>
         <w:rPr>
           <w:rFonts w:ascii="Arial" w:cs="Arial" w:eastAsia="Arial" w:hAnsi="Arial"/>
@@ -23610,7 +24088,7 @@
         </w:rPr>
         <w:t xml:space="preserve">10. خريطة المخططات والجداول</w:t>
       </w:r>
-      <w:bookmarkEnd w:id="29"/>
+      <w:bookmarkEnd w:id="30"/>
     </w:p>
     <w:tbl>
       <w:tblPr>
@@ -26157,7 +26635,7 @@
         <w:pStyle w:val="Heading2"/>
         <w:bidi/>
       </w:pPr>
-      <w:bookmarkStart w:name="_sec30" w:id="30"/>
+      <w:bookmarkStart w:name="_sec31" w:id="31"/>
       <w:r>
         <w:rPr>
           <w:rFonts w:ascii="Arial" w:cs="Arial" w:eastAsia="Arial" w:hAnsi="Arial"/>
@@ -26170,7 +26648,7 @@
         </w:rPr>
         <w:t xml:space="preserve">10.1 تغطية المتطلبات</w:t>
       </w:r>
-      <w:bookmarkEnd w:id="30"/>
+      <w:bookmarkEnd w:id="31"/>
     </w:p>
     <w:p>
       <w:pPr>
@@ -26287,10 +26765,1211 @@
     </w:p>
     <w:p>
       <w:pPr>
+        <w:pStyle w:val="Heading2"/>
+        <w:bidi/>
+      </w:pPr>
+      <w:bookmarkStart w:name="_sec32" w:id="32"/>
+      <w:r>
+        <w:rPr>
+          <w:rFonts w:ascii="Arial" w:cs="Arial" w:eastAsia="Arial" w:hAnsi="Arial"/>
+          <w:b/>
+          <w:bCs/>
+          <w:color w:val="2B5C8A"/>
+          <w:sz w:val="26"/>
+          <w:szCs w:val="26"/>
+          <w:rtl/>
+        </w:rPr>
+        <w:t xml:space="preserve">10.2 مخططات العلاقات حسب الوحدة</w:t>
+      </w:r>
+      <w:bookmarkEnd w:id="32"/>
+    </w:p>
+    <w:p>
+      <w:pPr>
+        <w:bidi/>
+        <w:spacing w:after="110" w:before="0" w:line="312"/>
+      </w:pPr>
+      <w:r>
+        <w:rPr>
+          <w:rFonts w:ascii="Arial" w:cs="Arial" w:eastAsia="Arial" w:hAnsi="Arial"/>
+          <w:b w:val="false"/>
+          <w:bCs w:val="false"/>
+          <w:sz w:val="21"/>
+          <w:szCs w:val="21"/>
+          <w:rtl/>
+        </w:rPr>
+        <w:t xml:space="preserve">تُقرأ الصور كما يلي: كل صندوق جدول، وتحته مفتاحه (</w:t>
+      </w:r>
+      <w:r>
+        <w:rPr>
+          <w:rFonts w:ascii="Courier New" w:cs="Courier New" w:eastAsia="Courier New" w:hAnsi="Courier New"/>
+          <w:b w:val="false"/>
+          <w:bCs w:val="false"/>
+          <w:color w:val="1F2937"/>
+          <w:sz w:val="18"/>
+          <w:szCs w:val="18"/>
+          <w:shd w:fill="F1F3F5" w:color="auto" w:val="clear"/>
+          <w:rtl/>
+        </w:rPr>
+        <w:t xml:space="preserve">‎PK‎</w:t>
+      </w:r>
+      <w:r>
+        <w:rPr>
+          <w:rFonts w:ascii="Arial" w:cs="Arial" w:eastAsia="Arial" w:hAnsi="Arial"/>
+          <w:b w:val="false"/>
+          <w:bCs w:val="false"/>
+          <w:sz w:val="21"/>
+          <w:szCs w:val="21"/>
+          <w:rtl/>
+        </w:rPr>
+        <w:t xml:space="preserve">) ومفاتيحه الأجنبية (</w:t>
+      </w:r>
+      <w:r>
+        <w:rPr>
+          <w:rFonts w:ascii="Courier New" w:cs="Courier New" w:eastAsia="Courier New" w:hAnsi="Courier New"/>
+          <w:b w:val="false"/>
+          <w:bCs w:val="false"/>
+          <w:color w:val="1F2937"/>
+          <w:sz w:val="18"/>
+          <w:szCs w:val="18"/>
+          <w:shd w:fill="F1F3F5" w:color="auto" w:val="clear"/>
+          <w:rtl/>
+        </w:rPr>
+        <w:t xml:space="preserve">‎FK‎</w:t>
+      </w:r>
+      <w:r>
+        <w:rPr>
+          <w:rFonts w:ascii="Arial" w:cs="Arial" w:eastAsia="Arial" w:hAnsi="Arial"/>
+          <w:b w:val="false"/>
+          <w:bCs w:val="false"/>
+          <w:sz w:val="21"/>
+          <w:szCs w:val="21"/>
+          <w:rtl/>
+        </w:rPr>
+        <w:t xml:space="preserve">) مع الجدول الذي يشير إليه، والأسهم هي المفاتيح الأجنبية الفعلية ويُكتب اسم العمود على السهم. الصناديق الرمادية جداول تقع خارج الصورة، ومنها تُستدل العلاقة الكاملة. كل جدول مملوك للمشترك يحمل </w:t>
+      </w:r>
+      <w:r>
+        <w:rPr>
+          <w:rFonts w:ascii="Courier New" w:cs="Courier New" w:eastAsia="Courier New" w:hAnsi="Courier New"/>
+          <w:b w:val="false"/>
+          <w:bCs w:val="false"/>
+          <w:color w:val="1F2937"/>
+          <w:sz w:val="18"/>
+          <w:szCs w:val="18"/>
+          <w:shd w:fill="F1F3F5" w:color="auto" w:val="clear"/>
+          <w:rtl/>
+        </w:rPr>
+        <w:t xml:space="preserve">‎TenantId‎</w:t>
+      </w:r>
+      <w:r>
+        <w:rPr>
+          <w:rFonts w:ascii="Arial" w:cs="Arial" w:eastAsia="Arial" w:hAnsi="Arial"/>
+          <w:b w:val="false"/>
+          <w:bCs w:val="false"/>
+          <w:sz w:val="21"/>
+          <w:szCs w:val="21"/>
+          <w:rtl/>
+        </w:rPr>
+        <w:t xml:space="preserve"> ويشير إلى </w:t>
+      </w:r>
+      <w:r>
+        <w:rPr>
+          <w:rFonts w:ascii="Courier New" w:cs="Courier New" w:eastAsia="Courier New" w:hAnsi="Courier New"/>
+          <w:b w:val="false"/>
+          <w:bCs w:val="false"/>
+          <w:color w:val="1F2937"/>
+          <w:sz w:val="18"/>
+          <w:szCs w:val="18"/>
+          <w:shd w:fill="F1F3F5" w:color="auto" w:val="clear"/>
+          <w:rtl/>
+        </w:rPr>
+        <w:t xml:space="preserve">‎plat.Tenant‎</w:t>
+      </w:r>
+      <w:r>
+        <w:rPr>
+          <w:rFonts w:ascii="Arial" w:cs="Arial" w:eastAsia="Arial" w:hAnsi="Arial"/>
+          <w:b w:val="false"/>
+          <w:bCs w:val="false"/>
+          <w:sz w:val="21"/>
+          <w:szCs w:val="21"/>
+          <w:rtl/>
+        </w:rPr>
+        <w:t xml:space="preserve"> (انظر §3.7)، ولم يُرسم ذلك في كل صورة.</w:t>
+      </w:r>
+    </w:p>
+    <w:p>
+      <w:pPr>
+        <w:pStyle w:val="Heading3"/>
+        <w:bidi/>
+      </w:pPr>
+      <w:bookmarkStart w:name="_sec33" w:id="33"/>
+      <w:r>
+        <w:rPr>
+          <w:rFonts w:ascii="Arial" w:cs="Arial" w:eastAsia="Arial" w:hAnsi="Arial"/>
+          <w:b/>
+          <w:bCs/>
+          <w:color w:val="2B5C8A"/>
+          <w:sz w:val="23"/>
+          <w:szCs w:val="23"/>
+          <w:rtl/>
+        </w:rPr>
+        <w:t xml:space="preserve">الهوية والمشترك والصلاحيات (م0)</w:t>
+      </w:r>
+      <w:bookmarkEnd w:id="33"/>
+    </w:p>
+    <w:p>
+      <w:pPr>
+        <w:keepNext/>
+        <w:bidi/>
+        <w:spacing w:after="60" w:before="160"/>
+        <w:jc w:val="center"/>
+      </w:pPr>
+      <w:r>
+        <w:drawing>
+          <wp:inline distT="0" distB="0" distL="0" distR="0">
+            <wp:extent cx="4467225" cy="8191500"/>
+            <wp:effectExtent t="0" r="0" b="0" l="0"/>
+            <wp:docPr id="1" name="diagrams/erd_m0_identity.png" descr="م0: الهوية والمشترك والصلاحيات" title="م0: الهوية والمشترك والصلاحيات"/>
+            <wp:cNvGraphicFramePr>
+              <a:graphicFrameLocks xmlns:a="http://schemas.openxmlformats.org/drawingml/2006/main" noChangeAspect="1"/>
+            </wp:cNvGraphicFramePr>
+            <a:graphic xmlns:a="http://schemas.openxmlformats.org/drawingml/2006/main">
+              <a:graphicData uri="http://schemas.openxmlformats.org/drawingml/2006/picture">
+                <pic:pic xmlns:pic="http://schemas.openxmlformats.org/drawingml/2006/picture">
+                  <pic:nvPicPr>
+                    <pic:cNvPr id="0" name="" descr=""/>
+                    <pic:cNvPicPr>
+                      <a:picLocks noChangeAspect="1" noChangeArrowheads="1"/>
+                    </pic:cNvPicPr>
+                  </pic:nvPicPr>
+                  <pic:blipFill>
+                    <a:blip r:embed="rId12" cstate="none"/>
+                    <a:srcRect/>
+                    <a:stretch>
+                      <a:fillRect/>
+                    </a:stretch>
+                  </pic:blipFill>
+                  <pic:spPr bwMode="auto">
+                    <a:xfrm>
+                      <a:off x="0" y="0"/>
+                      <a:ext cx="4467225" cy="8191500"/>
+                    </a:xfrm>
+                    <a:prstGeom prst="rect">
+                      <a:avLst/>
+                    </a:prstGeom>
+                  </pic:spPr>
+                </pic:pic>
+              </a:graphicData>
+            </a:graphic>
+          </wp:inline>
+        </w:drawing>
+      </w:r>
+    </w:p>
+    <w:p>
+      <w:pPr>
+        <w:bidi/>
+        <w:spacing w:after="220" w:before="0"/>
+        <w:jc w:val="center"/>
+      </w:pPr>
+      <w:r>
+        <w:rPr>
+          <w:rFonts w:ascii="Arial" w:cs="Arial" w:eastAsia="Arial" w:hAnsi="Arial"/>
+          <w:b w:val="false"/>
+          <w:bCs w:val="false"/>
+          <w:i/>
+          <w:iCs/>
+          <w:color w:val="5B6670"/>
+          <w:sz w:val="17"/>
+          <w:szCs w:val="17"/>
+          <w:rtl/>
+        </w:rPr>
+        <w:t xml:space="preserve">م0: الهوية والمشترك والصلاحيات</w:t>
+      </w:r>
+    </w:p>
+    <w:p>
+      <w:pPr>
+        <w:pStyle w:val="Heading3"/>
+        <w:bidi/>
+      </w:pPr>
+      <w:bookmarkStart w:name="_sec34" w:id="34"/>
+      <w:r>
+        <w:rPr>
+          <w:rFonts w:ascii="Arial" w:cs="Arial" w:eastAsia="Arial" w:hAnsi="Arial"/>
+          <w:b/>
+          <w:bCs/>
+          <w:color w:val="2B5C8A"/>
+          <w:sz w:val="23"/>
+          <w:szCs w:val="23"/>
+          <w:rtl/>
+        </w:rPr>
+        <w:t xml:space="preserve">التدقيق والمستندات والإعدادات (م0)</w:t>
+      </w:r>
+      <w:bookmarkEnd w:id="34"/>
+    </w:p>
+    <w:p>
+      <w:pPr>
+        <w:keepNext/>
+        <w:bidi/>
+        <w:spacing w:after="60" w:before="160"/>
+        <w:jc w:val="center"/>
+      </w:pPr>
+      <w:r>
+        <w:drawing>
+          <wp:inline distT="0" distB="0" distL="0" distR="0">
+            <wp:extent cx="6096000" cy="6724650"/>
+            <wp:effectExtent t="0" r="0" b="0" l="0"/>
+            <wp:docPr id="1" name="diagrams/erd_m0_platform.png" descr="م0: التدقيق والمستندات والإعدادات" title="م0: التدقيق والمستندات والإعدادات"/>
+            <wp:cNvGraphicFramePr>
+              <a:graphicFrameLocks xmlns:a="http://schemas.openxmlformats.org/drawingml/2006/main" noChangeAspect="1"/>
+            </wp:cNvGraphicFramePr>
+            <a:graphic xmlns:a="http://schemas.openxmlformats.org/drawingml/2006/main">
+              <a:graphicData uri="http://schemas.openxmlformats.org/drawingml/2006/picture">
+                <pic:pic xmlns:pic="http://schemas.openxmlformats.org/drawingml/2006/picture">
+                  <pic:nvPicPr>
+                    <pic:cNvPr id="0" name="" descr=""/>
+                    <pic:cNvPicPr>
+                      <a:picLocks noChangeAspect="1" noChangeArrowheads="1"/>
+                    </pic:cNvPicPr>
+                  </pic:nvPicPr>
+                  <pic:blipFill>
+                    <a:blip r:embed="rId13" cstate="none"/>
+                    <a:srcRect/>
+                    <a:stretch>
+                      <a:fillRect/>
+                    </a:stretch>
+                  </pic:blipFill>
+                  <pic:spPr bwMode="auto">
+                    <a:xfrm>
+                      <a:off x="0" y="0"/>
+                      <a:ext cx="6096000" cy="6724650"/>
+                    </a:xfrm>
+                    <a:prstGeom prst="rect">
+                      <a:avLst/>
+                    </a:prstGeom>
+                  </pic:spPr>
+                </pic:pic>
+              </a:graphicData>
+            </a:graphic>
+          </wp:inline>
+        </w:drawing>
+      </w:r>
+    </w:p>
+    <w:p>
+      <w:pPr>
+        <w:bidi/>
+        <w:spacing w:after="220" w:before="0"/>
+        <w:jc w:val="center"/>
+      </w:pPr>
+      <w:r>
+        <w:rPr>
+          <w:rFonts w:ascii="Arial" w:cs="Arial" w:eastAsia="Arial" w:hAnsi="Arial"/>
+          <w:b w:val="false"/>
+          <w:bCs w:val="false"/>
+          <w:i/>
+          <w:iCs/>
+          <w:color w:val="5B6670"/>
+          <w:sz w:val="17"/>
+          <w:szCs w:val="17"/>
+          <w:rtl/>
+        </w:rPr>
+        <w:t xml:space="preserve">م0: التدقيق والمستندات والإعدادات</w:t>
+      </w:r>
+    </w:p>
+    <w:p>
+      <w:pPr>
+        <w:pStyle w:val="Heading3"/>
+        <w:bidi/>
+      </w:pPr>
+      <w:bookmarkStart w:name="_sec35" w:id="35"/>
+      <w:r>
+        <w:rPr>
+          <w:rFonts w:ascii="Arial" w:cs="Arial" w:eastAsia="Arial" w:hAnsi="Arial"/>
+          <w:b/>
+          <w:bCs/>
+          <w:color w:val="2B5C8A"/>
+          <w:sz w:val="23"/>
+          <w:szCs w:val="23"/>
+          <w:rtl/>
+        </w:rPr>
+        <w:t xml:space="preserve">الهيكل المؤسسي والأشخاص (م1)</w:t>
+      </w:r>
+      <w:bookmarkEnd w:id="35"/>
+    </w:p>
+    <w:p>
+      <w:pPr>
+        <w:keepNext/>
+        <w:bidi/>
+        <w:spacing w:after="60" w:before="160"/>
+        <w:jc w:val="center"/>
+      </w:pPr>
+      <w:r>
+        <w:drawing>
+          <wp:inline distT="0" distB="0" distL="0" distR="0">
+            <wp:extent cx="6096000" cy="8086725"/>
+            <wp:effectExtent t="0" r="0" b="0" l="0"/>
+            <wp:docPr id="1" name="diagrams/erd_m1_org.png" descr="م1: الهيكل المؤسسي والأشخاص" title="م1: الهيكل المؤسسي والأشخاص"/>
+            <wp:cNvGraphicFramePr>
+              <a:graphicFrameLocks xmlns:a="http://schemas.openxmlformats.org/drawingml/2006/main" noChangeAspect="1"/>
+            </wp:cNvGraphicFramePr>
+            <a:graphic xmlns:a="http://schemas.openxmlformats.org/drawingml/2006/main">
+              <a:graphicData uri="http://schemas.openxmlformats.org/drawingml/2006/picture">
+                <pic:pic xmlns:pic="http://schemas.openxmlformats.org/drawingml/2006/picture">
+                  <pic:nvPicPr>
+                    <pic:cNvPr id="0" name="" descr=""/>
+                    <pic:cNvPicPr>
+                      <a:picLocks noChangeAspect="1" noChangeArrowheads="1"/>
+                    </pic:cNvPicPr>
+                  </pic:nvPicPr>
+                  <pic:blipFill>
+                    <a:blip r:embed="rId14" cstate="none"/>
+                    <a:srcRect/>
+                    <a:stretch>
+                      <a:fillRect/>
+                    </a:stretch>
+                  </pic:blipFill>
+                  <pic:spPr bwMode="auto">
+                    <a:xfrm>
+                      <a:off x="0" y="0"/>
+                      <a:ext cx="6096000" cy="8086725"/>
+                    </a:xfrm>
+                    <a:prstGeom prst="rect">
+                      <a:avLst/>
+                    </a:prstGeom>
+                  </pic:spPr>
+                </pic:pic>
+              </a:graphicData>
+            </a:graphic>
+          </wp:inline>
+        </w:drawing>
+      </w:r>
+    </w:p>
+    <w:p>
+      <w:pPr>
+        <w:bidi/>
+        <w:spacing w:after="220" w:before="0"/>
+        <w:jc w:val="center"/>
+      </w:pPr>
+      <w:r>
+        <w:rPr>
+          <w:rFonts w:ascii="Arial" w:cs="Arial" w:eastAsia="Arial" w:hAnsi="Arial"/>
+          <w:b w:val="false"/>
+          <w:bCs w:val="false"/>
+          <w:i/>
+          <w:iCs/>
+          <w:color w:val="5B6670"/>
+          <w:sz w:val="17"/>
+          <w:szCs w:val="17"/>
+          <w:rtl/>
+        </w:rPr>
+        <w:t xml:space="preserve">م1: الهيكل المؤسسي والأشخاص</w:t>
+      </w:r>
+    </w:p>
+    <w:p>
+      <w:pPr>
+        <w:pStyle w:val="Heading3"/>
+        <w:bidi/>
+      </w:pPr>
+      <w:bookmarkStart w:name="_sec36" w:id="36"/>
+      <w:r>
+        <w:rPr>
+          <w:rFonts w:ascii="Arial" w:cs="Arial" w:eastAsia="Arial" w:hAnsi="Arial"/>
+          <w:b/>
+          <w:bCs/>
+          <w:color w:val="2B5C8A"/>
+          <w:sz w:val="23"/>
+          <w:szCs w:val="23"/>
+          <w:rtl/>
+        </w:rPr>
+        <w:t xml:space="preserve">المنشآت والحسابات والمفوّضون (م2–م3)</w:t>
+      </w:r>
+      <w:bookmarkEnd w:id="36"/>
+    </w:p>
+    <w:p>
+      <w:pPr>
+        <w:keepNext/>
+        <w:bidi/>
+        <w:spacing w:after="60" w:before="160"/>
+        <w:jc w:val="center"/>
+      </w:pPr>
+      <w:r>
+        <w:drawing>
+          <wp:inline distT="0" distB="0" distL="0" distR="0">
+            <wp:extent cx="6096000" cy="4638675"/>
+            <wp:effectExtent t="0" r="0" b="0" l="0"/>
+            <wp:docPr id="1" name="diagrams/erd_m2_3_accounts.png" descr="م2–م3: المنشآت والحسابات والمفوّضون" title="م2–م3: المنشآت والحسابات والمفوّضون"/>
+            <wp:cNvGraphicFramePr>
+              <a:graphicFrameLocks xmlns:a="http://schemas.openxmlformats.org/drawingml/2006/main" noChangeAspect="1"/>
+            </wp:cNvGraphicFramePr>
+            <a:graphic xmlns:a="http://schemas.openxmlformats.org/drawingml/2006/main">
+              <a:graphicData uri="http://schemas.openxmlformats.org/drawingml/2006/picture">
+                <pic:pic xmlns:pic="http://schemas.openxmlformats.org/drawingml/2006/picture">
+                  <pic:nvPicPr>
+                    <pic:cNvPr id="0" name="" descr=""/>
+                    <pic:cNvPicPr>
+                      <a:picLocks noChangeAspect="1" noChangeArrowheads="1"/>
+                    </pic:cNvPicPr>
+                  </pic:nvPicPr>
+                  <pic:blipFill>
+                    <a:blip r:embed="rId15" cstate="none"/>
+                    <a:srcRect/>
+                    <a:stretch>
+                      <a:fillRect/>
+                    </a:stretch>
+                  </pic:blipFill>
+                  <pic:spPr bwMode="auto">
+                    <a:xfrm>
+                      <a:off x="0" y="0"/>
+                      <a:ext cx="6096000" cy="4638675"/>
+                    </a:xfrm>
+                    <a:prstGeom prst="rect">
+                      <a:avLst/>
+                    </a:prstGeom>
+                  </pic:spPr>
+                </pic:pic>
+              </a:graphicData>
+            </a:graphic>
+          </wp:inline>
+        </w:drawing>
+      </w:r>
+    </w:p>
+    <w:p>
+      <w:pPr>
+        <w:bidi/>
+        <w:spacing w:after="220" w:before="0"/>
+        <w:jc w:val="center"/>
+      </w:pPr>
+      <w:r>
+        <w:rPr>
+          <w:rFonts w:ascii="Arial" w:cs="Arial" w:eastAsia="Arial" w:hAnsi="Arial"/>
+          <w:b w:val="false"/>
+          <w:bCs w:val="false"/>
+          <w:i/>
+          <w:iCs/>
+          <w:color w:val="5B6670"/>
+          <w:sz w:val="17"/>
+          <w:szCs w:val="17"/>
+          <w:rtl/>
+        </w:rPr>
+        <w:t xml:space="preserve">م2–م3: المنشآت والحسابات والمفوّضون</w:t>
+      </w:r>
+    </w:p>
+    <w:p>
+      <w:pPr>
+        <w:pStyle w:val="Heading3"/>
+        <w:bidi/>
+      </w:pPr>
+      <w:bookmarkStart w:name="_sec37" w:id="37"/>
+      <w:r>
+        <w:rPr>
+          <w:rFonts w:ascii="Arial" w:cs="Arial" w:eastAsia="Arial" w:hAnsi="Arial"/>
+          <w:b/>
+          <w:bCs/>
+          <w:color w:val="2B5C8A"/>
+          <w:sz w:val="23"/>
+          <w:szCs w:val="23"/>
+          <w:rtl/>
+        </w:rPr>
+        <w:t xml:space="preserve">الكتالوجات (م4)</w:t>
+      </w:r>
+      <w:bookmarkEnd w:id="37"/>
+    </w:p>
+    <w:p>
+      <w:pPr>
+        <w:keepNext/>
+        <w:bidi/>
+        <w:spacing w:after="60" w:before="160"/>
+        <w:jc w:val="center"/>
+      </w:pPr>
+      <w:r>
+        <w:drawing>
+          <wp:inline distT="0" distB="0" distL="0" distR="0">
+            <wp:extent cx="4581525" cy="8191500"/>
+            <wp:effectExtent t="0" r="0" b="0" l="0"/>
+            <wp:docPr id="1" name="diagrams/erd_m4_catalogs.png" descr="م4: الكتالوجات" title="م4: الكتالوجات"/>
+            <wp:cNvGraphicFramePr>
+              <a:graphicFrameLocks xmlns:a="http://schemas.openxmlformats.org/drawingml/2006/main" noChangeAspect="1"/>
+            </wp:cNvGraphicFramePr>
+            <a:graphic xmlns:a="http://schemas.openxmlformats.org/drawingml/2006/main">
+              <a:graphicData uri="http://schemas.openxmlformats.org/drawingml/2006/picture">
+                <pic:pic xmlns:pic="http://schemas.openxmlformats.org/drawingml/2006/picture">
+                  <pic:nvPicPr>
+                    <pic:cNvPr id="0" name="" descr=""/>
+                    <pic:cNvPicPr>
+                      <a:picLocks noChangeAspect="1" noChangeArrowheads="1"/>
+                    </pic:cNvPicPr>
+                  </pic:nvPicPr>
+                  <pic:blipFill>
+                    <a:blip r:embed="rId16" cstate="none"/>
+                    <a:srcRect/>
+                    <a:stretch>
+                      <a:fillRect/>
+                    </a:stretch>
+                  </pic:blipFill>
+                  <pic:spPr bwMode="auto">
+                    <a:xfrm>
+                      <a:off x="0" y="0"/>
+                      <a:ext cx="4581525" cy="8191500"/>
+                    </a:xfrm>
+                    <a:prstGeom prst="rect">
+                      <a:avLst/>
+                    </a:prstGeom>
+                  </pic:spPr>
+                </pic:pic>
+              </a:graphicData>
+            </a:graphic>
+          </wp:inline>
+        </w:drawing>
+      </w:r>
+    </w:p>
+    <w:p>
+      <w:pPr>
+        <w:bidi/>
+        <w:spacing w:after="220" w:before="0"/>
+        <w:jc w:val="center"/>
+      </w:pPr>
+      <w:r>
+        <w:rPr>
+          <w:rFonts w:ascii="Arial" w:cs="Arial" w:eastAsia="Arial" w:hAnsi="Arial"/>
+          <w:b w:val="false"/>
+          <w:bCs w:val="false"/>
+          <w:i/>
+          <w:iCs/>
+          <w:color w:val="5B6670"/>
+          <w:sz w:val="17"/>
+          <w:szCs w:val="17"/>
+          <w:rtl/>
+        </w:rPr>
+        <w:t xml:space="preserve">م4: الكتالوجات</w:t>
+      </w:r>
+    </w:p>
+    <w:p>
+      <w:pPr>
+        <w:pStyle w:val="Heading3"/>
+        <w:bidi/>
+      </w:pPr>
+      <w:bookmarkStart w:name="_sec38" w:id="38"/>
+      <w:r>
+        <w:rPr>
+          <w:rFonts w:ascii="Arial" w:cs="Arial" w:eastAsia="Arial" w:hAnsi="Arial"/>
+          <w:b/>
+          <w:bCs/>
+          <w:color w:val="2B5C8A"/>
+          <w:sz w:val="23"/>
+          <w:szCs w:val="23"/>
+          <w:rtl/>
+        </w:rPr>
+        <w:t xml:space="preserve">التسهيلات والحدود (م5)</w:t>
+      </w:r>
+      <w:bookmarkEnd w:id="38"/>
+    </w:p>
+    <w:p>
+      <w:pPr>
+        <w:keepNext/>
+        <w:bidi/>
+        <w:spacing w:after="60" w:before="160"/>
+        <w:jc w:val="center"/>
+      </w:pPr>
+      <w:r>
+        <w:drawing>
+          <wp:inline distT="0" distB="0" distL="0" distR="0">
+            <wp:extent cx="6096000" cy="4791075"/>
+            <wp:effectExtent t="0" r="0" b="0" l="0"/>
+            <wp:docPr id="1" name="diagrams/erd_m5_facilities.png" descr="م5: التسهيلات والحدود" title="م5: التسهيلات والحدود"/>
+            <wp:cNvGraphicFramePr>
+              <a:graphicFrameLocks xmlns:a="http://schemas.openxmlformats.org/drawingml/2006/main" noChangeAspect="1"/>
+            </wp:cNvGraphicFramePr>
+            <a:graphic xmlns:a="http://schemas.openxmlformats.org/drawingml/2006/main">
+              <a:graphicData uri="http://schemas.openxmlformats.org/drawingml/2006/picture">
+                <pic:pic xmlns:pic="http://schemas.openxmlformats.org/drawingml/2006/picture">
+                  <pic:nvPicPr>
+                    <pic:cNvPr id="0" name="" descr=""/>
+                    <pic:cNvPicPr>
+                      <a:picLocks noChangeAspect="1" noChangeArrowheads="1"/>
+                    </pic:cNvPicPr>
+                  </pic:nvPicPr>
+                  <pic:blipFill>
+                    <a:blip r:embed="rId17" cstate="none"/>
+                    <a:srcRect/>
+                    <a:stretch>
+                      <a:fillRect/>
+                    </a:stretch>
+                  </pic:blipFill>
+                  <pic:spPr bwMode="auto">
+                    <a:xfrm>
+                      <a:off x="0" y="0"/>
+                      <a:ext cx="6096000" cy="4791075"/>
+                    </a:xfrm>
+                    <a:prstGeom prst="rect">
+                      <a:avLst/>
+                    </a:prstGeom>
+                  </pic:spPr>
+                </pic:pic>
+              </a:graphicData>
+            </a:graphic>
+          </wp:inline>
+        </w:drawing>
+      </w:r>
+    </w:p>
+    <w:p>
+      <w:pPr>
+        <w:bidi/>
+        <w:spacing w:after="220" w:before="0"/>
+        <w:jc w:val="center"/>
+      </w:pPr>
+      <w:r>
+        <w:rPr>
+          <w:rFonts w:ascii="Arial" w:cs="Arial" w:eastAsia="Arial" w:hAnsi="Arial"/>
+          <w:b w:val="false"/>
+          <w:bCs w:val="false"/>
+          <w:i/>
+          <w:iCs/>
+          <w:color w:val="5B6670"/>
+          <w:sz w:val="17"/>
+          <w:szCs w:val="17"/>
+          <w:rtl/>
+        </w:rPr>
+        <w:t xml:space="preserve">م5: التسهيلات والحدود</w:t>
+      </w:r>
+    </w:p>
+    <w:p>
+      <w:pPr>
+        <w:pStyle w:val="Heading3"/>
+        <w:bidi/>
+      </w:pPr>
+      <w:bookmarkStart w:name="_sec39" w:id="39"/>
+      <w:r>
+        <w:rPr>
+          <w:rFonts w:ascii="Arial" w:cs="Arial" w:eastAsia="Arial" w:hAnsi="Arial"/>
+          <w:b/>
+          <w:bCs/>
+          <w:color w:val="2B5C8A"/>
+          <w:sz w:val="23"/>
+          <w:szCs w:val="23"/>
+          <w:rtl/>
+        </w:rPr>
+        <w:t xml:space="preserve">التسعير والتعرفة وشروط المقارنة (م5)</w:t>
+      </w:r>
+      <w:bookmarkEnd w:id="39"/>
+    </w:p>
+    <w:p>
+      <w:pPr>
+        <w:keepNext/>
+        <w:bidi/>
+        <w:spacing w:after="60" w:before="160"/>
+        <w:jc w:val="center"/>
+      </w:pPr>
+      <w:r>
+        <w:drawing>
+          <wp:inline distT="0" distB="0" distL="0" distR="0">
+            <wp:extent cx="6096000" cy="5181600"/>
+            <wp:effectExtent t="0" r="0" b="0" l="0"/>
+            <wp:docPr id="1" name="diagrams/erd_m5_pricing.png" descr="م5: التسعير والتعرفة وشروط المقارنة" title="م5: التسعير والتعرفة وشروط المقارنة"/>
+            <wp:cNvGraphicFramePr>
+              <a:graphicFrameLocks xmlns:a="http://schemas.openxmlformats.org/drawingml/2006/main" noChangeAspect="1"/>
+            </wp:cNvGraphicFramePr>
+            <a:graphic xmlns:a="http://schemas.openxmlformats.org/drawingml/2006/main">
+              <a:graphicData uri="http://schemas.openxmlformats.org/drawingml/2006/picture">
+                <pic:pic xmlns:pic="http://schemas.openxmlformats.org/drawingml/2006/picture">
+                  <pic:nvPicPr>
+                    <pic:cNvPr id="0" name="" descr=""/>
+                    <pic:cNvPicPr>
+                      <a:picLocks noChangeAspect="1" noChangeArrowheads="1"/>
+                    </pic:cNvPicPr>
+                  </pic:nvPicPr>
+                  <pic:blipFill>
+                    <a:blip r:embed="rId18" cstate="none"/>
+                    <a:srcRect/>
+                    <a:stretch>
+                      <a:fillRect/>
+                    </a:stretch>
+                  </pic:blipFill>
+                  <pic:spPr bwMode="auto">
+                    <a:xfrm>
+                      <a:off x="0" y="0"/>
+                      <a:ext cx="6096000" cy="5181600"/>
+                    </a:xfrm>
+                    <a:prstGeom prst="rect">
+                      <a:avLst/>
+                    </a:prstGeom>
+                  </pic:spPr>
+                </pic:pic>
+              </a:graphicData>
+            </a:graphic>
+          </wp:inline>
+        </w:drawing>
+      </w:r>
+    </w:p>
+    <w:p>
+      <w:pPr>
+        <w:bidi/>
+        <w:spacing w:after="220" w:before="0"/>
+        <w:jc w:val="center"/>
+      </w:pPr>
+      <w:r>
+        <w:rPr>
+          <w:rFonts w:ascii="Arial" w:cs="Arial" w:eastAsia="Arial" w:hAnsi="Arial"/>
+          <w:b w:val="false"/>
+          <w:bCs w:val="false"/>
+          <w:i/>
+          <w:iCs/>
+          <w:color w:val="5B6670"/>
+          <w:sz w:val="17"/>
+          <w:szCs w:val="17"/>
+          <w:rtl/>
+        </w:rPr>
+        <w:t xml:space="preserve">م5: التسعير والتعرفة وشروط المقارنة</w:t>
+      </w:r>
+    </w:p>
+    <w:p>
+      <w:pPr>
+        <w:pStyle w:val="Heading3"/>
+        <w:bidi/>
+      </w:pPr>
+      <w:bookmarkStart w:name="_sec40" w:id="40"/>
+      <w:r>
+        <w:rPr>
+          <w:rFonts w:ascii="Arial" w:cs="Arial" w:eastAsia="Arial" w:hAnsi="Arial"/>
+          <w:b/>
+          <w:bCs/>
+          <w:color w:val="2B5C8A"/>
+          <w:sz w:val="23"/>
+          <w:szCs w:val="23"/>
+          <w:rtl/>
+        </w:rPr>
+        <w:t xml:space="preserve">الضمانات (م5)</w:t>
+      </w:r>
+      <w:bookmarkEnd w:id="40"/>
+    </w:p>
+    <w:p>
+      <w:pPr>
+        <w:keepNext/>
+        <w:bidi/>
+        <w:spacing w:after="60" w:before="160"/>
+        <w:jc w:val="center"/>
+      </w:pPr>
+      <w:r>
+        <w:drawing>
+          <wp:inline distT="0" distB="0" distL="0" distR="0">
+            <wp:extent cx="6096000" cy="3962400"/>
+            <wp:effectExtent t="0" r="0" b="0" l="0"/>
+            <wp:docPr id="1" name="diagrams/erd_m5_collateral.png" descr="م5: الضمانات" title="م5: الضمانات"/>
+            <wp:cNvGraphicFramePr>
+              <a:graphicFrameLocks xmlns:a="http://schemas.openxmlformats.org/drawingml/2006/main" noChangeAspect="1"/>
+            </wp:cNvGraphicFramePr>
+            <a:graphic xmlns:a="http://schemas.openxmlformats.org/drawingml/2006/main">
+              <a:graphicData uri="http://schemas.openxmlformats.org/drawingml/2006/picture">
+                <pic:pic xmlns:pic="http://schemas.openxmlformats.org/drawingml/2006/picture">
+                  <pic:nvPicPr>
+                    <pic:cNvPr id="0" name="" descr=""/>
+                    <pic:cNvPicPr>
+                      <a:picLocks noChangeAspect="1" noChangeArrowheads="1"/>
+                    </pic:cNvPicPr>
+                  </pic:nvPicPr>
+                  <pic:blipFill>
+                    <a:blip r:embed="rId19" cstate="none"/>
+                    <a:srcRect/>
+                    <a:stretch>
+                      <a:fillRect/>
+                    </a:stretch>
+                  </pic:blipFill>
+                  <pic:spPr bwMode="auto">
+                    <a:xfrm>
+                      <a:off x="0" y="0"/>
+                      <a:ext cx="6096000" cy="3962400"/>
+                    </a:xfrm>
+                    <a:prstGeom prst="rect">
+                      <a:avLst/>
+                    </a:prstGeom>
+                  </pic:spPr>
+                </pic:pic>
+              </a:graphicData>
+            </a:graphic>
+          </wp:inline>
+        </w:drawing>
+      </w:r>
+    </w:p>
+    <w:p>
+      <w:pPr>
+        <w:bidi/>
+        <w:spacing w:after="220" w:before="0"/>
+        <w:jc w:val="center"/>
+      </w:pPr>
+      <w:r>
+        <w:rPr>
+          <w:rFonts w:ascii="Arial" w:cs="Arial" w:eastAsia="Arial" w:hAnsi="Arial"/>
+          <w:b w:val="false"/>
+          <w:bCs w:val="false"/>
+          <w:i/>
+          <w:iCs/>
+          <w:color w:val="5B6670"/>
+          <w:sz w:val="17"/>
+          <w:szCs w:val="17"/>
+          <w:rtl/>
+        </w:rPr>
+        <w:t xml:space="preserve">م5: الضمانات</w:t>
+      </w:r>
+    </w:p>
+    <w:p>
+      <w:pPr>
+        <w:pStyle w:val="Heading3"/>
+        <w:bidi/>
+      </w:pPr>
+      <w:bookmarkStart w:name="_sec41" w:id="41"/>
+      <w:r>
+        <w:rPr>
+          <w:rFonts w:ascii="Arial" w:cs="Arial" w:eastAsia="Arial" w:hAnsi="Arial"/>
+          <w:b/>
+          <w:bCs/>
+          <w:color w:val="2B5C8A"/>
+          <w:sz w:val="23"/>
+          <w:szCs w:val="23"/>
+          <w:rtl/>
+        </w:rPr>
+        <w:t xml:space="preserve">الالتزامات والبيانات المالية (م5)</w:t>
+      </w:r>
+      <w:bookmarkEnd w:id="41"/>
+    </w:p>
+    <w:p>
+      <w:pPr>
+        <w:keepNext/>
+        <w:bidi/>
+        <w:spacing w:after="60" w:before="160"/>
+        <w:jc w:val="center"/>
+      </w:pPr>
+      <w:r>
+        <w:drawing>
+          <wp:inline distT="0" distB="0" distL="0" distR="0">
+            <wp:extent cx="6096000" cy="6219825"/>
+            <wp:effectExtent t="0" r="0" b="0" l="0"/>
+            <wp:docPr id="1" name="diagrams/erd_m5_obligations.png" descr="م5: الالتزامات والبيانات المالية" title="م5: الالتزامات والبيانات المالية"/>
+            <wp:cNvGraphicFramePr>
+              <a:graphicFrameLocks xmlns:a="http://schemas.openxmlformats.org/drawingml/2006/main" noChangeAspect="1"/>
+            </wp:cNvGraphicFramePr>
+            <a:graphic xmlns:a="http://schemas.openxmlformats.org/drawingml/2006/main">
+              <a:graphicData uri="http://schemas.openxmlformats.org/drawingml/2006/picture">
+                <pic:pic xmlns:pic="http://schemas.openxmlformats.org/drawingml/2006/picture">
+                  <pic:nvPicPr>
+                    <pic:cNvPr id="0" name="" descr=""/>
+                    <pic:cNvPicPr>
+                      <a:picLocks noChangeAspect="1" noChangeArrowheads="1"/>
+                    </pic:cNvPicPr>
+                  </pic:nvPicPr>
+                  <pic:blipFill>
+                    <a:blip r:embed="rId20" cstate="none"/>
+                    <a:srcRect/>
+                    <a:stretch>
+                      <a:fillRect/>
+                    </a:stretch>
+                  </pic:blipFill>
+                  <pic:spPr bwMode="auto">
+                    <a:xfrm>
+                      <a:off x="0" y="0"/>
+                      <a:ext cx="6096000" cy="6219825"/>
+                    </a:xfrm>
+                    <a:prstGeom prst="rect">
+                      <a:avLst/>
+                    </a:prstGeom>
+                  </pic:spPr>
+                </pic:pic>
+              </a:graphicData>
+            </a:graphic>
+          </wp:inline>
+        </w:drawing>
+      </w:r>
+    </w:p>
+    <w:p>
+      <w:pPr>
+        <w:bidi/>
+        <w:spacing w:after="220" w:before="0"/>
+        <w:jc w:val="center"/>
+      </w:pPr>
+      <w:r>
+        <w:rPr>
+          <w:rFonts w:ascii="Arial" w:cs="Arial" w:eastAsia="Arial" w:hAnsi="Arial"/>
+          <w:b w:val="false"/>
+          <w:bCs w:val="false"/>
+          <w:i/>
+          <w:iCs/>
+          <w:color w:val="5B6670"/>
+          <w:sz w:val="17"/>
+          <w:szCs w:val="17"/>
+          <w:rtl/>
+        </w:rPr>
+        <w:t xml:space="preserve">م5: الالتزامات والبيانات المالية</w:t>
+      </w:r>
+    </w:p>
+    <w:p>
+      <w:pPr>
+        <w:pStyle w:val="Heading3"/>
+        <w:bidi/>
+      </w:pPr>
+      <w:bookmarkStart w:name="_sec42" w:id="42"/>
+      <w:r>
+        <w:rPr>
+          <w:rFonts w:ascii="Arial" w:cs="Arial" w:eastAsia="Arial" w:hAnsi="Arial"/>
+          <w:b/>
+          <w:bCs/>
+          <w:color w:val="2B5C8A"/>
+          <w:sz w:val="23"/>
+          <w:szCs w:val="23"/>
+          <w:rtl/>
+        </w:rPr>
+        <w:t xml:space="preserve">محرك الطلبات ودورات العمل (م6)</w:t>
+      </w:r>
+      <w:bookmarkEnd w:id="42"/>
+    </w:p>
+    <w:p>
+      <w:pPr>
+        <w:keepNext/>
+        <w:bidi/>
+        <w:spacing w:after="60" w:before="160"/>
+        <w:jc w:val="center"/>
+      </w:pPr>
+      <w:r>
+        <w:drawing>
+          <wp:inline distT="0" distB="0" distL="0" distR="0">
+            <wp:extent cx="6096000" cy="6724650"/>
+            <wp:effectExtent t="0" r="0" b="0" l="0"/>
+            <wp:docPr id="1" name="diagrams/erd_m6_workflow.png" descr="م6: محرك الطلبات ودورات العمل" title="م6: محرك الطلبات ودورات العمل"/>
+            <wp:cNvGraphicFramePr>
+              <a:graphicFrameLocks xmlns:a="http://schemas.openxmlformats.org/drawingml/2006/main" noChangeAspect="1"/>
+            </wp:cNvGraphicFramePr>
+            <a:graphic xmlns:a="http://schemas.openxmlformats.org/drawingml/2006/main">
+              <a:graphicData uri="http://schemas.openxmlformats.org/drawingml/2006/picture">
+                <pic:pic xmlns:pic="http://schemas.openxmlformats.org/drawingml/2006/picture">
+                  <pic:nvPicPr>
+                    <pic:cNvPr id="0" name="" descr=""/>
+                    <pic:cNvPicPr>
+                      <a:picLocks noChangeAspect="1" noChangeArrowheads="1"/>
+                    </pic:cNvPicPr>
+                  </pic:nvPicPr>
+                  <pic:blipFill>
+                    <a:blip r:embed="rId21" cstate="none"/>
+                    <a:srcRect/>
+                    <a:stretch>
+                      <a:fillRect/>
+                    </a:stretch>
+                  </pic:blipFill>
+                  <pic:spPr bwMode="auto">
+                    <a:xfrm>
+                      <a:off x="0" y="0"/>
+                      <a:ext cx="6096000" cy="6724650"/>
+                    </a:xfrm>
+                    <a:prstGeom prst="rect">
+                      <a:avLst/>
+                    </a:prstGeom>
+                  </pic:spPr>
+                </pic:pic>
+              </a:graphicData>
+            </a:graphic>
+          </wp:inline>
+        </w:drawing>
+      </w:r>
+    </w:p>
+    <w:p>
+      <w:pPr>
+        <w:bidi/>
+        <w:spacing w:after="220" w:before="0"/>
+        <w:jc w:val="center"/>
+      </w:pPr>
+      <w:r>
+        <w:rPr>
+          <w:rFonts w:ascii="Arial" w:cs="Arial" w:eastAsia="Arial" w:hAnsi="Arial"/>
+          <w:b w:val="false"/>
+          <w:bCs w:val="false"/>
+          <w:i/>
+          <w:iCs/>
+          <w:color w:val="5B6670"/>
+          <w:sz w:val="17"/>
+          <w:szCs w:val="17"/>
+          <w:rtl/>
+        </w:rPr>
+        <w:t xml:space="preserve">م6: محرك الطلبات ودورات العمل</w:t>
+      </w:r>
+    </w:p>
+    <w:p>
+      <w:pPr>
+        <w:pStyle w:val="Heading3"/>
+        <w:bidi/>
+      </w:pPr>
+      <w:bookmarkStart w:name="_sec43" w:id="43"/>
+      <w:r>
+        <w:rPr>
+          <w:rFonts w:ascii="Arial" w:cs="Arial" w:eastAsia="Arial" w:hAnsi="Arial"/>
+          <w:b/>
+          <w:bCs/>
+          <w:color w:val="2B5C8A"/>
+          <w:sz w:val="23"/>
+          <w:szCs w:val="23"/>
+          <w:rtl/>
+        </w:rPr>
+        <w:t xml:space="preserve">الإشعارات (م6)</w:t>
+      </w:r>
+      <w:bookmarkEnd w:id="43"/>
+    </w:p>
+    <w:p>
+      <w:pPr>
+        <w:keepNext/>
+        <w:bidi/>
+        <w:spacing w:after="60" w:before="160"/>
+        <w:jc w:val="center"/>
+      </w:pPr>
+      <w:r>
+        <w:drawing>
+          <wp:inline distT="0" distB="0" distL="0" distR="0">
+            <wp:extent cx="6096000" cy="4448175"/>
+            <wp:effectExtent t="0" r="0" b="0" l="0"/>
+            <wp:docPr id="1" name="diagrams/erd_m6_notifications.png" descr="م6: الإشعارات" title="م6: الإشعارات"/>
+            <wp:cNvGraphicFramePr>
+              <a:graphicFrameLocks xmlns:a="http://schemas.openxmlformats.org/drawingml/2006/main" noChangeAspect="1"/>
+            </wp:cNvGraphicFramePr>
+            <a:graphic xmlns:a="http://schemas.openxmlformats.org/drawingml/2006/main">
+              <a:graphicData uri="http://schemas.openxmlformats.org/drawingml/2006/picture">
+                <pic:pic xmlns:pic="http://schemas.openxmlformats.org/drawingml/2006/picture">
+                  <pic:nvPicPr>
+                    <pic:cNvPr id="0" name="" descr=""/>
+                    <pic:cNvPicPr>
+                      <a:picLocks noChangeAspect="1" noChangeArrowheads="1"/>
+                    </pic:cNvPicPr>
+                  </pic:nvPicPr>
+                  <pic:blipFill>
+                    <a:blip r:embed="rId22" cstate="none"/>
+                    <a:srcRect/>
+                    <a:stretch>
+                      <a:fillRect/>
+                    </a:stretch>
+                  </pic:blipFill>
+                  <pic:spPr bwMode="auto">
+                    <a:xfrm>
+                      <a:off x="0" y="0"/>
+                      <a:ext cx="6096000" cy="4448175"/>
+                    </a:xfrm>
+                    <a:prstGeom prst="rect">
+                      <a:avLst/>
+                    </a:prstGeom>
+                  </pic:spPr>
+                </pic:pic>
+              </a:graphicData>
+            </a:graphic>
+          </wp:inline>
+        </w:drawing>
+      </w:r>
+    </w:p>
+    <w:p>
+      <w:pPr>
+        <w:bidi/>
+        <w:spacing w:after="220" w:before="0"/>
+        <w:jc w:val="center"/>
+      </w:pPr>
+      <w:r>
+        <w:rPr>
+          <w:rFonts w:ascii="Arial" w:cs="Arial" w:eastAsia="Arial" w:hAnsi="Arial"/>
+          <w:b w:val="false"/>
+          <w:bCs w:val="false"/>
+          <w:i/>
+          <w:iCs/>
+          <w:color w:val="5B6670"/>
+          <w:sz w:val="17"/>
+          <w:szCs w:val="17"/>
+          <w:rtl/>
+        </w:rPr>
+        <w:t xml:space="preserve">م6: الإشعارات</w:t>
+      </w:r>
+    </w:p>
+    <w:p>
+      <w:pPr>
+        <w:pStyle w:val="Heading3"/>
+        <w:bidi/>
+      </w:pPr>
+      <w:bookmarkStart w:name="_sec44" w:id="44"/>
+      <w:r>
+        <w:rPr>
+          <w:rFonts w:ascii="Arial" w:cs="Arial" w:eastAsia="Arial" w:hAnsi="Arial"/>
+          <w:b/>
+          <w:bCs/>
+          <w:color w:val="2B5C8A"/>
+          <w:sz w:val="23"/>
+          <w:szCs w:val="23"/>
+          <w:rtl/>
+        </w:rPr>
+        <w:t xml:space="preserve">الاعتمادات المستندية والبروفورما (م7/م8)</w:t>
+      </w:r>
+      <w:bookmarkEnd w:id="44"/>
+    </w:p>
+    <w:p>
+      <w:pPr>
+        <w:keepNext/>
+        <w:bidi/>
+        <w:spacing w:after="60" w:before="160"/>
+        <w:jc w:val="center"/>
+      </w:pPr>
+      <w:r>
+        <w:drawing>
+          <wp:inline distT="0" distB="0" distL="0" distR="0">
+            <wp:extent cx="6096000" cy="6286500"/>
+            <wp:effectExtent t="0" r="0" b="0" l="0"/>
+            <wp:docPr id="1" name="diagrams/erd_m7_8_lc.png" descr="م7/م8: الاعتمادات المستندية والبروفورما" title="م7/م8: الاعتمادات المستندية والبروفورما"/>
+            <wp:cNvGraphicFramePr>
+              <a:graphicFrameLocks xmlns:a="http://schemas.openxmlformats.org/drawingml/2006/main" noChangeAspect="1"/>
+            </wp:cNvGraphicFramePr>
+            <a:graphic xmlns:a="http://schemas.openxmlformats.org/drawingml/2006/main">
+              <a:graphicData uri="http://schemas.openxmlformats.org/drawingml/2006/picture">
+                <pic:pic xmlns:pic="http://schemas.openxmlformats.org/drawingml/2006/picture">
+                  <pic:nvPicPr>
+                    <pic:cNvPr id="0" name="" descr=""/>
+                    <pic:cNvPicPr>
+                      <a:picLocks noChangeAspect="1" noChangeArrowheads="1"/>
+                    </pic:cNvPicPr>
+                  </pic:nvPicPr>
+                  <pic:blipFill>
+                    <a:blip r:embed="rId23" cstate="none"/>
+                    <a:srcRect/>
+                    <a:stretch>
+                      <a:fillRect/>
+                    </a:stretch>
+                  </pic:blipFill>
+                  <pic:spPr bwMode="auto">
+                    <a:xfrm>
+                      <a:off x="0" y="0"/>
+                      <a:ext cx="6096000" cy="6286500"/>
+                    </a:xfrm>
+                    <a:prstGeom prst="rect">
+                      <a:avLst/>
+                    </a:prstGeom>
+                  </pic:spPr>
+                </pic:pic>
+              </a:graphicData>
+            </a:graphic>
+          </wp:inline>
+        </w:drawing>
+      </w:r>
+    </w:p>
+    <w:p>
+      <w:pPr>
+        <w:bidi/>
+        <w:spacing w:after="220" w:before="0"/>
+        <w:jc w:val="center"/>
+      </w:pPr>
+      <w:r>
+        <w:rPr>
+          <w:rFonts w:ascii="Arial" w:cs="Arial" w:eastAsia="Arial" w:hAnsi="Arial"/>
+          <w:b w:val="false"/>
+          <w:bCs w:val="false"/>
+          <w:i/>
+          <w:iCs/>
+          <w:color w:val="5B6670"/>
+          <w:sz w:val="17"/>
+          <w:szCs w:val="17"/>
+          <w:rtl/>
+        </w:rPr>
+        <w:t xml:space="preserve">م7/م8: الاعتمادات المستندية والبروفورما</w:t>
+      </w:r>
+    </w:p>
+    <w:p>
+      <w:pPr>
         <w:pStyle w:val="Heading1"/>
         <w:bidi/>
       </w:pPr>
-      <w:bookmarkStart w:name="_sec31" w:id="31"/>
+      <w:bookmarkStart w:name="_sec45" w:id="45"/>
       <w:r>
         <w:rPr>
           <w:rFonts w:ascii="Arial" w:cs="Arial" w:eastAsia="Arial" w:hAnsi="Arial"/>
@@ -26303,7 +27982,7 @@
         </w:rPr>
         <w:t xml:space="preserve">11. أنماط التصميم للمجالات الرئيسية</w:t>
       </w:r>
-      <w:bookmarkEnd w:id="31"/>
+      <w:bookmarkEnd w:id="45"/>
     </w:p>
     <w:tbl>
       <w:tblPr>
@@ -29099,7 +30778,7 @@
         <w:pStyle w:val="Heading2"/>
         <w:bidi/>
       </w:pPr>
-      <w:bookmarkStart w:name="_sec32" w:id="32"/>
+      <w:bookmarkStart w:name="_sec46" w:id="46"/>
       <w:r>
         <w:rPr>
           <w:rFonts w:ascii="Arial" w:cs="Arial" w:eastAsia="Arial" w:hAnsi="Arial"/>
@@ -29112,7 +30791,7 @@
         </w:rPr>
         <w:t xml:space="preserve">11.1 إقفال دورة العمل بيد إدارة الخزينة (C-7)</w:t>
       </w:r>
-      <w:bookmarkEnd w:id="32"/>
+      <w:bookmarkEnd w:id="46"/>
     </w:p>
     <w:p>
       <w:pPr>
@@ -31031,10 +32710,79 @@
     </w:p>
     <w:p>
       <w:pPr>
+        <w:keepNext/>
+        <w:bidi/>
+        <w:spacing w:after="60" w:before="160"/>
+        <w:jc w:val="center"/>
+      </w:pPr>
+      <w:r>
+        <w:drawing>
+          <wp:inline distT="0" distB="0" distL="0" distR="0">
+            <wp:extent cx="6096000" cy="1895475"/>
+            <wp:effectExtent t="0" r="0" b="0" l="0"/>
+            <wp:docPr id="1" name="diagrams/erd_03_request_lifecycle.png" descr="دورة حياة الطلب: الإكمال يتطلب إقفال إدارة الخزينة" title="دورة حياة الطلب: الإكمال يتطلب إقفال إدارة الخزينة"/>
+            <wp:cNvGraphicFramePr>
+              <a:graphicFrameLocks xmlns:a="http://schemas.openxmlformats.org/drawingml/2006/main" noChangeAspect="1"/>
+            </wp:cNvGraphicFramePr>
+            <a:graphic xmlns:a="http://schemas.openxmlformats.org/drawingml/2006/main">
+              <a:graphicData uri="http://schemas.openxmlformats.org/drawingml/2006/picture">
+                <pic:pic xmlns:pic="http://schemas.openxmlformats.org/drawingml/2006/picture">
+                  <pic:nvPicPr>
+                    <pic:cNvPr id="0" name="" descr=""/>
+                    <pic:cNvPicPr>
+                      <a:picLocks noChangeAspect="1" noChangeArrowheads="1"/>
+                    </pic:cNvPicPr>
+                  </pic:nvPicPr>
+                  <pic:blipFill>
+                    <a:blip r:embed="rId24" cstate="none"/>
+                    <a:srcRect/>
+                    <a:stretch>
+                      <a:fillRect/>
+                    </a:stretch>
+                  </pic:blipFill>
+                  <pic:spPr bwMode="auto">
+                    <a:xfrm>
+                      <a:off x="0" y="0"/>
+                      <a:ext cx="6096000" cy="1895475"/>
+                    </a:xfrm>
+                    <a:prstGeom prst="rect">
+                      <a:avLst/>
+                    </a:prstGeom>
+                  </pic:spPr>
+                </pic:pic>
+              </a:graphicData>
+            </a:graphic>
+          </wp:inline>
+        </w:drawing>
+      </w:r>
+    </w:p>
+    <w:p>
+      <w:pPr>
+        <w:bidi/>
+        <w:spacing w:after="220" w:before="0"/>
+        <w:jc w:val="center"/>
+      </w:pPr>
+      <w:r>
+        <w:rPr>
+          <w:rFonts w:ascii="Arial" w:cs="Arial" w:eastAsia="Arial" w:hAnsi="Arial"/>
+          <w:b w:val="false"/>
+          <w:bCs w:val="false"/>
+          <w:i/>
+          <w:iCs/>
+          <w:color w:val="5B6670"/>
+          <w:sz w:val="17"/>
+          <w:szCs w:val="17"/>
+          <w:rtl/>
+        </w:rPr>
+        <w:t xml:space="preserve">دورة حياة الطلب: الإكمال يتطلب إقفال إدارة الخزينة</w:t>
+      </w:r>
+    </w:p>
+    <w:p>
+      <w:pPr>
         <w:pStyle w:val="Heading1"/>
         <w:bidi/>
       </w:pPr>
-      <w:bookmarkStart w:name="_sec33" w:id="33"/>
+      <w:bookmarkStart w:name="_sec47" w:id="47"/>
       <w:r>
         <w:rPr>
           <w:rFonts w:ascii="Arial" w:cs="Arial" w:eastAsia="Arial" w:hAnsi="Arial"/>
@@ -31047,14 +32795,14 @@
         </w:rPr>
         <w:t xml:space="preserve">12. النشر وإدارة التغيير</w:t>
       </w:r>
-      <w:bookmarkEnd w:id="33"/>
+      <w:bookmarkEnd w:id="47"/>
     </w:p>
     <w:p>
       <w:pPr>
         <w:pStyle w:val="Heading2"/>
         <w:bidi/>
       </w:pPr>
-      <w:bookmarkStart w:name="_sec34" w:id="34"/>
+      <w:bookmarkStart w:name="_sec48" w:id="48"/>
       <w:r>
         <w:rPr>
           <w:rFonts w:ascii="Arial" w:cs="Arial" w:eastAsia="Arial" w:hAnsi="Arial"/>
@@ -31091,7 +32839,7 @@
         </w:rPr>
         <w:t xml:space="preserve">، وضع SQLCMD)</w:t>
       </w:r>
-      <w:bookmarkEnd w:id="34"/>
+      <w:bookmarkEnd w:id="48"/>
     </w:p>
     <w:p>
       <w:pPr>
@@ -31769,7 +33517,7 @@
         <w:pStyle w:val="Heading2"/>
         <w:bidi/>
       </w:pPr>
-      <w:bookmarkStart w:name="_sec35" w:id="35"/>
+      <w:bookmarkStart w:name="_sec49" w:id="49"/>
       <w:r>
         <w:rPr>
           <w:rFonts w:ascii="Arial" w:cs="Arial" w:eastAsia="Arial" w:hAnsi="Arial"/>
@@ -31782,7 +33530,7 @@
         </w:rPr>
         <w:t xml:space="preserve">12.2 تغيير النموذج</w:t>
       </w:r>
-      <w:bookmarkEnd w:id="35"/>
+      <w:bookmarkEnd w:id="49"/>
     </w:p>
     <w:p>
       <w:pPr>
@@ -31950,7 +33698,7 @@
         <w:pStyle w:val="Heading2"/>
         <w:bidi/>
       </w:pPr>
-      <w:bookmarkStart w:name="_sec36" w:id="36"/>
+      <w:bookmarkStart w:name="_sec50" w:id="50"/>
       <w:r>
         <w:rPr>
           <w:rFonts w:ascii="Arial" w:cs="Arial" w:eastAsia="Arial" w:hAnsi="Arial"/>
@@ -31984,7 +33732,7 @@
         </w:rPr>
         <w:t xml:space="preserve">)</w:t>
       </w:r>
-      <w:bookmarkEnd w:id="36"/>
+      <w:bookmarkEnd w:id="50"/>
     </w:p>
     <w:p>
       <w:pPr>
@@ -32188,7 +33936,7 @@
         <w:pStyle w:val="Heading2"/>
         <w:bidi/>
       </w:pPr>
-      <w:bookmarkStart w:name="_sec37" w:id="37"/>
+      <w:bookmarkStart w:name="_sec51" w:id="51"/>
       <w:r>
         <w:rPr>
           <w:rFonts w:ascii="Arial" w:cs="Arial" w:eastAsia="Arial" w:hAnsi="Arial"/>
@@ -32201,7 +33949,7 @@
         </w:rPr>
         <w:t xml:space="preserve">12.4 الأداء والحمل</w:t>
       </w:r>
-      <w:bookmarkEnd w:id="37"/>
+      <w:bookmarkEnd w:id="51"/>
     </w:p>
     <w:p>
       <w:pPr>
@@ -32297,7 +34045,7 @@
         <w:pStyle w:val="Heading1"/>
         <w:bidi/>
       </w:pPr>
-      <w:bookmarkStart w:name="_sec38" w:id="38"/>
+      <w:bookmarkStart w:name="_sec52" w:id="52"/>
       <w:r>
         <w:rPr>
           <w:rFonts w:ascii="Arial" w:cs="Arial" w:eastAsia="Arial" w:hAnsi="Arial"/>
@@ -32310,7 +34058,7 @@
         </w:rPr>
         <w:t xml:space="preserve">13. البذور وتهيئة المشترك (خطة — لم تُنفَّذ بعد)</w:t>
       </w:r>
-      <w:bookmarkEnd w:id="38"/>
+      <w:bookmarkEnd w:id="52"/>
     </w:p>
     <w:tbl>
       <w:tblPr>
@@ -33304,7 +35052,7 @@
         <w:pStyle w:val="Heading1"/>
         <w:bidi/>
       </w:pPr>
-      <w:bookmarkStart w:name="_sec39" w:id="39"/>
+      <w:bookmarkStart w:name="_sec53" w:id="53"/>
       <w:r>
         <w:rPr>
           <w:rFonts w:ascii="Arial" w:cs="Arial" w:eastAsia="Arial" w:hAnsi="Arial"/>
@@ -33317,7 +35065,7 @@
         </w:rPr>
         <w:t xml:space="preserve">14. أدلة التحقق وحدودها (بصراحة)</w:t>
       </w:r>
-      <w:bookmarkEnd w:id="39"/>
+      <w:bookmarkEnd w:id="53"/>
     </w:p>
     <w:tbl>
       <w:tblPr>
@@ -34977,7 +36725,7 @@
         <w:pStyle w:val="Heading1"/>
         <w:bidi/>
       </w:pPr>
-      <w:bookmarkStart w:name="_sec40" w:id="40"/>
+      <w:bookmarkStart w:name="_sec54" w:id="54"/>
       <w:r>
         <w:rPr>
           <w:rFonts w:ascii="Arial" w:cs="Arial" w:eastAsia="Arial" w:hAnsi="Arial"/>
@@ -34990,7 +36738,7 @@
         </w:rPr>
         <w:t xml:space="preserve">15. القرارات المتخذة (تُعتمد ما لم تعترض)</w:t>
       </w:r>
-      <w:bookmarkEnd w:id="40"/>
+      <w:bookmarkEnd w:id="54"/>
     </w:p>
     <w:tbl>
       <w:tblPr>
@@ -38412,7 +40160,7 @@
         <w:pStyle w:val="Heading1"/>
         <w:bidi/>
       </w:pPr>
-      <w:bookmarkStart w:name="_sec41" w:id="41"/>
+      <w:bookmarkStart w:name="_sec55" w:id="55"/>
       <w:r>
         <w:rPr>
           <w:rFonts w:ascii="Arial" w:cs="Arial" w:eastAsia="Arial" w:hAnsi="Arial"/>
@@ -38425,7 +40173,7 @@
         </w:rPr>
         <w:t xml:space="preserve">16. حدود معروفة ونقاط مفتوحة</w:t>
       </w:r>
-      <w:bookmarkEnd w:id="41"/>
+      <w:bookmarkEnd w:id="55"/>
     </w:p>
     <w:tbl>
       <w:tblPr>
@@ -41038,7 +42786,7 @@
         <w:pStyle w:val="Heading1"/>
         <w:bidi/>
       </w:pPr>
-      <w:bookmarkStart w:name="_sec42" w:id="42"/>
+      <w:bookmarkStart w:name="_sec56" w:id="56"/>
       <w:r>
         <w:rPr>
           <w:rFonts w:ascii="Arial" w:cs="Arial" w:eastAsia="Arial" w:hAnsi="Arial"/>
@@ -41051,7 +42799,7 @@
         </w:rPr>
         <w:t xml:space="preserve">17. الخطوة التالية</w:t>
       </w:r>
-      <w:bookmarkEnd w:id="42"/>
+      <w:bookmarkEnd w:id="56"/>
     </w:p>
     <w:p>
       <w:pPr>

</xml_diff>

<commit_message>
Group tenant-owned tables in the core ERD and draw a single TenantId arrow to plat.Tenant
- tools/dbgen/erd.py: owned tables in one cluster, one labelled arrow to plat.Tenant instead of one dotted arrow per table
- docs/diagrams and docs/20-database-design.docx regenerated; §3.7 caption updated

Claude-Session: https://claude.ai/code/session_012HHcRrzuvMBTL2FYxXtsyv
</commit_message>
<xml_diff>
--- a/treasury-platform/docs/20-database-design.docx
+++ b/treasury-platform/docs/20-database-design.docx
@@ -10342,7 +10342,7 @@
           <w:szCs w:val="21"/>
           <w:rtl/>
         </w:rPr>
-        <w:t xml:space="preserve"> مع اسم العمود عليها. الأسهم المتقطعة الذهبية تعني أن الجدول مملوك للمشترك ويحمل </w:t>
+        <w:t xml:space="preserve"> مع اسم العمود عليها. الجداول المملوكة للمشترك مجمّعة في عنقود أزرق، وكلها تحمل </w:t>
       </w:r>
       <w:r>
         <w:rPr>
@@ -10390,7 +10390,7 @@
           <w:szCs w:val="21"/>
           <w:rtl/>
         </w:rPr>
-        <w:t xml:space="preserve">؛ رسمها لكل جدول يجعل الصورة أكثر ازدحامًا، لذا تُذكر هنا بالدلالة فقط.</w:t>
+        <w:t xml:space="preserve"> بسهم واحد ذهبي؛ وبذلك لا تتقاطع الأسهم المتكررة فوق بعضها.</w:t>
       </w:r>
     </w:p>
     <w:p>
@@ -10403,7 +10403,7 @@
       <w:r>
         <w:drawing>
           <wp:inline distT="0" distB="0" distL="0" distR="0">
-            <wp:extent cx="6096000" cy="4572000"/>
+            <wp:extent cx="6096000" cy="4286250"/>
             <wp:effectExtent t="0" r="0" b="0" l="0"/>
             <wp:docPr id="1" name="diagrams/erd_00_core_tenancy.png" descr="العلاقات الأساسية: المشترك والمستخدمون والأدوار والصلاحيات والمفاتيح" title="العلاقات الأساسية: المشترك والمستخدمون والأدوار والصلاحيات والمفاتيح"/>
             <wp:cNvGraphicFramePr>
@@ -10428,7 +10428,7 @@
                   <pic:spPr bwMode="auto">
                     <a:xfrm>
                       <a:off x="0" y="0"/>
-                      <a:ext cx="6096000" cy="4572000"/>
+                      <a:ext cx="6096000" cy="4286250"/>
                     </a:xfrm>
                     <a:prstGeom prst="rect">
                       <a:avLst/>

</xml_diff>

<commit_message>
Rebuild the Word files for O-13 and the reference seeds
Design document, readiness volumes P0 and P1-P2, DOC-B05, DOC-B09, DOC-F07,
DOC-F09 and the ERD Word file (open items O-06 and O-13; the relation table
now shows no cascade on org.CompanyWealthSource). The ERD charts are
unchanged.

Claude-Session: https://claude.ai/code/session_012HHcRrzuvMBTL2FYxXtsyv
</commit_message>
<xml_diff>
--- a/treasury-platform/docs/20-database-design.docx
+++ b/treasury-platform/docs/20-database-design.docx
@@ -1274,7 +1274,7 @@
             <w:szCs w:val="20"/>
             <w:rtl/>
           </w:rPr>
-          <w:t xml:space="preserve">13. البذور وتهيئة المشترك (منفّذ جزئيًا)</w:t>
+          <w:t xml:space="preserve">13. البذور وتهيئة المشترك</w:t>
         </w:r>
       </w:hyperlink>
     </w:p>
@@ -20449,9 +20449,9 @@
         </w:tblBorders>
       </w:tblPr>
       <w:tblGrid>
-        <w:gridCol w:w="1751"/>
-        <w:gridCol w:w="3607"/>
-        <w:gridCol w:w="4506"/>
+        <w:gridCol w:w="1557"/>
+        <w:gridCol w:w="3207"/>
+        <w:gridCol w:w="5100"/>
       </w:tblGrid>
       <w:tr>
         <w:trPr>
@@ -20460,7 +20460,7 @@
         </w:trPr>
         <w:tc>
           <w:tcPr>
-            <w:tcW w:type="dxa" w:w="1751"/>
+            <w:tcW w:type="dxa" w:w="1557"/>
             <w:tcBorders>
               <w:top w:val="single" w:color="BFC9D6" w:sz="4"/>
               <w:left w:val="single" w:color="BFC9D6" w:sz="4"/>
@@ -20498,7 +20498,7 @@
         </w:tc>
         <w:tc>
           <w:tcPr>
-            <w:tcW w:type="dxa" w:w="3607"/>
+            <w:tcW w:type="dxa" w:w="3207"/>
             <w:tcBorders>
               <w:top w:val="single" w:color="BFC9D6" w:sz="4"/>
               <w:left w:val="single" w:color="BFC9D6" w:sz="4"/>
@@ -20536,7 +20536,7 @@
         </w:tc>
         <w:tc>
           <w:tcPr>
-            <w:tcW w:type="dxa" w:w="4506"/>
+            <w:tcW w:type="dxa" w:w="5100"/>
             <w:tcBorders>
               <w:top w:val="single" w:color="BFC9D6" w:sz="4"/>
               <w:left w:val="single" w:color="BFC9D6" w:sz="4"/>
@@ -20579,7 +20579,7 @@
         </w:trPr>
         <w:tc>
           <w:tcPr>
-            <w:tcW w:type="dxa" w:w="1751"/>
+            <w:tcW w:type="dxa" w:w="1557"/>
             <w:tcBorders>
               <w:top w:val="single" w:color="BFC9D6" w:sz="4"/>
               <w:left w:val="single" w:color="BFC9D6" w:sz="4"/>
@@ -20615,7 +20615,7 @@
         </w:tc>
         <w:tc>
           <w:tcPr>
-            <w:tcW w:type="dxa" w:w="3607"/>
+            <w:tcW w:type="dxa" w:w="3207"/>
             <w:tcBorders>
               <w:top w:val="single" w:color="BFC9D6" w:sz="4"/>
               <w:left w:val="single" w:color="BFC9D6" w:sz="4"/>
@@ -20651,7 +20651,7 @@
         </w:tc>
         <w:tc>
           <w:tcPr>
-            <w:tcW w:type="dxa" w:w="4506"/>
+            <w:tcW w:type="dxa" w:w="5100"/>
             <w:tcBorders>
               <w:top w:val="single" w:color="BFC9D6" w:sz="4"/>
               <w:left w:val="single" w:color="BFC9D6" w:sz="4"/>
@@ -20694,7 +20694,7 @@
         </w:trPr>
         <w:tc>
           <w:tcPr>
-            <w:tcW w:type="dxa" w:w="1751"/>
+            <w:tcW w:type="dxa" w:w="1557"/>
             <w:tcBorders>
               <w:top w:val="single" w:color="BFC9D6" w:sz="4"/>
               <w:left w:val="single" w:color="BFC9D6" w:sz="4"/>
@@ -20731,7 +20731,7 @@
         </w:tc>
         <w:tc>
           <w:tcPr>
-            <w:tcW w:type="dxa" w:w="3607"/>
+            <w:tcW w:type="dxa" w:w="3207"/>
             <w:tcBorders>
               <w:top w:val="single" w:color="BFC9D6" w:sz="4"/>
               <w:left w:val="single" w:color="BFC9D6" w:sz="4"/>
@@ -20781,7 +20781,7 @@
         </w:tc>
         <w:tc>
           <w:tcPr>
-            <w:tcW w:type="dxa" w:w="4506"/>
+            <w:tcW w:type="dxa" w:w="5100"/>
             <w:tcBorders>
               <w:top w:val="single" w:color="BFC9D6" w:sz="4"/>
               <w:left w:val="single" w:color="BFC9D6" w:sz="4"/>
@@ -20825,7 +20825,7 @@
         </w:trPr>
         <w:tc>
           <w:tcPr>
-            <w:tcW w:type="dxa" w:w="1751"/>
+            <w:tcW w:type="dxa" w:w="1557"/>
             <w:tcBorders>
               <w:top w:val="single" w:color="BFC9D6" w:sz="4"/>
               <w:left w:val="single" w:color="BFC9D6" w:sz="4"/>
@@ -20861,7 +20861,7 @@
         </w:tc>
         <w:tc>
           <w:tcPr>
-            <w:tcW w:type="dxa" w:w="3607"/>
+            <w:tcW w:type="dxa" w:w="3207"/>
             <w:tcBorders>
               <w:top w:val="single" w:color="BFC9D6" w:sz="4"/>
               <w:left w:val="single" w:color="BFC9D6" w:sz="4"/>
@@ -20991,7 +20991,7 @@
         </w:tc>
         <w:tc>
           <w:tcPr>
-            <w:tcW w:type="dxa" w:w="4506"/>
+            <w:tcW w:type="dxa" w:w="5100"/>
             <w:tcBorders>
               <w:top w:val="single" w:color="BFC9D6" w:sz="4"/>
               <w:left w:val="single" w:color="BFC9D6" w:sz="4"/>
@@ -21045,7 +21045,7 @@
         </w:trPr>
         <w:tc>
           <w:tcPr>
-            <w:tcW w:type="dxa" w:w="1751"/>
+            <w:tcW w:type="dxa" w:w="1557"/>
             <w:tcBorders>
               <w:top w:val="single" w:color="BFC9D6" w:sz="4"/>
               <w:left w:val="single" w:color="BFC9D6" w:sz="4"/>
@@ -21082,7 +21082,7 @@
         </w:tc>
         <w:tc>
           <w:tcPr>
-            <w:tcW w:type="dxa" w:w="3607"/>
+            <w:tcW w:type="dxa" w:w="3207"/>
             <w:tcBorders>
               <w:top w:val="single" w:color="BFC9D6" w:sz="4"/>
               <w:left w:val="single" w:color="BFC9D6" w:sz="4"/>
@@ -21255,7 +21255,7 @@
         </w:tc>
         <w:tc>
           <w:tcPr>
-            <w:tcW w:type="dxa" w:w="4506"/>
+            <w:tcW w:type="dxa" w:w="5100"/>
             <w:tcBorders>
               <w:top w:val="single" w:color="BFC9D6" w:sz="4"/>
               <w:left w:val="single" w:color="BFC9D6" w:sz="4"/>
@@ -21310,7 +21310,7 @@
         </w:trPr>
         <w:tc>
           <w:tcPr>
-            <w:tcW w:type="dxa" w:w="1751"/>
+            <w:tcW w:type="dxa" w:w="1557"/>
             <w:tcBorders>
               <w:top w:val="single" w:color="BFC9D6" w:sz="4"/>
               <w:left w:val="single" w:color="BFC9D6" w:sz="4"/>
@@ -21346,7 +21346,7 @@
         </w:tc>
         <w:tc>
           <w:tcPr>
-            <w:tcW w:type="dxa" w:w="3607"/>
+            <w:tcW w:type="dxa" w:w="3207"/>
             <w:tcBorders>
               <w:top w:val="single" w:color="BFC9D6" w:sz="4"/>
               <w:left w:val="single" w:color="BFC9D6" w:sz="4"/>
@@ -21395,7 +21395,7 @@
         </w:tc>
         <w:tc>
           <w:tcPr>
-            <w:tcW w:type="dxa" w:w="4506"/>
+            <w:tcW w:type="dxa" w:w="5100"/>
             <w:tcBorders>
               <w:top w:val="single" w:color="BFC9D6" w:sz="4"/>
               <w:left w:val="single" w:color="BFC9D6" w:sz="4"/>
@@ -21436,7 +21436,7 @@
         </w:trPr>
         <w:tc>
           <w:tcPr>
-            <w:tcW w:type="dxa" w:w="1751"/>
+            <w:tcW w:type="dxa" w:w="1557"/>
             <w:tcBorders>
               <w:top w:val="single" w:color="BFC9D6" w:sz="4"/>
               <w:left w:val="single" w:color="BFC9D6" w:sz="4"/>
@@ -21467,13 +21467,13 @@
                 <w:szCs w:val="18"/>
                 <w:rtl/>
               </w:rPr>
-              <w:t xml:space="preserve">ترقيم بلا فجوات</w:t>
-            </w:r>
-          </w:p>
-        </w:tc>
-        <w:tc>
-          <w:tcPr>
-            <w:tcW w:type="dxa" w:w="3607"/>
+              <w:t xml:space="preserve">لا حذف متتالي على بيانات الائتمان والتدقيق وKYC</w:t>
+            </w:r>
+          </w:p>
+        </w:tc>
+        <w:tc>
+          <w:tcPr>
+            <w:tcW w:type="dxa" w:w="3207"/>
             <w:tcBorders>
               <w:top w:val="single" w:color="BFC9D6" w:sz="4"/>
               <w:left w:val="single" w:color="BFC9D6" w:sz="4"/>
@@ -21504,44 +21504,70 @@
                 <w:szCs w:val="18"/>
                 <w:rtl/>
               </w:rPr>
-              <w:t xml:space="preserve">رقم الطلب والبروفورما يؤخذ داخل معاملة الكتابة نفسها بقفل صف العدّاد (</w:t>
-            </w:r>
-            <w:r>
-              <w:rPr>
-                <w:rFonts w:ascii="Courier New" w:cs="Courier New" w:eastAsia="Courier New" w:hAnsi="Courier New"/>
-                <w:b w:val="false"/>
-                <w:bCs w:val="false"/>
-                <w:color w:val="1F2937"/>
-                <w:sz w:val="16"/>
-                <w:szCs w:val="16"/>
-                <w:shd w:fill="F1F3F5" w:color="auto" w:val="clear"/>
-                <w:rtl/>
-              </w:rPr>
-              <w:t xml:space="preserve">‎UPDLOCK, HOLDLOCK‎</w:t>
-            </w:r>
-            <w:r>
-              <w:rPr>
-                <w:rFonts w:ascii="Arial" w:cs="Arial" w:eastAsia="Arial" w:hAnsi="Arial"/>
-                <w:b w:val="false"/>
-                <w:bCs w:val="false"/>
-                <w:sz w:val="18"/>
-                <w:szCs w:val="18"/>
-                <w:rtl/>
-              </w:rPr>
-              <w:t xml:space="preserve">)، فالتراجع يعيد الرقم والطلب المتزامن ينتظر الالتزام؛ والملغى يبقى «ملغى» بسبب ولا يُعاد؛ وتعريفا </w:t>
-            </w:r>
-            <w:r>
-              <w:rPr>
-                <w:rFonts w:ascii="Courier New" w:cs="Courier New" w:eastAsia="Courier New" w:hAnsi="Courier New"/>
-                <w:b w:val="false"/>
-                <w:bCs w:val="false"/>
-                <w:color w:val="1F2937"/>
-                <w:sz w:val="16"/>
-                <w:szCs w:val="16"/>
-                <w:shd w:fill="F1F3F5" w:color="auto" w:val="clear"/>
-                <w:rtl/>
-              </w:rPr>
-              <w:t xml:space="preserve">‎req:&lt;TypeCode&gt;‎</w:t>
+              <w:t xml:space="preserve">حذف متتالي واحد فقط في القاعدة: شروط بند ملف الاكتمال مع بندها، والبنود لا تتغير إلا في نسخة مسودة (</w:t>
+            </w:r>
+            <w:r>
+              <w:rPr>
+                <w:rFonts w:ascii="Courier New" w:cs="Courier New" w:eastAsia="Courier New" w:hAnsi="Courier New"/>
+                <w:b w:val="false"/>
+                <w:bCs w:val="false"/>
+                <w:color w:val="1F2937"/>
+                <w:sz w:val="16"/>
+                <w:szCs w:val="16"/>
+                <w:shd w:fill="F1F3F5" w:color="auto" w:val="clear"/>
+                <w:rtl/>
+              </w:rPr>
+              <w:t xml:space="preserve">‎DRAFT‎</w:t>
+            </w:r>
+            <w:r>
+              <w:rPr>
+                <w:rFonts w:ascii="Arial" w:cs="Arial" w:eastAsia="Arial" w:hAnsi="Arial"/>
+                <w:b w:val="false"/>
+                <w:bCs w:val="false"/>
+                <w:sz w:val="18"/>
+                <w:szCs w:val="18"/>
+                <w:rtl/>
+              </w:rPr>
+              <w:t xml:space="preserve">)؛ والنسخة الفعّالة أو المسحوبة لا تعود مسودة (50033). القاعدة R11 ترفض أي حذف متتالي آخر في النموذج (O-13 في erd_open_items، ADR 0006)</w:t>
+            </w:r>
+          </w:p>
+        </w:tc>
+        <w:tc>
+          <w:tcPr>
+            <w:tcW w:type="dxa" w:w="5100"/>
+            <w:tcBorders>
+              <w:top w:val="single" w:color="BFC9D6" w:sz="4"/>
+              <w:left w:val="single" w:color="BFC9D6" w:sz="4"/>
+              <w:bottom w:val="single" w:color="BFC9D6" w:sz="4"/>
+              <w:right w:val="single" w:color="BFC9D6" w:sz="4"/>
+            </w:tcBorders>
+            <w:shd w:fill="F5F8FC" w:color="auto" w:val="clear"/>
+            <w:tcMar>
+              <w:top w:type="dxa" w:w="50"/>
+              <w:left w:type="dxa" w:w="90"/>
+              <w:bottom w:type="dxa" w:w="50"/>
+              <w:right w:type="dxa" w:w="90"/>
+            </w:tcMar>
+            <w:vAlign w:val="top"/>
+          </w:tcPr>
+          <w:p>
+            <w:pPr>
+              <w:keepNext w:val="false"/>
+              <w:bidi/>
+              <w:spacing w:after="30" w:before="30" w:line="264"/>
+            </w:pPr>
+            <w:r>
+              <w:rPr>
+                <w:rFonts w:ascii="Courier New" w:cs="Courier New" w:eastAsia="Courier New" w:hAnsi="Courier New"/>
+                <w:b w:val="false"/>
+                <w:bCs w:val="false"/>
+                <w:color w:val="1F2937"/>
+                <w:sz w:val="16"/>
+                <w:szCs w:val="16"/>
+                <w:shd w:fill="F1F3F5" w:color="auto" w:val="clear"/>
+                <w:rtl/>
+              </w:rPr>
+              <w:t xml:space="preserve">‎041_kyc_profile_versions.sql‎</w:t>
             </w:r>
             <w:r>
               <w:rPr>
@@ -21565,116 +21591,7 @@
                 <w:shd w:fill="F1F3F5" w:color="auto" w:val="clear"/>
                 <w:rtl/>
               </w:rPr>
-              <w:t xml:space="preserve">‎PROFORMA‎</w:t>
-            </w:r>
-            <w:r>
-              <w:rPr>
-                <w:rFonts w:ascii="Arial" w:cs="Arial" w:eastAsia="Arial" w:hAnsi="Arial"/>
-                <w:b w:val="false"/>
-                <w:bCs w:val="false"/>
-                <w:sz w:val="18"/>
-                <w:szCs w:val="18"/>
-                <w:rtl/>
-              </w:rPr>
-              <w:t xml:space="preserve"> لا يقبلان غير </w:t>
-            </w:r>
-            <w:r>
-              <w:rPr>
-                <w:rFonts w:ascii="Courier New" w:cs="Courier New" w:eastAsia="Courier New" w:hAnsi="Courier New"/>
-                <w:b w:val="false"/>
-                <w:bCs w:val="false"/>
-                <w:color w:val="1F2937"/>
-                <w:sz w:val="16"/>
-                <w:szCs w:val="16"/>
-                <w:shd w:fill="F1F3F5" w:color="auto" w:val="clear"/>
-                <w:rtl/>
-              </w:rPr>
-              <w:t xml:space="preserve">‎GAP_FREE‎</w:t>
-            </w:r>
-            <w:r>
-              <w:rPr>
-                <w:rFonts w:ascii="Arial" w:cs="Arial" w:eastAsia="Arial" w:hAnsi="Arial"/>
-                <w:b w:val="false"/>
-                <w:bCs w:val="false"/>
-                <w:sz w:val="18"/>
-                <w:szCs w:val="18"/>
-                <w:rtl/>
-              </w:rPr>
-              <w:t xml:space="preserve"> (O-12 في erd_open_items، Q-PLT-08)</w:t>
-            </w:r>
-          </w:p>
-        </w:tc>
-        <w:tc>
-          <w:tcPr>
-            <w:tcW w:type="dxa" w:w="4506"/>
-            <w:tcBorders>
-              <w:top w:val="single" w:color="BFC9D6" w:sz="4"/>
-              <w:left w:val="single" w:color="BFC9D6" w:sz="4"/>
-              <w:bottom w:val="single" w:color="BFC9D6" w:sz="4"/>
-              <w:right w:val="single" w:color="BFC9D6" w:sz="4"/>
-            </w:tcBorders>
-            <w:shd w:fill="F5F8FC" w:color="auto" w:val="clear"/>
-            <w:tcMar>
-              <w:top w:type="dxa" w:w="50"/>
-              <w:left w:type="dxa" w:w="90"/>
-              <w:bottom w:type="dxa" w:w="50"/>
-              <w:right w:type="dxa" w:w="90"/>
-            </w:tcMar>
-            <w:vAlign w:val="top"/>
-          </w:tcPr>
-          <w:p>
-            <w:pPr>
-              <w:keepNext w:val="false"/>
-              <w:bidi/>
-              <w:spacing w:after="30" w:before="30" w:line="264"/>
-            </w:pPr>
-            <w:r>
-              <w:rPr>
-                <w:rFonts w:ascii="Courier New" w:cs="Courier New" w:eastAsia="Courier New" w:hAnsi="Courier New"/>
-                <w:b w:val="false"/>
-                <w:bCs w:val="false"/>
-                <w:color w:val="1F2937"/>
-                <w:sz w:val="16"/>
-                <w:szCs w:val="16"/>
-                <w:shd w:fill="F1F3F5" w:color="auto" w:val="clear"/>
-                <w:rtl/>
-              </w:rPr>
-              <w:t xml:space="preserve">‎cfg.usp_AllocateNumber‎</w:t>
-            </w:r>
-            <w:r>
-              <w:rPr>
-                <w:rFonts w:ascii="Arial" w:cs="Arial" w:eastAsia="Arial" w:hAnsi="Arial"/>
-                <w:b w:val="false"/>
-                <w:bCs w:val="false"/>
-                <w:sz w:val="18"/>
-                <w:szCs w:val="18"/>
-                <w:rtl/>
-              </w:rPr>
-              <w:t xml:space="preserve"> و</w:t>
-            </w:r>
-            <w:r>
-              <w:rPr>
-                <w:rFonts w:ascii="Courier New" w:cs="Courier New" w:eastAsia="Courier New" w:hAnsi="Courier New"/>
-                <w:b w:val="false"/>
-                <w:bCs w:val="false"/>
-                <w:color w:val="1F2937"/>
-                <w:sz w:val="16"/>
-                <w:szCs w:val="16"/>
-                <w:shd w:fill="F1F3F5" w:color="auto" w:val="clear"/>
-                <w:rtl/>
-              </w:rPr>
-              <w:t xml:space="preserve">‎cfg.usp_VoidNumber‎</w:t>
-            </w:r>
-            <w:r>
-              <w:rPr>
-                <w:rFonts w:ascii="Arial" w:cs="Arial" w:eastAsia="Arial" w:hAnsi="Arial"/>
-                <w:b w:val="false"/>
-                <w:bCs w:val="false"/>
-                <w:sz w:val="18"/>
-                <w:szCs w:val="18"/>
-                <w:rtl/>
-              </w:rPr>
-              <w:t xml:space="preserve"> (039، ADR 0005)</w:t>
+              <w:t xml:space="preserve">‎check_grants.py‎</w:t>
             </w:r>
           </w:p>
         </w:tc>
@@ -21685,7 +21602,7 @@
         </w:trPr>
         <w:tc>
           <w:tcPr>
-            <w:tcW w:type="dxa" w:w="1751"/>
+            <w:tcW w:type="dxa" w:w="1557"/>
             <w:tcBorders>
               <w:top w:val="single" w:color="BFC9D6" w:sz="4"/>
               <w:left w:val="single" w:color="BFC9D6" w:sz="4"/>
@@ -21715,127 +21632,244 @@
                 <w:szCs w:val="18"/>
                 <w:rtl/>
               </w:rPr>
-              <w:t xml:space="preserve">منطق معقّد يبقى في التطبيق</w:t>
-            </w:r>
-            <w:r>
-              <w:rPr>
-                <w:rFonts w:ascii="Arial" w:cs="Arial" w:eastAsia="Arial" w:hAnsi="Arial"/>
-                <w:b w:val="false"/>
-                <w:bCs w:val="false"/>
-                <w:sz w:val="18"/>
-                <w:szCs w:val="18"/>
-                <w:rtl/>
-              </w:rPr>
-              <w:t xml:space="preserve"> (مذكور برمز </w:t>
-            </w:r>
-            <w:r>
-              <w:rPr>
-                <w:rFonts w:ascii="Courier New" w:cs="Courier New" w:eastAsia="Courier New" w:hAnsi="Courier New"/>
-                <w:b w:val="false"/>
-                <w:bCs w:val="false"/>
-                <w:color w:val="1F2937"/>
-                <w:sz w:val="16"/>
-                <w:szCs w:val="16"/>
-                <w:shd w:fill="F1F3F5" w:color="auto" w:val="clear"/>
-                <w:rtl/>
-              </w:rPr>
-              <w:t xml:space="preserve">‎BR-…‎</w:t>
-            </w:r>
-            <w:r>
-              <w:rPr>
-                <w:rFonts w:ascii="Arial" w:cs="Arial" w:eastAsia="Arial" w:hAnsi="Arial"/>
-                <w:b w:val="false"/>
-                <w:bCs w:val="false"/>
-                <w:sz w:val="18"/>
-                <w:szCs w:val="18"/>
-                <w:rtl/>
-              </w:rPr>
-              <w:t xml:space="preserve"> في تعليق العمود)</w:t>
-            </w:r>
-          </w:p>
-        </w:tc>
-        <w:tc>
-          <w:tcPr>
-            <w:tcW w:type="dxa" w:w="3607"/>
-            <w:tcBorders>
-              <w:top w:val="single" w:color="BFC9D6" w:sz="4"/>
-              <w:left w:val="single" w:color="BFC9D6" w:sz="4"/>
-              <w:bottom w:val="single" w:color="BFC9D6" w:sz="4"/>
-              <w:right w:val="single" w:color="BFC9D6" w:sz="4"/>
-            </w:tcBorders>
-            <w:tcMar>
-              <w:top w:type="dxa" w:w="50"/>
-              <w:left w:type="dxa" w:w="90"/>
-              <w:bottom w:type="dxa" w:w="50"/>
-              <w:right w:type="dxa" w:w="90"/>
-            </w:tcMar>
-            <w:vAlign w:val="top"/>
-          </w:tcPr>
-          <w:p>
-            <w:pPr>
-              <w:keepNext w:val="false"/>
-              <w:bidi/>
-              <w:spacing w:after="30" w:before="30" w:line="264"/>
-            </w:pPr>
-            <w:r>
-              <w:rPr>
-                <w:rFonts w:ascii="Arial" w:cs="Arial" w:eastAsia="Arial" w:hAnsi="Arial"/>
-                <w:b w:val="false"/>
-                <w:bCs w:val="false"/>
-                <w:sz w:val="18"/>
-                <w:szCs w:val="18"/>
-                <w:rtl/>
-              </w:rPr>
-              <w:t xml:space="preserve">عمق شجرة الحدود ≤ 6 وبلا حلقات · سقف الابن ≤ الأب · حساب المتاح </w:t>
-            </w:r>
-            <w:r>
-              <w:rPr>
-                <w:rFonts w:ascii="Courier New" w:cs="Courier New" w:eastAsia="Courier New" w:hAnsi="Courier New"/>
-                <w:b w:val="false"/>
-                <w:bCs w:val="false"/>
-                <w:color w:val="1F2937"/>
-                <w:sz w:val="16"/>
-                <w:szCs w:val="16"/>
-                <w:shd w:fill="F1F3F5" w:color="auto" w:val="clear"/>
-                <w:rtl/>
-              </w:rPr>
-              <w:t xml:space="preserve">‎Available‎</w:t>
-            </w:r>
-            <w:r>
-              <w:rPr>
-                <w:rFonts w:ascii="Arial" w:cs="Arial" w:eastAsia="Arial" w:hAnsi="Arial"/>
-                <w:b w:val="false"/>
-                <w:bCs w:val="false"/>
-                <w:sz w:val="18"/>
-                <w:szCs w:val="18"/>
-                <w:rtl/>
-              </w:rPr>
-              <w:t xml:space="preserve"> · إعادة حساب </w:t>
-            </w:r>
-            <w:r>
-              <w:rPr>
-                <w:rFonts w:ascii="Courier New" w:cs="Courier New" w:eastAsia="Courier New" w:hAnsi="Courier New"/>
-                <w:b w:val="false"/>
-                <w:bCs w:val="false"/>
-                <w:color w:val="1F2937"/>
-                <w:sz w:val="16"/>
-                <w:szCs w:val="16"/>
-                <w:shd w:fill="F1F3F5" w:color="auto" w:val="clear"/>
-                <w:rtl/>
-              </w:rPr>
-              <w:t xml:space="preserve">‎EffectiveAmount‎</w:t>
-            </w:r>
-            <w:r>
-              <w:rPr>
-                <w:rFonts w:ascii="Arial" w:cs="Arial" w:eastAsia="Arial" w:hAnsi="Arial"/>
-                <w:b w:val="false"/>
-                <w:bCs w:val="false"/>
-                <w:sz w:val="18"/>
-                <w:szCs w:val="18"/>
-                <w:rtl/>
-              </w:rPr>
-              <w:t xml:space="preserve"> · صلاحيات التفويض · فحص التعارض بين المفوّضين · </w:t>
-            </w:r>
+              <w:t xml:space="preserve">ترقيم بلا فجوات</w:t>
+            </w:r>
+          </w:p>
+        </w:tc>
+        <w:tc>
+          <w:tcPr>
+            <w:tcW w:type="dxa" w:w="3207"/>
+            <w:tcBorders>
+              <w:top w:val="single" w:color="BFC9D6" w:sz="4"/>
+              <w:left w:val="single" w:color="BFC9D6" w:sz="4"/>
+              <w:bottom w:val="single" w:color="BFC9D6" w:sz="4"/>
+              <w:right w:val="single" w:color="BFC9D6" w:sz="4"/>
+            </w:tcBorders>
+            <w:tcMar>
+              <w:top w:type="dxa" w:w="50"/>
+              <w:left w:type="dxa" w:w="90"/>
+              <w:bottom w:type="dxa" w:w="50"/>
+              <w:right w:type="dxa" w:w="90"/>
+            </w:tcMar>
+            <w:vAlign w:val="top"/>
+          </w:tcPr>
+          <w:p>
+            <w:pPr>
+              <w:keepNext w:val="false"/>
+              <w:bidi/>
+              <w:spacing w:after="30" w:before="30" w:line="264"/>
+            </w:pPr>
+            <w:r>
+              <w:rPr>
+                <w:rFonts w:ascii="Arial" w:cs="Arial" w:eastAsia="Arial" w:hAnsi="Arial"/>
+                <w:b w:val="false"/>
+                <w:bCs w:val="false"/>
+                <w:sz w:val="18"/>
+                <w:szCs w:val="18"/>
+                <w:rtl/>
+              </w:rPr>
+              <w:t xml:space="preserve">رقم الطلب والبروفورما يؤخذ داخل معاملة الكتابة نفسها بقفل صف العدّاد (</w:t>
+            </w:r>
+            <w:r>
+              <w:rPr>
+                <w:rFonts w:ascii="Courier New" w:cs="Courier New" w:eastAsia="Courier New" w:hAnsi="Courier New"/>
+                <w:b w:val="false"/>
+                <w:bCs w:val="false"/>
+                <w:color w:val="1F2937"/>
+                <w:sz w:val="16"/>
+                <w:szCs w:val="16"/>
+                <w:shd w:fill="F1F3F5" w:color="auto" w:val="clear"/>
+                <w:rtl/>
+              </w:rPr>
+              <w:t xml:space="preserve">‎UPDLOCK, HOLDLOCK‎</w:t>
+            </w:r>
+            <w:r>
+              <w:rPr>
+                <w:rFonts w:ascii="Arial" w:cs="Arial" w:eastAsia="Arial" w:hAnsi="Arial"/>
+                <w:b w:val="false"/>
+                <w:bCs w:val="false"/>
+                <w:sz w:val="18"/>
+                <w:szCs w:val="18"/>
+                <w:rtl/>
+              </w:rPr>
+              <w:t xml:space="preserve">)، فالتراجع يعيد الرقم والطلب المتزامن ينتظر الالتزام؛ والملغى يبقى «ملغى» بسبب ولا يُعاد؛ وتعريفا </w:t>
+            </w:r>
+            <w:r>
+              <w:rPr>
+                <w:rFonts w:ascii="Courier New" w:cs="Courier New" w:eastAsia="Courier New" w:hAnsi="Courier New"/>
+                <w:b w:val="false"/>
+                <w:bCs w:val="false"/>
+                <w:color w:val="1F2937"/>
+                <w:sz w:val="16"/>
+                <w:szCs w:val="16"/>
+                <w:shd w:fill="F1F3F5" w:color="auto" w:val="clear"/>
+                <w:rtl/>
+              </w:rPr>
+              <w:t xml:space="preserve">‎req:&lt;TypeCode&gt;‎</w:t>
+            </w:r>
+            <w:r>
+              <w:rPr>
+                <w:rFonts w:ascii="Arial" w:cs="Arial" w:eastAsia="Arial" w:hAnsi="Arial"/>
+                <w:b w:val="false"/>
+                <w:bCs w:val="false"/>
+                <w:sz w:val="18"/>
+                <w:szCs w:val="18"/>
+                <w:rtl/>
+              </w:rPr>
+              <w:t xml:space="preserve"> و</w:t>
+            </w:r>
+            <w:r>
+              <w:rPr>
+                <w:rFonts w:ascii="Courier New" w:cs="Courier New" w:eastAsia="Courier New" w:hAnsi="Courier New"/>
+                <w:b w:val="false"/>
+                <w:bCs w:val="false"/>
+                <w:color w:val="1F2937"/>
+                <w:sz w:val="16"/>
+                <w:szCs w:val="16"/>
+                <w:shd w:fill="F1F3F5" w:color="auto" w:val="clear"/>
+                <w:rtl/>
+              </w:rPr>
+              <w:t xml:space="preserve">‎PROFORMA‎</w:t>
+            </w:r>
+            <w:r>
+              <w:rPr>
+                <w:rFonts w:ascii="Arial" w:cs="Arial" w:eastAsia="Arial" w:hAnsi="Arial"/>
+                <w:b w:val="false"/>
+                <w:bCs w:val="false"/>
+                <w:sz w:val="18"/>
+                <w:szCs w:val="18"/>
+                <w:rtl/>
+              </w:rPr>
+              <w:t xml:space="preserve"> لا يقبلان غير </w:t>
+            </w:r>
+            <w:r>
+              <w:rPr>
+                <w:rFonts w:ascii="Courier New" w:cs="Courier New" w:eastAsia="Courier New" w:hAnsi="Courier New"/>
+                <w:b w:val="false"/>
+                <w:bCs w:val="false"/>
+                <w:color w:val="1F2937"/>
+                <w:sz w:val="16"/>
+                <w:szCs w:val="16"/>
+                <w:shd w:fill="F1F3F5" w:color="auto" w:val="clear"/>
+                <w:rtl/>
+              </w:rPr>
+              <w:t xml:space="preserve">‎GAP_FREE‎</w:t>
+            </w:r>
+            <w:r>
+              <w:rPr>
+                <w:rFonts w:ascii="Arial" w:cs="Arial" w:eastAsia="Arial" w:hAnsi="Arial"/>
+                <w:b w:val="false"/>
+                <w:bCs w:val="false"/>
+                <w:sz w:val="18"/>
+                <w:szCs w:val="18"/>
+                <w:rtl/>
+              </w:rPr>
+              <w:t xml:space="preserve"> (O-12 في erd_open_items، Q-PLT-08)</w:t>
+            </w:r>
+          </w:p>
+        </w:tc>
+        <w:tc>
+          <w:tcPr>
+            <w:tcW w:type="dxa" w:w="5100"/>
+            <w:tcBorders>
+              <w:top w:val="single" w:color="BFC9D6" w:sz="4"/>
+              <w:left w:val="single" w:color="BFC9D6" w:sz="4"/>
+              <w:bottom w:val="single" w:color="BFC9D6" w:sz="4"/>
+              <w:right w:val="single" w:color="BFC9D6" w:sz="4"/>
+            </w:tcBorders>
+            <w:tcMar>
+              <w:top w:type="dxa" w:w="50"/>
+              <w:left w:type="dxa" w:w="90"/>
+              <w:bottom w:type="dxa" w:w="50"/>
+              <w:right w:type="dxa" w:w="90"/>
+            </w:tcMar>
+            <w:vAlign w:val="top"/>
+          </w:tcPr>
+          <w:p>
+            <w:pPr>
+              <w:keepNext w:val="false"/>
+              <w:bidi/>
+              <w:spacing w:after="30" w:before="30" w:line="264"/>
+            </w:pPr>
+            <w:r>
+              <w:rPr>
+                <w:rFonts w:ascii="Courier New" w:cs="Courier New" w:eastAsia="Courier New" w:hAnsi="Courier New"/>
+                <w:b w:val="false"/>
+                <w:bCs w:val="false"/>
+                <w:color w:val="1F2937"/>
+                <w:sz w:val="16"/>
+                <w:szCs w:val="16"/>
+                <w:shd w:fill="F1F3F5" w:color="auto" w:val="clear"/>
+                <w:rtl/>
+              </w:rPr>
+              <w:t xml:space="preserve">‎cfg.usp_AllocateNumber‎</w:t>
+            </w:r>
+            <w:r>
+              <w:rPr>
+                <w:rFonts w:ascii="Arial" w:cs="Arial" w:eastAsia="Arial" w:hAnsi="Arial"/>
+                <w:b w:val="false"/>
+                <w:bCs w:val="false"/>
+                <w:sz w:val="18"/>
+                <w:szCs w:val="18"/>
+                <w:rtl/>
+              </w:rPr>
+              <w:t xml:space="preserve"> و</w:t>
+            </w:r>
+            <w:r>
+              <w:rPr>
+                <w:rFonts w:ascii="Courier New" w:cs="Courier New" w:eastAsia="Courier New" w:hAnsi="Courier New"/>
+                <w:b w:val="false"/>
+                <w:bCs w:val="false"/>
+                <w:color w:val="1F2937"/>
+                <w:sz w:val="16"/>
+                <w:szCs w:val="16"/>
+                <w:shd w:fill="F1F3F5" w:color="auto" w:val="clear"/>
+                <w:rtl/>
+              </w:rPr>
+              <w:t xml:space="preserve">‎cfg.usp_VoidNumber‎</w:t>
+            </w:r>
+            <w:r>
+              <w:rPr>
+                <w:rFonts w:ascii="Arial" w:cs="Arial" w:eastAsia="Arial" w:hAnsi="Arial"/>
+                <w:b w:val="false"/>
+                <w:bCs w:val="false"/>
+                <w:sz w:val="18"/>
+                <w:szCs w:val="18"/>
+                <w:rtl/>
+              </w:rPr>
+              <w:t xml:space="preserve"> (039، ADR 0005)</w:t>
+            </w:r>
+          </w:p>
+        </w:tc>
+      </w:tr>
+      <w:tr>
+        <w:trPr>
+          <w:cantSplit/>
+        </w:trPr>
+        <w:tc>
+          <w:tcPr>
+            <w:tcW w:type="dxa" w:w="1557"/>
+            <w:tcBorders>
+              <w:top w:val="single" w:color="BFC9D6" w:sz="4"/>
+              <w:left w:val="single" w:color="BFC9D6" w:sz="4"/>
+              <w:bottom w:val="single" w:color="BFC9D6" w:sz="4"/>
+              <w:right w:val="single" w:color="BFC9D6" w:sz="4"/>
+            </w:tcBorders>
+            <w:shd w:fill="F5F8FC" w:color="auto" w:val="clear"/>
+            <w:tcMar>
+              <w:top w:type="dxa" w:w="50"/>
+              <w:left w:type="dxa" w:w="90"/>
+              <w:bottom w:type="dxa" w:w="50"/>
+              <w:right w:type="dxa" w:w="90"/>
+            </w:tcMar>
+            <w:vAlign w:val="top"/>
+          </w:tcPr>
+          <w:p>
+            <w:pPr>
+              <w:keepNext w:val="false"/>
+              <w:bidi/>
+              <w:spacing w:after="30" w:before="30" w:line="264"/>
+            </w:pPr>
             <w:r>
               <w:rPr>
                 <w:rFonts w:ascii="Arial" w:cs="Arial" w:eastAsia="Arial" w:hAnsi="Arial"/>
@@ -21845,6 +21879,137 @@
                 <w:szCs w:val="18"/>
                 <w:rtl/>
               </w:rPr>
+              <w:t xml:space="preserve">منطق معقّد يبقى في التطبيق</w:t>
+            </w:r>
+            <w:r>
+              <w:rPr>
+                <w:rFonts w:ascii="Arial" w:cs="Arial" w:eastAsia="Arial" w:hAnsi="Arial"/>
+                <w:b w:val="false"/>
+                <w:bCs w:val="false"/>
+                <w:sz w:val="18"/>
+                <w:szCs w:val="18"/>
+                <w:rtl/>
+              </w:rPr>
+              <w:t xml:space="preserve"> (مذكور برمز </w:t>
+            </w:r>
+            <w:r>
+              <w:rPr>
+                <w:rFonts w:ascii="Courier New" w:cs="Courier New" w:eastAsia="Courier New" w:hAnsi="Courier New"/>
+                <w:b w:val="false"/>
+                <w:bCs w:val="false"/>
+                <w:color w:val="1F2937"/>
+                <w:sz w:val="16"/>
+                <w:szCs w:val="16"/>
+                <w:shd w:fill="F1F3F5" w:color="auto" w:val="clear"/>
+                <w:rtl/>
+              </w:rPr>
+              <w:t xml:space="preserve">‎BR-…‎</w:t>
+            </w:r>
+            <w:r>
+              <w:rPr>
+                <w:rFonts w:ascii="Arial" w:cs="Arial" w:eastAsia="Arial" w:hAnsi="Arial"/>
+                <w:b w:val="false"/>
+                <w:bCs w:val="false"/>
+                <w:sz w:val="18"/>
+                <w:szCs w:val="18"/>
+                <w:rtl/>
+              </w:rPr>
+              <w:t xml:space="preserve"> في تعليق العمود)</w:t>
+            </w:r>
+          </w:p>
+        </w:tc>
+        <w:tc>
+          <w:tcPr>
+            <w:tcW w:type="dxa" w:w="3207"/>
+            <w:tcBorders>
+              <w:top w:val="single" w:color="BFC9D6" w:sz="4"/>
+              <w:left w:val="single" w:color="BFC9D6" w:sz="4"/>
+              <w:bottom w:val="single" w:color="BFC9D6" w:sz="4"/>
+              <w:right w:val="single" w:color="BFC9D6" w:sz="4"/>
+            </w:tcBorders>
+            <w:shd w:fill="F5F8FC" w:color="auto" w:val="clear"/>
+            <w:tcMar>
+              <w:top w:type="dxa" w:w="50"/>
+              <w:left w:type="dxa" w:w="90"/>
+              <w:bottom w:type="dxa" w:w="50"/>
+              <w:right w:type="dxa" w:w="90"/>
+            </w:tcMar>
+            <w:vAlign w:val="top"/>
+          </w:tcPr>
+          <w:p>
+            <w:pPr>
+              <w:keepNext w:val="false"/>
+              <w:bidi/>
+              <w:spacing w:after="30" w:before="30" w:line="264"/>
+            </w:pPr>
+            <w:r>
+              <w:rPr>
+                <w:rFonts w:ascii="Arial" w:cs="Arial" w:eastAsia="Arial" w:hAnsi="Arial"/>
+                <w:b w:val="false"/>
+                <w:bCs w:val="false"/>
+                <w:sz w:val="18"/>
+                <w:szCs w:val="18"/>
+                <w:rtl/>
+              </w:rPr>
+              <w:t xml:space="preserve">عمق شجرة الحدود ≤ 6 وبلا حلقات · سقف الابن ≤ الأب · حساب المتاح </w:t>
+            </w:r>
+            <w:r>
+              <w:rPr>
+                <w:rFonts w:ascii="Courier New" w:cs="Courier New" w:eastAsia="Courier New" w:hAnsi="Courier New"/>
+                <w:b w:val="false"/>
+                <w:bCs w:val="false"/>
+                <w:color w:val="1F2937"/>
+                <w:sz w:val="16"/>
+                <w:szCs w:val="16"/>
+                <w:shd w:fill="F1F3F5" w:color="auto" w:val="clear"/>
+                <w:rtl/>
+              </w:rPr>
+              <w:t xml:space="preserve">‎Available‎</w:t>
+            </w:r>
+            <w:r>
+              <w:rPr>
+                <w:rFonts w:ascii="Arial" w:cs="Arial" w:eastAsia="Arial" w:hAnsi="Arial"/>
+                <w:b w:val="false"/>
+                <w:bCs w:val="false"/>
+                <w:sz w:val="18"/>
+                <w:szCs w:val="18"/>
+                <w:rtl/>
+              </w:rPr>
+              <w:t xml:space="preserve"> · إعادة حساب </w:t>
+            </w:r>
+            <w:r>
+              <w:rPr>
+                <w:rFonts w:ascii="Courier New" w:cs="Courier New" w:eastAsia="Courier New" w:hAnsi="Courier New"/>
+                <w:b w:val="false"/>
+                <w:bCs w:val="false"/>
+                <w:color w:val="1F2937"/>
+                <w:sz w:val="16"/>
+                <w:szCs w:val="16"/>
+                <w:shd w:fill="F1F3F5" w:color="auto" w:val="clear"/>
+                <w:rtl/>
+              </w:rPr>
+              <w:t xml:space="preserve">‎EffectiveAmount‎</w:t>
+            </w:r>
+            <w:r>
+              <w:rPr>
+                <w:rFonts w:ascii="Arial" w:cs="Arial" w:eastAsia="Arial" w:hAnsi="Arial"/>
+                <w:b w:val="false"/>
+                <w:bCs w:val="false"/>
+                <w:sz w:val="18"/>
+                <w:szCs w:val="18"/>
+                <w:rtl/>
+              </w:rPr>
+              <w:t xml:space="preserve"> · صلاحيات التفويض · فحص التعارض بين المفوّضين · </w:t>
+            </w:r>
+            <w:r>
+              <w:rPr>
+                <w:rFonts w:ascii="Arial" w:cs="Arial" w:eastAsia="Arial" w:hAnsi="Arial"/>
+                <w:b/>
+                <w:bCs/>
+                <w:sz w:val="18"/>
+                <w:szCs w:val="18"/>
+                <w:rtl/>
+              </w:rPr>
               <w:t xml:space="preserve">معاملة الحجز</w:t>
             </w:r>
             <w:r>
@@ -21862,13 +22027,14 @@
         </w:tc>
         <w:tc>
           <w:tcPr>
-            <w:tcW w:type="dxa" w:w="4506"/>
-            <w:tcBorders>
-              <w:top w:val="single" w:color="BFC9D6" w:sz="4"/>
-              <w:left w:val="single" w:color="BFC9D6" w:sz="4"/>
-              <w:bottom w:val="single" w:color="BFC9D6" w:sz="4"/>
-              <w:right w:val="single" w:color="BFC9D6" w:sz="4"/>
-            </w:tcBorders>
+            <w:tcW w:type="dxa" w:w="5100"/>
+            <w:tcBorders>
+              <w:top w:val="single" w:color="BFC9D6" w:sz="4"/>
+              <w:left w:val="single" w:color="BFC9D6" w:sz="4"/>
+              <w:bottom w:val="single" w:color="BFC9D6" w:sz="4"/>
+              <w:right w:val="single" w:color="BFC9D6" w:sz="4"/>
+            </w:tcBorders>
+            <w:shd w:fill="F5F8FC" w:color="auto" w:val="clear"/>
             <w:tcMar>
               <w:top w:type="dxa" w:w="50"/>
               <w:left w:type="dxa" w:w="90"/>
@@ -27215,6 +27381,87 @@
     </w:p>
     <w:p>
       <w:pPr>
+        <w:pStyle w:val="ListParagraph"/>
+        <w:numPr>
+          <w:ilvl w:val="0"/>
+          <w:numId w:val="3"/>
+        </w:numPr>
+        <w:bidi/>
+        <w:spacing w:after="70" w:before="0" w:line="300"/>
+      </w:pPr>
+      <w:r>
+        <w:rPr>
+          <w:rFonts w:ascii="Arial" w:cs="Arial" w:eastAsia="Arial" w:hAnsi="Arial"/>
+          <w:b/>
+          <w:bCs/>
+          <w:sz w:val="21"/>
+          <w:szCs w:val="21"/>
+          <w:rtl/>
+        </w:rPr>
+        <w:t xml:space="preserve">R11</w:t>
+      </w:r>
+      <w:r>
+        <w:rPr>
+          <w:rFonts w:ascii="Arial" w:cs="Arial" w:eastAsia="Arial" w:hAnsi="Arial"/>
+          <w:b w:val="false"/>
+          <w:bCs w:val="false"/>
+          <w:sz w:val="21"/>
+          <w:szCs w:val="21"/>
+          <w:rtl/>
+        </w:rPr>
+        <w:t xml:space="preserve"> لا حذف متتالي (</w:t>
+      </w:r>
+      <w:r>
+        <w:rPr>
+          <w:rFonts w:ascii="Courier New" w:cs="Courier New" w:eastAsia="Courier New" w:hAnsi="Courier New"/>
+          <w:b w:val="false"/>
+          <w:bCs w:val="false"/>
+          <w:color w:val="1F2937"/>
+          <w:sz w:val="18"/>
+          <w:szCs w:val="18"/>
+          <w:shd w:fill="F1F3F5" w:color="auto" w:val="clear"/>
+          <w:rtl/>
+        </w:rPr>
+        <w:t xml:space="preserve">‎cascade‎</w:t>
+      </w:r>
+      <w:r>
+        <w:rPr>
+          <w:rFonts w:ascii="Arial" w:cs="Arial" w:eastAsia="Arial" w:hAnsi="Arial"/>
+          <w:b w:val="false"/>
+          <w:bCs w:val="false"/>
+          <w:sz w:val="21"/>
+          <w:szCs w:val="21"/>
+          <w:rtl/>
+        </w:rPr>
+        <w:t xml:space="preserve">) في النموذج إلا على الروابط المسموحة في </w:t>
+      </w:r>
+      <w:r>
+        <w:rPr>
+          <w:rFonts w:ascii="Courier New" w:cs="Courier New" w:eastAsia="Courier New" w:hAnsi="Courier New"/>
+          <w:b w:val="false"/>
+          <w:bCs w:val="false"/>
+          <w:color w:val="1F2937"/>
+          <w:sz w:val="18"/>
+          <w:szCs w:val="18"/>
+          <w:shd w:fill="F1F3F5" w:color="auto" w:val="clear"/>
+          <w:rtl/>
+        </w:rPr>
+        <w:t xml:space="preserve">‎CASCADE_ALLOWED‎</w:t>
+      </w:r>
+      <w:r>
+        <w:rPr>
+          <w:rFonts w:ascii="Arial" w:cs="Arial" w:eastAsia="Arial" w:hAnsi="Arial"/>
+          <w:b w:val="false"/>
+          <w:bCs w:val="false"/>
+          <w:sz w:val="21"/>
+          <w:szCs w:val="21"/>
+          <w:rtl/>
+        </w:rPr>
+        <w:t xml:space="preserve">، وهي اليوم شروط بند ملف الاكتمال وحدها (O-13، ADR 0006).</w:t>
+      </w:r>
+    </w:p>
+    <w:p>
+      <w:pPr>
         <w:bidi/>
         <w:spacing w:after="60" w:before="0"/>
       </w:pPr>
@@ -38533,7 +38780,31 @@
           <w:szCs w:val="21"/>
           <w:rtl/>
         </w:rPr>
-        <w:t xml:space="preserve"> (الترقيم، ADR 0005)</w:t>
+        <w:t xml:space="preserve"> (الترقيم، ADR 0005) → </w:t>
+      </w:r>
+      <w:r>
+        <w:rPr>
+          <w:rFonts w:ascii="Courier New" w:cs="Courier New" w:eastAsia="Courier New" w:hAnsi="Courier New"/>
+          <w:b w:val="false"/>
+          <w:bCs w:val="false"/>
+          <w:color w:val="1F2937"/>
+          <w:sz w:val="18"/>
+          <w:szCs w:val="18"/>
+          <w:shd w:fill="F1F3F5" w:color="auto" w:val="clear"/>
+          <w:rtl/>
+        </w:rPr>
+        <w:t xml:space="preserve">‎041_kyc_profile_versions‎</w:t>
+      </w:r>
+      <w:r>
+        <w:rPr>
+          <w:rFonts w:ascii="Arial" w:cs="Arial" w:eastAsia="Arial" w:hAnsi="Arial"/>
+          <w:b w:val="false"/>
+          <w:bCs w:val="false"/>
+          <w:sz w:val="21"/>
+          <w:szCs w:val="21"/>
+          <w:rtl/>
+        </w:rPr>
+        <w:t xml:space="preserve"> (نسخ ملفات الاكتمال، ADR 0006)</w:t>
       </w:r>
     </w:p>
     <w:p>
@@ -38662,7 +38933,31 @@
           <w:szCs w:val="21"/>
           <w:rtl/>
         </w:rPr>
-        <w:t xml:space="preserve"> (الصلاحيات)؛ إدراج فقط، وتعيد الخطوة 4b في CI تشغيلها وتشترط ألا يتغير شيء</w:t>
+        <w:t xml:space="preserve"> (الصلاحيات) → </w:t>
+      </w:r>
+      <w:r>
+        <w:rPr>
+          <w:rFonts w:ascii="Courier New" w:cs="Courier New" w:eastAsia="Courier New" w:hAnsi="Courier New"/>
+          <w:b w:val="false"/>
+          <w:bCs w:val="false"/>
+          <w:color w:val="1F2937"/>
+          <w:sz w:val="18"/>
+          <w:szCs w:val="18"/>
+          <w:shd w:fill="F1F3F5" w:color="auto" w:val="clear"/>
+          <w:rtl/>
+        </w:rPr>
+        <w:t xml:space="preserve">‎seed/103_lc_reference‎</w:t>
+      </w:r>
+      <w:r>
+        <w:rPr>
+          <w:rFonts w:ascii="Arial" w:cs="Arial" w:eastAsia="Arial" w:hAnsi="Arial"/>
+          <w:b w:val="false"/>
+          <w:bCs w:val="false"/>
+          <w:sz w:val="21"/>
+          <w:szCs w:val="21"/>
+          <w:rtl/>
+        </w:rPr>
+        <w:t xml:space="preserve"> (Incoterms ومواد UCP 600)؛ إدراج فقط، وتعيد الخطوة 4b في CI تشغيلها وتشترط ألا يتغير شيء</w:t>
       </w:r>
     </w:p>
     <w:p>
@@ -39373,7 +39668,7 @@
           <w:szCs w:val="32"/>
           <w:rtl/>
         </w:rPr>
-        <w:t xml:space="preserve">13. البذور وتهيئة المشترك (منفّذ جزئيًا)</w:t>
+        <w:t xml:space="preserve">13. البذور وتهيئة المشترك</w:t>
       </w:r>
       <w:bookmarkEnd w:id="54"/>
     </w:p>
@@ -39720,31 +40015,44 @@
                 <w:szCs w:val="18"/>
                 <w:rtl/>
               </w:rPr>
-              <w:t xml:space="preserve">، أنواع الأحداث </w:t>
-            </w:r>
-            <w:r>
-              <w:rPr>
-                <w:rFonts w:ascii="Courier New" w:cs="Courier New" w:eastAsia="Courier New" w:hAnsi="Courier New"/>
-                <w:b w:val="false"/>
-                <w:bCs w:val="false"/>
-                <w:color w:val="1F2937"/>
-                <w:sz w:val="16"/>
-                <w:szCs w:val="16"/>
-                <w:shd w:fill="F1F3F5" w:color="auto" w:val="clear"/>
-                <w:rtl/>
-              </w:rPr>
-              <w:t xml:space="preserve">‎ntf.NotificationEventType‎</w:t>
-            </w:r>
-            <w:r>
-              <w:rPr>
-                <w:rFonts w:ascii="Arial" w:cs="Arial" w:eastAsia="Arial" w:hAnsi="Arial"/>
-                <w:b w:val="false"/>
-                <w:bCs w:val="false"/>
-                <w:sz w:val="18"/>
-                <w:szCs w:val="18"/>
-                <w:rtl/>
-              </w:rPr>
-              <w:t xml:space="preserve">، تعريفات حقول الاعتماد</w:t>
+              <w:t xml:space="preserve">، </w:t>
+            </w:r>
+            <w:r>
+              <w:rPr>
+                <w:rFonts w:ascii="Courier New" w:cs="Courier New" w:eastAsia="Courier New" w:hAnsi="Courier New"/>
+                <w:b w:val="false"/>
+                <w:bCs w:val="false"/>
+                <w:color w:val="1F2937"/>
+                <w:sz w:val="16"/>
+                <w:szCs w:val="16"/>
+                <w:shd w:fill="F1F3F5" w:color="auto" w:val="clear"/>
+                <w:rtl/>
+              </w:rPr>
+              <w:t xml:space="preserve">‎cfg.JobDefinition‎</w:t>
+            </w:r>
+            <w:r>
+              <w:rPr>
+                <w:rFonts w:ascii="Arial" w:cs="Arial" w:eastAsia="Arial" w:hAnsi="Arial"/>
+                <w:b w:val="false"/>
+                <w:bCs w:val="false"/>
+                <w:sz w:val="18"/>
+                <w:szCs w:val="18"/>
+                <w:rtl/>
+              </w:rPr>
+              <w:t xml:space="preserve">، </w:t>
+            </w:r>
+            <w:r>
+              <w:rPr>
+                <w:rFonts w:ascii="Courier New" w:cs="Courier New" w:eastAsia="Courier New" w:hAnsi="Courier New"/>
+                <w:b w:val="false"/>
+                <w:bCs w:val="false"/>
+                <w:color w:val="1F2937"/>
+                <w:sz w:val="16"/>
+                <w:szCs w:val="16"/>
+                <w:shd w:fill="F1F3F5" w:color="auto" w:val="clear"/>
+                <w:rtl/>
+              </w:rPr>
+              <w:t xml:space="preserve">‎plat.ReservedSubdomain‎</w:t>
             </w:r>
           </w:p>
         </w:tc>
@@ -39780,55 +40088,55 @@
                 <w:szCs w:val="18"/>
                 <w:rtl/>
               </w:rPr>
-              <w:t xml:space="preserve">سكربت بذور عالمي عند النشر بمفتاح </w:t>
-            </w:r>
-            <w:r>
-              <w:rPr>
-                <w:rFonts w:ascii="Courier New" w:cs="Courier New" w:eastAsia="Courier New" w:hAnsi="Courier New"/>
-                <w:b w:val="false"/>
-                <w:bCs w:val="false"/>
-                <w:color w:val="1F2937"/>
-                <w:sz w:val="16"/>
-                <w:szCs w:val="16"/>
-                <w:shd w:fill="F1F3F5" w:color="auto" w:val="clear"/>
-                <w:rtl/>
-              </w:rPr>
-              <w:t xml:space="preserve">‎SeedKey‎</w:t>
-            </w:r>
-            <w:r>
-              <w:rPr>
-                <w:rFonts w:ascii="Arial" w:cs="Arial" w:eastAsia="Arial" w:hAnsi="Arial"/>
-                <w:b w:val="false"/>
-                <w:bCs w:val="false"/>
-                <w:sz w:val="18"/>
-                <w:szCs w:val="18"/>
-                <w:rtl/>
-              </w:rPr>
-              <w:t xml:space="preserve">؛ </w:t>
-            </w:r>
-            <w:r>
-              <w:rPr>
-                <w:rFonts w:ascii="Courier New" w:cs="Courier New" w:eastAsia="Courier New" w:hAnsi="Courier New"/>
-                <w:b w:val="false"/>
-                <w:bCs w:val="false"/>
-                <w:color w:val="1F2937"/>
-                <w:sz w:val="16"/>
-                <w:szCs w:val="16"/>
-                <w:shd w:fill="F1F3F5" w:color="auto" w:val="clear"/>
-                <w:rtl/>
-              </w:rPr>
-              <w:t xml:space="preserve">‎cfg.SeedRun‎</w:t>
-            </w:r>
-            <w:r>
-              <w:rPr>
-                <w:rFonts w:ascii="Arial" w:cs="Arial" w:eastAsia="Arial" w:hAnsi="Arial"/>
-                <w:b w:val="false"/>
-                <w:bCs w:val="false"/>
-                <w:sz w:val="18"/>
-                <w:szCs w:val="18"/>
-                <w:rtl/>
-              </w:rPr>
-              <w:t xml:space="preserve"> يسجل التنفيذ. هذه الجداول </w:t>
+              <w:t xml:space="preserve">سكربتات بذور عند النشر (</w:t>
+            </w:r>
+            <w:r>
+              <w:rPr>
+                <w:rFonts w:ascii="Courier New" w:cs="Courier New" w:eastAsia="Courier New" w:hAnsi="Courier New"/>
+                <w:b w:val="false"/>
+                <w:bCs w:val="false"/>
+                <w:color w:val="1F2937"/>
+                <w:sz w:val="16"/>
+                <w:szCs w:val="16"/>
+                <w:shd w:fill="F1F3F5" w:color="auto" w:val="clear"/>
+                <w:rtl/>
+              </w:rPr>
+              <w:t xml:space="preserve">‎db/seed/100‎</w:t>
+            </w:r>
+            <w:r>
+              <w:rPr>
+                <w:rFonts w:ascii="Arial" w:cs="Arial" w:eastAsia="Arial" w:hAnsi="Arial"/>
+                <w:b w:val="false"/>
+                <w:bCs w:val="false"/>
+                <w:sz w:val="18"/>
+                <w:szCs w:val="18"/>
+                <w:rtl/>
+              </w:rPr>
+              <w:t xml:space="preserve"> إلى </w:t>
+            </w:r>
+            <w:r>
+              <w:rPr>
+                <w:rFonts w:ascii="Courier New" w:cs="Courier New" w:eastAsia="Courier New" w:hAnsi="Courier New"/>
+                <w:b w:val="false"/>
+                <w:bCs w:val="false"/>
+                <w:color w:val="1F2937"/>
+                <w:sz w:val="16"/>
+                <w:szCs w:val="16"/>
+                <w:shd w:fill="F1F3F5" w:color="auto" w:val="clear"/>
+                <w:rtl/>
+              </w:rPr>
+              <w:t xml:space="preserve">‎103‎</w:t>
+            </w:r>
+            <w:r>
+              <w:rPr>
+                <w:rFonts w:ascii="Arial" w:cs="Arial" w:eastAsia="Arial" w:hAnsi="Arial"/>
+                <w:b w:val="false"/>
+                <w:bCs w:val="false"/>
+                <w:sz w:val="18"/>
+                <w:szCs w:val="18"/>
+                <w:rtl/>
+              </w:rPr>
+              <w:t xml:space="preserve">) بإدراج آمن لإعادة التشغيل تتحقق منه الخطوة 4b في CI. هذه الجداول </w:t>
             </w:r>
             <w:r>
               <w:rPr>
@@ -39874,7 +40182,55 @@
                 <w:szCs w:val="18"/>
                 <w:rtl/>
               </w:rPr>
-              <w:t xml:space="preserve">. </w:t>
+              <w:t xml:space="preserve">، وصفوف المنصة في الجداول المختلطة يكتبها السكربت بمستخدم مؤقت من </w:t>
+            </w:r>
+            <w:r>
+              <w:rPr>
+                <w:rFonts w:ascii="Courier New" w:cs="Courier New" w:eastAsia="Courier New" w:hAnsi="Courier New"/>
+                <w:b w:val="false"/>
+                <w:bCs w:val="false"/>
+                <w:color w:val="1F2937"/>
+                <w:sz w:val="16"/>
+                <w:szCs w:val="16"/>
+                <w:shd w:fill="F1F3F5" w:color="auto" w:val="clear"/>
+                <w:rtl/>
+              </w:rPr>
+              <w:t xml:space="preserve">‎tp_platform‎</w:t>
+            </w:r>
+            <w:r>
+              <w:rPr>
+                <w:rFonts w:ascii="Arial" w:cs="Arial" w:eastAsia="Arial" w:hAnsi="Arial"/>
+                <w:b w:val="false"/>
+                <w:bCs w:val="false"/>
+                <w:sz w:val="18"/>
+                <w:szCs w:val="18"/>
+                <w:rtl/>
+              </w:rPr>
+              <w:t xml:space="preserve"> يُحذف بعده. أنواع الأحداث </w:t>
+            </w:r>
+            <w:r>
+              <w:rPr>
+                <w:rFonts w:ascii="Courier New" w:cs="Courier New" w:eastAsia="Courier New" w:hAnsi="Courier New"/>
+                <w:b w:val="false"/>
+                <w:bCs w:val="false"/>
+                <w:color w:val="1F2937"/>
+                <w:sz w:val="16"/>
+                <w:szCs w:val="16"/>
+                <w:shd w:fill="F1F3F5" w:color="auto" w:val="clear"/>
+                <w:rtl/>
+              </w:rPr>
+              <w:t xml:space="preserve">‎ntf.NotificationEventType‎</w:t>
+            </w:r>
+            <w:r>
+              <w:rPr>
+                <w:rFonts w:ascii="Arial" w:cs="Arial" w:eastAsia="Arial" w:hAnsi="Arial"/>
+                <w:b w:val="false"/>
+                <w:bCs w:val="false"/>
+                <w:sz w:val="18"/>
+                <w:szCs w:val="18"/>
+                <w:rtl/>
+              </w:rPr>
+              <w:t xml:space="preserve"> وتعريفات حقول الاعتماد مملوكة للمشترك في النموذج، فتُبذر في حزمتي المشترك NTF.BASE وLC.BASE لا هنا (DOC-B05 §5.1). </w:t>
             </w:r>
             <w:r>
               <w:rPr>
@@ -40016,77 +40372,31 @@
                 <w:szCs w:val="18"/>
                 <w:rtl/>
               </w:rPr>
-              <w:t xml:space="preserve"> (ADR 0005). </w:t>
-            </w:r>
-            <w:r>
-              <w:rPr>
-                <w:rFonts w:ascii="Arial" w:cs="Arial" w:eastAsia="Arial" w:hAnsi="Arial"/>
-                <w:b/>
-                <w:bCs/>
-                <w:sz w:val="18"/>
-                <w:szCs w:val="18"/>
-                <w:rtl/>
-              </w:rPr>
-              <w:t xml:space="preserve">باقٍ:</w:t>
-            </w:r>
-            <w:r>
-              <w:rPr>
-                <w:rFonts w:ascii="Arial" w:cs="Arial" w:eastAsia="Arial" w:hAnsi="Arial"/>
-                <w:b w:val="false"/>
-                <w:bCs w:val="false"/>
-                <w:sz w:val="18"/>
-                <w:szCs w:val="18"/>
-                <w:rtl/>
-              </w:rPr>
-              <w:t xml:space="preserve"> </w:t>
-            </w:r>
-            <w:r>
-              <w:rPr>
-                <w:rFonts w:ascii="Courier New" w:cs="Courier New" w:eastAsia="Courier New" w:hAnsi="Courier New"/>
-                <w:b w:val="false"/>
-                <w:bCs w:val="false"/>
-                <w:color w:val="1F2937"/>
-                <w:sz w:val="16"/>
-                <w:szCs w:val="16"/>
-                <w:shd w:fill="F1F3F5" w:color="auto" w:val="clear"/>
-                <w:rtl/>
-              </w:rPr>
-              <w:t xml:space="preserve">‎ref.Incoterm‎</w:t>
-            </w:r>
-            <w:r>
-              <w:rPr>
-                <w:rFonts w:ascii="Arial" w:cs="Arial" w:eastAsia="Arial" w:hAnsi="Arial"/>
-                <w:b w:val="false"/>
-                <w:bCs w:val="false"/>
-                <w:sz w:val="18"/>
-                <w:szCs w:val="18"/>
-                <w:rtl/>
-              </w:rPr>
-              <w:t xml:space="preserve"> و</w:t>
-            </w:r>
-            <w:r>
-              <w:rPr>
-                <w:rFonts w:ascii="Courier New" w:cs="Courier New" w:eastAsia="Courier New" w:hAnsi="Courier New"/>
-                <w:b w:val="false"/>
-                <w:bCs w:val="false"/>
-                <w:color w:val="1F2937"/>
-                <w:sz w:val="16"/>
-                <w:szCs w:val="16"/>
-                <w:shd w:fill="F1F3F5" w:color="auto" w:val="clear"/>
-                <w:rtl/>
-              </w:rPr>
-              <w:t xml:space="preserve">‎ref.UcpArticle‎</w:t>
-            </w:r>
-            <w:r>
-              <w:rPr>
-                <w:rFonts w:ascii="Arial" w:cs="Arial" w:eastAsia="Arial" w:hAnsi="Arial"/>
-                <w:b w:val="false"/>
-                <w:bCs w:val="false"/>
-                <w:sz w:val="18"/>
-                <w:szCs w:val="18"/>
-                <w:rtl/>
-              </w:rPr>
-              <w:t xml:space="preserve"> وأنواع الأحداث وحقول الاعتماد</w:t>
+              <w:t xml:space="preserve">، و</w:t>
+            </w:r>
+            <w:r>
+              <w:rPr>
+                <w:rFonts w:ascii="Courier New" w:cs="Courier New" w:eastAsia="Courier New" w:hAnsi="Courier New"/>
+                <w:b w:val="false"/>
+                <w:bCs w:val="false"/>
+                <w:color w:val="1F2937"/>
+                <w:sz w:val="16"/>
+                <w:szCs w:val="16"/>
+                <w:shd w:fill="F1F3F5" w:color="auto" w:val="clear"/>
+                <w:rtl/>
+              </w:rPr>
+              <w:t xml:space="preserve">‎103‎</w:t>
+            </w:r>
+            <w:r>
+              <w:rPr>
+                <w:rFonts w:ascii="Arial" w:cs="Arial" w:eastAsia="Arial" w:hAnsi="Arial"/>
+                <w:b w:val="false"/>
+                <w:bCs w:val="false"/>
+                <w:sz w:val="18"/>
+                <w:szCs w:val="18"/>
+                <w:rtl/>
+              </w:rPr>
+              <w:t xml:space="preserve"> (16 قاعدة Incoterms منها 5 قديمة LEGACY، ومواد UCP 600 الـ39 صفوفَ منصة بحالة UNVERIFIED حتى يتحقق مختص، O-06) (ADR 0005). البذر العالمي في الوثائق مكتمل؛ والعطل الرسمية يدخلها المشغّل (FR-PLT-035)</w:t>
             </w:r>
           </w:p>
         </w:tc>
@@ -40717,9 +41027,9 @@
         </w:tblBorders>
       </w:tblPr>
       <w:tblGrid>
-        <w:gridCol w:w="3106"/>
-        <w:gridCol w:w="4998"/>
-        <w:gridCol w:w="1760"/>
+        <w:gridCol w:w="3112"/>
+        <w:gridCol w:w="5007"/>
+        <w:gridCol w:w="1745"/>
       </w:tblGrid>
       <w:tr>
         <w:trPr>
@@ -40728,7 +41038,7 @@
         </w:trPr>
         <w:tc>
           <w:tcPr>
-            <w:tcW w:type="dxa" w:w="3106"/>
+            <w:tcW w:type="dxa" w:w="3112"/>
             <w:tcBorders>
               <w:top w:val="single" w:color="BFC9D6" w:sz="4"/>
               <w:left w:val="single" w:color="BFC9D6" w:sz="4"/>
@@ -40766,7 +41076,7 @@
         </w:tc>
         <w:tc>
           <w:tcPr>
-            <w:tcW w:type="dxa" w:w="4998"/>
+            <w:tcW w:type="dxa" w:w="5007"/>
             <w:tcBorders>
               <w:top w:val="single" w:color="BFC9D6" w:sz="4"/>
               <w:left w:val="single" w:color="BFC9D6" w:sz="4"/>
@@ -40804,7 +41114,7 @@
         </w:tc>
         <w:tc>
           <w:tcPr>
-            <w:tcW w:type="dxa" w:w="1760"/>
+            <w:tcW w:type="dxa" w:w="1745"/>
             <w:tcBorders>
               <w:top w:val="single" w:color="BFC9D6" w:sz="4"/>
               <w:left w:val="single" w:color="BFC9D6" w:sz="4"/>
@@ -40847,7 +41157,7 @@
         </w:trPr>
         <w:tc>
           <w:tcPr>
-            <w:tcW w:type="dxa" w:w="3106"/>
+            <w:tcW w:type="dxa" w:w="3112"/>
             <w:tcBorders>
               <w:top w:val="single" w:color="BFC9D6" w:sz="4"/>
               <w:left w:val="single" w:color="BFC9D6" w:sz="4"/>
@@ -40907,7 +41217,7 @@
         </w:tc>
         <w:tc>
           <w:tcPr>
-            <w:tcW w:type="dxa" w:w="4998"/>
+            <w:tcW w:type="dxa" w:w="5007"/>
             <w:tcBorders>
               <w:top w:val="single" w:color="BFC9D6" w:sz="4"/>
               <w:left w:val="single" w:color="BFC9D6" w:sz="4"/>
@@ -40954,7 +41264,7 @@
         </w:tc>
         <w:tc>
           <w:tcPr>
-            <w:tcW w:type="dxa" w:w="1760"/>
+            <w:tcW w:type="dxa" w:w="1745"/>
             <w:tcBorders>
               <w:top w:val="single" w:color="BFC9D6" w:sz="4"/>
               <w:left w:val="single" w:color="BFC9D6" w:sz="4"/>
@@ -40995,7 +41305,7 @@
         </w:trPr>
         <w:tc>
           <w:tcPr>
-            <w:tcW w:type="dxa" w:w="3106"/>
+            <w:tcW w:type="dxa" w:w="3112"/>
             <w:tcBorders>
               <w:top w:val="single" w:color="BFC9D6" w:sz="4"/>
               <w:left w:val="single" w:color="BFC9D6" w:sz="4"/>
@@ -41032,7 +41342,7 @@
         </w:tc>
         <w:tc>
           <w:tcPr>
-            <w:tcW w:type="dxa" w:w="4998"/>
+            <w:tcW w:type="dxa" w:w="5007"/>
             <w:tcBorders>
               <w:top w:val="single" w:color="BFC9D6" w:sz="4"/>
               <w:left w:val="single" w:color="BFC9D6" w:sz="4"/>
@@ -41104,7 +41414,7 @@
         </w:tc>
         <w:tc>
           <w:tcPr>
-            <w:tcW w:type="dxa" w:w="1760"/>
+            <w:tcW w:type="dxa" w:w="1745"/>
             <w:tcBorders>
               <w:top w:val="single" w:color="BFC9D6" w:sz="4"/>
               <w:left w:val="single" w:color="BFC9D6" w:sz="4"/>
@@ -41190,7 +41500,7 @@
         </w:trPr>
         <w:tc>
           <w:tcPr>
-            <w:tcW w:type="dxa" w:w="3106"/>
+            <w:tcW w:type="dxa" w:w="3112"/>
             <w:tcBorders>
               <w:top w:val="single" w:color="BFC9D6" w:sz="4"/>
               <w:left w:val="single" w:color="BFC9D6" w:sz="4"/>
@@ -41250,7 +41560,7 @@
         </w:tc>
         <w:tc>
           <w:tcPr>
-            <w:tcW w:type="dxa" w:w="4998"/>
+            <w:tcW w:type="dxa" w:w="5007"/>
             <w:tcBorders>
               <w:top w:val="single" w:color="BFC9D6" w:sz="4"/>
               <w:left w:val="single" w:color="BFC9D6" w:sz="4"/>
@@ -41291,7 +41601,7 @@
                 <w:szCs w:val="18"/>
                 <w:rtl/>
               </w:rPr>
-              <w:t xml:space="preserve"> — 198 جدولًا، 249 منحة مولّدة، 79 منحة ثابتة، 31 عمودًا مقيّدًا، القواعد R1–R10؛ يعمل في الخطوة 3 من </w:t>
+              <w:t xml:space="preserve"> — 198 جدولًا، 249 منحة مولّدة، 83 منحة ثابتة، 31 عمودًا مقيّدًا، القواعد R1–R11؛ يعمل في الخطوة 3 من </w:t>
             </w:r>
             <w:r>
               <w:rPr>
@@ -41310,7 +41620,7 @@
         </w:tc>
         <w:tc>
           <w:tcPr>
-            <w:tcW w:type="dxa" w:w="1760"/>
+            <w:tcW w:type="dxa" w:w="1745"/>
             <w:tcBorders>
               <w:top w:val="single" w:color="BFC9D6" w:sz="4"/>
               <w:left w:val="single" w:color="BFC9D6" w:sz="4"/>
@@ -41373,7 +41683,7 @@
         </w:trPr>
         <w:tc>
           <w:tcPr>
-            <w:tcW w:type="dxa" w:w="3106"/>
+            <w:tcW w:type="dxa" w:w="3112"/>
             <w:tcBorders>
               <w:top w:val="single" w:color="BFC9D6" w:sz="4"/>
               <w:left w:val="single" w:color="BFC9D6" w:sz="4"/>
@@ -41434,7 +41744,7 @@
         </w:tc>
         <w:tc>
           <w:tcPr>
-            <w:tcW w:type="dxa" w:w="4998"/>
+            <w:tcW w:type="dxa" w:w="5007"/>
             <w:tcBorders>
               <w:top w:val="single" w:color="BFC9D6" w:sz="4"/>
               <w:left w:val="single" w:color="BFC9D6" w:sz="4"/>
@@ -41482,7 +41792,7 @@
         </w:tc>
         <w:tc>
           <w:tcPr>
-            <w:tcW w:type="dxa" w:w="1760"/>
+            <w:tcW w:type="dxa" w:w="1745"/>
             <w:tcBorders>
               <w:top w:val="single" w:color="BFC9D6" w:sz="4"/>
               <w:left w:val="single" w:color="BFC9D6" w:sz="4"/>
@@ -41524,7 +41834,7 @@
         </w:trPr>
         <w:tc>
           <w:tcPr>
-            <w:tcW w:type="dxa" w:w="3106"/>
+            <w:tcW w:type="dxa" w:w="3112"/>
             <w:tcBorders>
               <w:top w:val="single" w:color="BFC9D6" w:sz="4"/>
               <w:left w:val="single" w:color="BFC9D6" w:sz="4"/>
@@ -41573,7 +41883,7 @@
         </w:tc>
         <w:tc>
           <w:tcPr>
-            <w:tcW w:type="dxa" w:w="4998"/>
+            <w:tcW w:type="dxa" w:w="5007"/>
             <w:tcBorders>
               <w:top w:val="single" w:color="BFC9D6" w:sz="4"/>
               <w:left w:val="single" w:color="BFC9D6" w:sz="4"/>
@@ -41860,7 +42170,7 @@
         </w:tc>
         <w:tc>
           <w:tcPr>
-            <w:tcW w:type="dxa" w:w="1760"/>
+            <w:tcW w:type="dxa" w:w="1745"/>
             <w:tcBorders>
               <w:top w:val="single" w:color="BFC9D6" w:sz="4"/>
               <w:left w:val="single" w:color="BFC9D6" w:sz="4"/>
@@ -41925,7 +42235,7 @@
         </w:trPr>
         <w:tc>
           <w:tcPr>
-            <w:tcW w:type="dxa" w:w="3106"/>
+            <w:tcW w:type="dxa" w:w="3112"/>
             <w:tcBorders>
               <w:top w:val="single" w:color="BFC9D6" w:sz="4"/>
               <w:left w:val="single" w:color="BFC9D6" w:sz="4"/>
@@ -41962,7 +42272,7 @@
         </w:tc>
         <w:tc>
           <w:tcPr>
-            <w:tcW w:type="dxa" w:w="4998"/>
+            <w:tcW w:type="dxa" w:w="5007"/>
             <w:tcBorders>
               <w:top w:val="single" w:color="BFC9D6" w:sz="4"/>
               <w:left w:val="single" w:color="BFC9D6" w:sz="4"/>
@@ -42071,7 +42381,7 @@
         </w:tc>
         <w:tc>
           <w:tcPr>
-            <w:tcW w:type="dxa" w:w="1760"/>
+            <w:tcW w:type="dxa" w:w="1745"/>
             <w:tcBorders>
               <w:top w:val="single" w:color="BFC9D6" w:sz="4"/>
               <w:left w:val="single" w:color="BFC9D6" w:sz="4"/>
@@ -42113,7 +42423,7 @@
         </w:trPr>
         <w:tc>
           <w:tcPr>
-            <w:tcW w:type="dxa" w:w="3106"/>
+            <w:tcW w:type="dxa" w:w="3112"/>
             <w:tcBorders>
               <w:top w:val="single" w:color="BFC9D6" w:sz="4"/>
               <w:left w:val="single" w:color="BFC9D6" w:sz="4"/>
@@ -42149,7 +42459,7 @@
         </w:tc>
         <w:tc>
           <w:tcPr>
-            <w:tcW w:type="dxa" w:w="4998"/>
+            <w:tcW w:type="dxa" w:w="5007"/>
             <w:tcBorders>
               <w:top w:val="single" w:color="BFC9D6" w:sz="4"/>
               <w:left w:val="single" w:color="BFC9D6" w:sz="4"/>
@@ -42244,7 +42554,7 @@
         </w:tc>
         <w:tc>
           <w:tcPr>
-            <w:tcW w:type="dxa" w:w="1760"/>
+            <w:tcW w:type="dxa" w:w="1745"/>
             <w:tcBorders>
               <w:top w:val="single" w:color="BFC9D6" w:sz="4"/>
               <w:left w:val="single" w:color="BFC9D6" w:sz="4"/>
@@ -42285,7 +42595,7 @@
         </w:trPr>
         <w:tc>
           <w:tcPr>
-            <w:tcW w:type="dxa" w:w="3106"/>
+            <w:tcW w:type="dxa" w:w="3112"/>
             <w:tcBorders>
               <w:top w:val="single" w:color="BFC9D6" w:sz="4"/>
               <w:left w:val="single" w:color="BFC9D6" w:sz="4"/>
@@ -42333,7 +42643,7 @@
         </w:tc>
         <w:tc>
           <w:tcPr>
-            <w:tcW w:type="dxa" w:w="4998"/>
+            <w:tcW w:type="dxa" w:w="5007"/>
             <w:tcBorders>
               <w:top w:val="single" w:color="BFC9D6" w:sz="4"/>
               <w:left w:val="single" w:color="BFC9D6" w:sz="4"/>
@@ -42580,6 +42890,54 @@
                 <w:shd w:fill="F1F3F5" w:color="auto" w:val="clear"/>
                 <w:rtl/>
               </w:rPr>
+              <w:t xml:space="preserve">‎db/tests/kyc_history_tests.sql‎</w:t>
+            </w:r>
+            <w:r>
+              <w:rPr>
+                <w:rFonts w:ascii="Arial" w:cs="Arial" w:eastAsia="Arial" w:hAnsi="Arial"/>
+                <w:b w:val="false"/>
+                <w:bCs w:val="false"/>
+                <w:sz w:val="18"/>
+                <w:szCs w:val="18"/>
+                <w:rtl/>
+              </w:rPr>
+              <w:t xml:space="preserve"> 4 حالات (الحذف المتتالي ونسخ ملفات الاكتمال، ADR 0006) و</w:t>
+            </w:r>
+            <w:r>
+              <w:rPr>
+                <w:rFonts w:ascii="Courier New" w:cs="Courier New" w:eastAsia="Courier New" w:hAnsi="Courier New"/>
+                <w:b w:val="false"/>
+                <w:bCs w:val="false"/>
+                <w:color w:val="1F2937"/>
+                <w:sz w:val="16"/>
+                <w:szCs w:val="16"/>
+                <w:shd w:fill="F1F3F5" w:color="auto" w:val="clear"/>
+                <w:rtl/>
+              </w:rPr>
+              <w:t xml:space="preserve">‎db/tests/reference_data_tests.sql‎</w:t>
+            </w:r>
+            <w:r>
+              <w:rPr>
+                <w:rFonts w:ascii="Arial" w:cs="Arial" w:eastAsia="Arial" w:hAnsi="Arial"/>
+                <w:b w:val="false"/>
+                <w:bCs w:val="false"/>
+                <w:sz w:val="18"/>
+                <w:szCs w:val="18"/>
+                <w:rtl/>
+              </w:rPr>
+              <w:t xml:space="preserve"> 4 حالات (قراءة المشترك للقوائم العالمية ومواد UCP، ومنعه من كتابتها) و</w:t>
+            </w:r>
+            <w:r>
+              <w:rPr>
+                <w:rFonts w:ascii="Courier New" w:cs="Courier New" w:eastAsia="Courier New" w:hAnsi="Courier New"/>
+                <w:b w:val="false"/>
+                <w:bCs w:val="false"/>
+                <w:color w:val="1F2937"/>
+                <w:sz w:val="16"/>
+                <w:szCs w:val="16"/>
+                <w:shd w:fill="F1F3F5" w:color="auto" w:val="clear"/>
+                <w:rtl/>
+              </w:rPr>
               <w:t xml:space="preserve">‎db/tests/fac_share_rule_tests.sql‎</w:t>
             </w:r>
             <w:r>
@@ -42597,7 +42955,7 @@
         </w:tc>
         <w:tc>
           <w:tcPr>
-            <w:tcW w:type="dxa" w:w="1760"/>
+            <w:tcW w:type="dxa" w:w="1745"/>
             <w:tcBorders>
               <w:top w:val="single" w:color="BFC9D6" w:sz="4"/>
               <w:left w:val="single" w:color="BFC9D6" w:sz="4"/>
@@ -42628,55 +42986,7 @@
                 <w:szCs w:val="18"/>
                 <w:rtl/>
               </w:rPr>
-              <w:t xml:space="preserve">لم تُكتب بعد: محاولة </w:t>
-            </w:r>
-            <w:r>
-              <w:rPr>
-                <w:rFonts w:ascii="Courier New" w:cs="Courier New" w:eastAsia="Courier New" w:hAnsi="Courier New"/>
-                <w:b w:val="false"/>
-                <w:bCs w:val="false"/>
-                <w:color w:val="1F2937"/>
-                <w:sz w:val="16"/>
-                <w:szCs w:val="16"/>
-                <w:shd w:fill="F1F3F5" w:color="auto" w:val="clear"/>
-                <w:rtl/>
-              </w:rPr>
-              <w:t xml:space="preserve">‎tp_app‎</w:t>
-            </w:r>
-            <w:r>
-              <w:rPr>
-                <w:rFonts w:ascii="Arial" w:cs="Arial" w:eastAsia="Arial" w:hAnsi="Arial"/>
-                <w:b w:val="false"/>
-                <w:bCs w:val="false"/>
-                <w:sz w:val="18"/>
-                <w:szCs w:val="18"/>
-                <w:rtl/>
-              </w:rPr>
-              <w:t xml:space="preserve"> الكتابة على كتالوج عالمي مثل </w:t>
-            </w:r>
-            <w:r>
-              <w:rPr>
-                <w:rFonts w:ascii="Courier New" w:cs="Courier New" w:eastAsia="Courier New" w:hAnsi="Courier New"/>
-                <w:b w:val="false"/>
-                <w:bCs w:val="false"/>
-                <w:color w:val="1F2937"/>
-                <w:sz w:val="16"/>
-                <w:szCs w:val="16"/>
-                <w:shd w:fill="F1F3F5" w:color="auto" w:val="clear"/>
-                <w:rtl/>
-              </w:rPr>
-              <w:t xml:space="preserve">‎ref.Currency‎</w:t>
-            </w:r>
-            <w:r>
-              <w:rPr>
-                <w:rFonts w:ascii="Arial" w:cs="Arial" w:eastAsia="Arial" w:hAnsi="Arial"/>
-                <w:b w:val="false"/>
-                <w:bCs w:val="false"/>
-                <w:sz w:val="18"/>
-                <w:szCs w:val="18"/>
-                <w:rtl/>
-              </w:rPr>
-              <w:t xml:space="preserve">، والتدفق المالي (الحجز والاستغلال) خارج قاعدة الحصص</w:t>
+              <w:t xml:space="preserve">لم تُكتب بعد: التدفق المالي (الحجز والاستغلال) خارج قاعدة الحصص</w:t>
             </w:r>
           </w:p>
         </w:tc>
@@ -46935,18 +47245,18 @@
                 <w:szCs w:val="18"/>
                 <w:rtl/>
               </w:rPr>
-              <w:t xml:space="preserve">منفّذ جزئيًا (2026-10-12):</w:t>
-            </w:r>
-            <w:r>
-              <w:rPr>
-                <w:rFonts w:ascii="Arial" w:cs="Arial" w:eastAsia="Arial" w:hAnsi="Arial"/>
-                <w:b w:val="false"/>
-                <w:bCs w:val="false"/>
-                <w:sz w:val="18"/>
-                <w:szCs w:val="18"/>
-                <w:rtl/>
-              </w:rPr>
-              <w:t xml:space="preserve"> الإعدادات والمهام والباقة والعناوين المحجوزة والدول والعملات والصلاحيات (ADR 0004 و0005)</w:t>
+              <w:t xml:space="preserve">البذر العالمي منفّذ (2026-10-13):</w:t>
+            </w:r>
+            <w:r>
+              <w:rPr>
+                <w:rFonts w:ascii="Arial" w:cs="Arial" w:eastAsia="Arial" w:hAnsi="Arial"/>
+                <w:b w:val="false"/>
+                <w:bCs w:val="false"/>
+                <w:sz w:val="18"/>
+                <w:szCs w:val="18"/>
+                <w:rtl/>
+              </w:rPr>
+              <w:t xml:space="preserve"> الإعدادات والمهام والباقة والعناوين المحجوزة والدول والعملات والصلاحيات وIncoterms ومواد UCP 600 (ADR 0004 و0005)</w:t>
             </w:r>
           </w:p>
         </w:tc>
@@ -46982,55 +47292,7 @@
                 <w:szCs w:val="18"/>
                 <w:rtl/>
               </w:rPr>
-              <w:t xml:space="preserve">باقٍ: </w:t>
-            </w:r>
-            <w:r>
-              <w:rPr>
-                <w:rFonts w:ascii="Courier New" w:cs="Courier New" w:eastAsia="Courier New" w:hAnsi="Courier New"/>
-                <w:b w:val="false"/>
-                <w:bCs w:val="false"/>
-                <w:color w:val="1F2937"/>
-                <w:sz w:val="16"/>
-                <w:szCs w:val="16"/>
-                <w:shd w:fill="F1F3F5" w:color="auto" w:val="clear"/>
-                <w:rtl/>
-              </w:rPr>
-              <w:t xml:space="preserve">‎ref.Incoterm‎</w:t>
-            </w:r>
-            <w:r>
-              <w:rPr>
-                <w:rFonts w:ascii="Arial" w:cs="Arial" w:eastAsia="Arial" w:hAnsi="Arial"/>
-                <w:b w:val="false"/>
-                <w:bCs w:val="false"/>
-                <w:sz w:val="18"/>
-                <w:szCs w:val="18"/>
-                <w:rtl/>
-              </w:rPr>
-              <w:t xml:space="preserve"> و</w:t>
-            </w:r>
-            <w:r>
-              <w:rPr>
-                <w:rFonts w:ascii="Courier New" w:cs="Courier New" w:eastAsia="Courier New" w:hAnsi="Courier New"/>
-                <w:b w:val="false"/>
-                <w:bCs w:val="false"/>
-                <w:color w:val="1F2937"/>
-                <w:sz w:val="16"/>
-                <w:szCs w:val="16"/>
-                <w:shd w:fill="F1F3F5" w:color="auto" w:val="clear"/>
-                <w:rtl/>
-              </w:rPr>
-              <w:t xml:space="preserve">‎ref.UcpArticle‎</w:t>
-            </w:r>
-            <w:r>
-              <w:rPr>
-                <w:rFonts w:ascii="Arial" w:cs="Arial" w:eastAsia="Arial" w:hAnsi="Arial"/>
-                <w:b w:val="false"/>
-                <w:bCs w:val="false"/>
-                <w:sz w:val="18"/>
-                <w:szCs w:val="18"/>
-                <w:rtl/>
-              </w:rPr>
-              <w:t xml:space="preserve"> وأنواع الأحداث وحقول الاعتماد، وحزم المشترك في التطبيق (DOC-B05 §5)</w:t>
+              <w:t xml:space="preserve">باقٍ: حزم المشترك في التطبيق (DOC-B05 §5)، والتحقق من مواد UCP على النص الرسمي (O-06)</w:t>
             </w:r>
           </w:p>
         </w:tc>

</xml_diff>

<commit_message>
ADR 0007 and document updates for the audit written by the database
- ADR 0007: the event catalogue (action, category, severity, tenant or
  platform row), the writer and the login trigger, what the application
  still writes, job-binding volume, the hash chain in S2, what is not
  covered.
- O-24 R6 and the audit gap of O-25 closed in erd_open_items; ADR 0003 and
  ADR 0004 point to ADR 0007.
- Design document (who writes the audit, deploy order, test counts),
  DOC-F03 (DQ-F03-10 implemented), DOC-F04, DOC-F06, DOC-S01 (THR-30) and
  DOC-S12 updated; their Word files, the readiness volumes and the ERD
  Word file rebuilt.

Claude-Session: https://claude.ai/code/session_012HHcRrzuvMBTL2FYxXtsyv
</commit_message>
<xml_diff>
--- a/treasury-platform/docs/20-database-design.docx
+++ b/treasury-platform/docs/20-database-design.docx
@@ -9007,7 +9007,7 @@
           <w:szCs w:val="21"/>
           <w:rtl/>
         </w:rPr>
-        <w:t xml:space="preserve"> التطبيق يرى رمز الرابط الخام لأنه يرسل البريد، وفحص TOTP في التطبيق لأن المفتاح عنده (مع فحص التكرار وحد الإخفاقات في القاعدة)، ويستطيع </w:t>
+        <w:t xml:space="preserve"> التطبيق يرى رمز الرابط الخام لأنه يرسل البريد، وفحص TOTP في التطبيق لأن المفتاح عنده (مع فحص التكرار وحد الإخفاقات في القاعدة). لا يعبر أي منها حدود المشترك. وأُغلق R6: حذف </w:t>
       </w:r>
       <w:r>
         <w:rPr>
@@ -9031,7 +9031,7 @@
           <w:szCs w:val="21"/>
           <w:rtl/>
         </w:rPr>
-        <w:t xml:space="preserve"> حذف صفوف </w:t>
+        <w:t xml:space="preserve"> صفوف </w:t>
       </w:r>
       <w:r>
         <w:rPr>
@@ -9055,7 +9055,31 @@
           <w:szCs w:val="21"/>
           <w:rtl/>
         </w:rPr>
-        <w:t xml:space="preserve"> حتى يُحسم DQ-F03-10. لا يعبر أي منها حدود المشترك.</w:t>
+        <w:t xml:space="preserve"> لم يعد يمحو الأثر، لأن كل محاولة تُنسخ إلى </w:t>
+      </w:r>
+      <w:r>
+        <w:rPr>
+          <w:rFonts w:ascii="Courier New" w:cs="Courier New" w:eastAsia="Courier New" w:hAnsi="Courier New"/>
+          <w:b w:val="false"/>
+          <w:bCs w:val="false"/>
+          <w:color w:val="1F2937"/>
+          <w:sz w:val="18"/>
+          <w:szCs w:val="18"/>
+          <w:shd w:fill="F1F3F5" w:color="auto" w:val="clear"/>
+          <w:rtl/>
+        </w:rPr>
+        <w:t xml:space="preserve">‎aud.AuditLog‎</w:t>
+      </w:r>
+      <w:r>
+        <w:rPr>
+          <w:rFonts w:ascii="Arial" w:cs="Arial" w:eastAsia="Arial" w:hAnsi="Arial"/>
+          <w:b w:val="false"/>
+          <w:bCs w:val="false"/>
+          <w:sz w:val="21"/>
+          <w:szCs w:val="21"/>
+          <w:rtl/>
+        </w:rPr>
+        <w:t xml:space="preserve"> (ADR 0007، DQ-F03-10).</w:t>
       </w:r>
     </w:p>
     <w:p>
@@ -15115,6 +15139,111 @@
           <w:szCs w:val="21"/>
           <w:rtl/>
         </w:rPr>
+        <w:t xml:space="preserve">من يكتب التدقيق (ADR 0007):</w:t>
+      </w:r>
+      <w:r>
+        <w:rPr>
+          <w:rFonts w:ascii="Arial" w:cs="Arial" w:eastAsia="Arial" w:hAnsi="Arial"/>
+          <w:b w:val="false"/>
+          <w:bCs w:val="false"/>
+          <w:sz w:val="21"/>
+          <w:szCs w:val="21"/>
+          <w:rtl/>
+        </w:rPr>
+        <w:t xml:space="preserve"> إجراءات القاعدة تكتب صفوف أحداثها في معاملة التغيير نفسها عبر الإجراء الداخلي </w:t>
+      </w:r>
+      <w:r>
+        <w:rPr>
+          <w:rFonts w:ascii="Courier New" w:cs="Courier New" w:eastAsia="Courier New" w:hAnsi="Courier New"/>
+          <w:b w:val="false"/>
+          <w:bCs w:val="false"/>
+          <w:color w:val="1F2937"/>
+          <w:sz w:val="18"/>
+          <w:szCs w:val="18"/>
+          <w:shd w:fill="F1F3F5" w:color="auto" w:val="clear"/>
+          <w:rtl/>
+        </w:rPr>
+        <w:t xml:space="preserve">‎aud.usp_WriteEvent‎</w:t>
+      </w:r>
+      <w:r>
+        <w:rPr>
+          <w:rFonts w:ascii="Arial" w:cs="Arial" w:eastAsia="Arial" w:hAnsi="Arial"/>
+          <w:b w:val="false"/>
+          <w:bCs w:val="false"/>
+          <w:sz w:val="21"/>
+          <w:szCs w:val="21"/>
+          <w:rtl/>
+        </w:rPr>
+        <w:t xml:space="preserve"> (029): كل محاولة دخول بقادح على </w:t>
+      </w:r>
+      <w:r>
+        <w:rPr>
+          <w:rFonts w:ascii="Courier New" w:cs="Courier New" w:eastAsia="Courier New" w:hAnsi="Courier New"/>
+          <w:b w:val="false"/>
+          <w:bCs w:val="false"/>
+          <w:color w:val="1F2937"/>
+          <w:sz w:val="18"/>
+          <w:szCs w:val="18"/>
+          <w:shd w:fill="F1F3F5" w:color="auto" w:val="clear"/>
+          <w:rtl/>
+        </w:rPr>
+        <w:t xml:space="preserve">‎sec.LoginAttempt‎</w:t>
+      </w:r>
+      <w:r>
+        <w:rPr>
+          <w:rFonts w:ascii="Arial" w:cs="Arial" w:eastAsia="Arial" w:hAnsi="Arial"/>
+          <w:b w:val="false"/>
+          <w:bCs w:val="false"/>
+          <w:sz w:val="21"/>
+          <w:szCs w:val="21"/>
+          <w:rtl/>
+        </w:rPr>
+        <w:t xml:space="preserve">، وتغييرات الحسابات والجلسات (035)، ودخول المشغّلين وحساباتهم وربط الدعم (036)، وربط المهام (037)، والتهيئة وحالة المشترك (038). صفوف المشترك يراها عارض تدقيقه، وصفوف المنصة (</w:t>
+      </w:r>
+      <w:r>
+        <w:rPr>
+          <w:rFonts w:ascii="Courier New" w:cs="Courier New" w:eastAsia="Courier New" w:hAnsi="Courier New"/>
+          <w:b w:val="false"/>
+          <w:bCs w:val="false"/>
+          <w:color w:val="1F2937"/>
+          <w:sz w:val="18"/>
+          <w:szCs w:val="18"/>
+          <w:shd w:fill="F1F3F5" w:color="auto" w:val="clear"/>
+          <w:rtl/>
+        </w:rPr>
+        <w:t xml:space="preserve">‎TenantId‎</w:t>
+      </w:r>
+      <w:r>
+        <w:rPr>
+          <w:rFonts w:ascii="Arial" w:cs="Arial" w:eastAsia="Arial" w:hAnsi="Arial"/>
+          <w:b w:val="false"/>
+          <w:bCs w:val="false"/>
+          <w:sz w:val="21"/>
+          <w:szCs w:val="21"/>
+          <w:rtl/>
+        </w:rPr>
+        <w:t xml:space="preserve"> فارغ) للمشغّلين وحدهم، ولا صف يحمل بريدًا أو تجزئة أو رمزًا. ويكتب التطبيق ما يفعله هو: بيانات الخزينة والكشف والتصدير وعرض التدقيق.</w:t>
+      </w:r>
+    </w:p>
+    <w:p>
+      <w:pPr>
+        <w:pStyle w:val="ListParagraph"/>
+        <w:numPr>
+          <w:ilvl w:val="0"/>
+          <w:numId w:val="3"/>
+        </w:numPr>
+        <w:bidi/>
+        <w:spacing w:after="70" w:before="0" w:line="300"/>
+      </w:pPr>
+      <w:r>
+        <w:rPr>
+          <w:rFonts w:ascii="Arial" w:cs="Arial" w:eastAsia="Arial" w:hAnsi="Arial"/>
+          <w:b/>
+          <w:bCs/>
+          <w:sz w:val="21"/>
+          <w:szCs w:val="21"/>
+          <w:rtl/>
+        </w:rPr>
         <w:t xml:space="preserve">سلسلة البصمات</w:t>
       </w:r>
       <w:r>
@@ -38566,7 +38695,31 @@
           <w:szCs w:val="21"/>
           <w:rtl/>
         </w:rPr>
-        <w:t xml:space="preserve"> (إعدادات المشترك ضمن حدود المنصة، ADR 0004)</w:t>
+        <w:t xml:space="preserve"> (إعدادات المشترك ضمن حدود المنصة، ADR 0004) → </w:t>
+      </w:r>
+      <w:r>
+        <w:rPr>
+          <w:rFonts w:ascii="Courier New" w:cs="Courier New" w:eastAsia="Courier New" w:hAnsi="Courier New"/>
+          <w:b w:val="false"/>
+          <w:bCs w:val="false"/>
+          <w:color w:val="1F2937"/>
+          <w:sz w:val="18"/>
+          <w:szCs w:val="18"/>
+          <w:shd w:fill="F1F3F5" w:color="auto" w:val="clear"/>
+          <w:rtl/>
+        </w:rPr>
+        <w:t xml:space="preserve">‎029_audit_writer‎</w:t>
+      </w:r>
+      <w:r>
+        <w:rPr>
+          <w:rFonts w:ascii="Arial" w:cs="Arial" w:eastAsia="Arial" w:hAnsi="Arial"/>
+          <w:b w:val="false"/>
+          <w:bCs w:val="false"/>
+          <w:sz w:val="21"/>
+          <w:szCs w:val="21"/>
+          <w:rtl/>
+        </w:rPr>
+        <w:t xml:space="preserve"> (كاتب التدقيق وقادح محاولات الدخول، ADR 0007)</w:t>
       </w:r>
     </w:p>
     <w:p>
@@ -42781,7 +42934,7 @@
                 <w:szCs w:val="18"/>
                 <w:rtl/>
               </w:rPr>
-              <w:t xml:space="preserve"> 10 حالات و</w:t>
+              <w:t xml:space="preserve"> 11 حالة و</w:t>
             </w:r>
             <w:r>
               <w:rPr>
@@ -42805,7 +42958,7 @@
                 <w:szCs w:val="18"/>
                 <w:rtl/>
               </w:rPr>
-              <w:t xml:space="preserve"> 6 حالات و</w:t>
+              <w:t xml:space="preserve"> 7 حالات و</w:t>
             </w:r>
             <w:r>
               <w:rPr>
@@ -42926,6 +43079,30 @@
                 <w:rtl/>
               </w:rPr>
               <w:t xml:space="preserve"> 4 حالات (قراءة المشترك للقوائم العالمية ومواد UCP، ومنعه من كتابتها) و</w:t>
+            </w:r>
+            <w:r>
+              <w:rPr>
+                <w:rFonts w:ascii="Courier New" w:cs="Courier New" w:eastAsia="Courier New" w:hAnsi="Courier New"/>
+                <w:b w:val="false"/>
+                <w:bCs w:val="false"/>
+                <w:color w:val="1F2937"/>
+                <w:sz w:val="16"/>
+                <w:szCs w:val="16"/>
+                <w:shd w:fill="F1F3F5" w:color="auto" w:val="clear"/>
+                <w:rtl/>
+              </w:rPr>
+              <w:t xml:space="preserve">‎db/tests/audit_trail_tests.sql‎</w:t>
+            </w:r>
+            <w:r>
+              <w:rPr>
+                <w:rFonts w:ascii="Arial" w:cs="Arial" w:eastAsia="Arial" w:hAnsi="Arial"/>
+                <w:b w:val="false"/>
+                <w:bCs w:val="false"/>
+                <w:sz w:val="18"/>
+                <w:szCs w:val="18"/>
+                <w:rtl/>
+              </w:rPr>
+              <w:t xml:space="preserve"> 7 حالات (صفوف التدقيق التي تكتبها القاعدة، ADR 0007) و</w:t>
             </w:r>
             <w:r>
               <w:rPr>

</xml_diff>

<commit_message>
ADR 0008 and document updates for the data export in read-only states
- ADR 0008: the export procedures and who may call them, the new job
  JOB-PLT-EXPORT, re-checked job bindings, audit and sensitive access
  rows, error numbers 50034-50037, the DATA_EXPORT_PACKAGE document type
  for the CAT.DOCTYPES pack, what the application still builds, the
  closing guard kept until it does.
- O-25 updated in erd_open_items; ADR 0004 points to ADR 0008.
- Design document (tp_app and tp_jobs rights, deploy order, tests),
  DOC-B05 (31 jobs, 43 document types), DOC-F04 (DQ-F04-8 implemented),
  DOC-F05 section 6.4, DOC-F07 UC-PLT-31 and DOC-F17 (JOB-PLT-EXPORT)
  updated; their Word files, the readiness volumes and the ERD Word file
  rebuilt.

Claude-Session: https://claude.ai/code/session_012HHcRrzuvMBTL2FYxXtsyv
</commit_message>
<xml_diff>
--- a/treasury-platform/docs/20-database-design.docx
+++ b/treasury-platform/docs/20-database-design.docx
@@ -24394,7 +24394,79 @@
                 <w:szCs w:val="18"/>
                 <w:rtl/>
               </w:rPr>
-              <w:t xml:space="preserve">، ADR 0005) فقط · لا يكتب العدّادات ولا الأرقام المصدرة مباشرة (</w:t>
+              <w:t xml:space="preserve">، ADR 0005) و042 (</w:t>
+            </w:r>
+            <w:r>
+              <w:rPr>
+                <w:rFonts w:ascii="Courier New" w:cs="Courier New" w:eastAsia="Courier New" w:hAnsi="Courier New"/>
+                <w:b w:val="false"/>
+                <w:bCs w:val="false"/>
+                <w:color w:val="1F2937"/>
+                <w:sz w:val="16"/>
+                <w:szCs w:val="16"/>
+                <w:shd w:fill="F1F3F5" w:color="auto" w:val="clear"/>
+                <w:rtl/>
+              </w:rPr>
+              <w:t xml:space="preserve">‎cfg.usp_RequestDataExport‎</w:t>
+            </w:r>
+            <w:r>
+              <w:rPr>
+                <w:rFonts w:ascii="Arial" w:cs="Arial" w:eastAsia="Arial" w:hAnsi="Arial"/>
+                <w:b w:val="false"/>
+                <w:bCs w:val="false"/>
+                <w:sz w:val="18"/>
+                <w:szCs w:val="18"/>
+                <w:rtl/>
+              </w:rPr>
+              <w:t xml:space="preserve"> و</w:t>
+            </w:r>
+            <w:r>
+              <w:rPr>
+                <w:rFonts w:ascii="Courier New" w:cs="Courier New" w:eastAsia="Courier New" w:hAnsi="Courier New"/>
+                <w:b w:val="false"/>
+                <w:bCs w:val="false"/>
+                <w:color w:val="1F2937"/>
+                <w:sz w:val="16"/>
+                <w:szCs w:val="16"/>
+                <w:shd w:fill="F1F3F5" w:color="auto" w:val="clear"/>
+                <w:rtl/>
+              </w:rPr>
+              <w:t xml:space="preserve">‎cfg.usp_ApproveDataExport‎</w:t>
+            </w:r>
+            <w:r>
+              <w:rPr>
+                <w:rFonts w:ascii="Arial" w:cs="Arial" w:eastAsia="Arial" w:hAnsi="Arial"/>
+                <w:b w:val="false"/>
+                <w:bCs w:val="false"/>
+                <w:sz w:val="18"/>
+                <w:szCs w:val="18"/>
+                <w:rtl/>
+              </w:rPr>
+              <w:t xml:space="preserve">، ADR 0008) فقط · لا يدرج طلب تصدير ولا يعدّله مباشرة (</w:t>
+            </w:r>
+            <w:r>
+              <w:rPr>
+                <w:rFonts w:ascii="Courier New" w:cs="Courier New" w:eastAsia="Courier New" w:hAnsi="Courier New"/>
+                <w:b w:val="false"/>
+                <w:bCs w:val="false"/>
+                <w:color w:val="1F2937"/>
+                <w:sz w:val="16"/>
+                <w:szCs w:val="16"/>
+                <w:shd w:fill="F1F3F5" w:color="auto" w:val="clear"/>
+                <w:rtl/>
+              </w:rPr>
+              <w:t xml:space="preserve">‎DENY‎</w:t>
+            </w:r>
+            <w:r>
+              <w:rPr>
+                <w:rFonts w:ascii="Arial" w:cs="Arial" w:eastAsia="Arial" w:hAnsi="Arial"/>
+                <w:b w:val="false"/>
+                <w:bCs w:val="false"/>
+                <w:sz w:val="18"/>
+                <w:szCs w:val="18"/>
+                <w:rtl/>
+              </w:rPr>
+              <w:t xml:space="preserve"> في 042) · لا يكتب العدّادات ولا الأرقام المصدرة مباشرة (</w:t>
             </w:r>
             <w:r>
               <w:rPr>
@@ -25648,7 +25720,103 @@
                 <w:szCs w:val="18"/>
                 <w:rtl/>
               </w:rPr>
-              <w:t xml:space="preserve"> (037، 038)</w:t>
+              <w:t xml:space="preserve"> (037، 038)، وإجراءات مهمتي التصدير في 042 (</w:t>
+            </w:r>
+            <w:r>
+              <w:rPr>
+                <w:rFonts w:ascii="Courier New" w:cs="Courier New" w:eastAsia="Courier New" w:hAnsi="Courier New"/>
+                <w:b w:val="false"/>
+                <w:bCs w:val="false"/>
+                <w:color w:val="1F2937"/>
+                <w:sz w:val="16"/>
+                <w:szCs w:val="16"/>
+                <w:shd w:fill="F1F3F5" w:color="auto" w:val="clear"/>
+                <w:rtl/>
+              </w:rPr>
+              <w:t xml:space="preserve">‎cfg.usp_StartDataExport‎</w:t>
+            </w:r>
+            <w:r>
+              <w:rPr>
+                <w:rFonts w:ascii="Arial" w:cs="Arial" w:eastAsia="Arial" w:hAnsi="Arial"/>
+                <w:b w:val="false"/>
+                <w:bCs w:val="false"/>
+                <w:sz w:val="18"/>
+                <w:szCs w:val="18"/>
+                <w:rtl/>
+              </w:rPr>
+              <w:t xml:space="preserve"> و</w:t>
+            </w:r>
+            <w:r>
+              <w:rPr>
+                <w:rFonts w:ascii="Courier New" w:cs="Courier New" w:eastAsia="Courier New" w:hAnsi="Courier New"/>
+                <w:b w:val="false"/>
+                <w:bCs w:val="false"/>
+                <w:color w:val="1F2937"/>
+                <w:sz w:val="16"/>
+                <w:szCs w:val="16"/>
+                <w:shd w:fill="F1F3F5" w:color="auto" w:val="clear"/>
+                <w:rtl/>
+              </w:rPr>
+              <w:t xml:space="preserve">‎usp_FinishDataExport‎</w:t>
+            </w:r>
+            <w:r>
+              <w:rPr>
+                <w:rFonts w:ascii="Arial" w:cs="Arial" w:eastAsia="Arial" w:hAnsi="Arial"/>
+                <w:b w:val="false"/>
+                <w:bCs w:val="false"/>
+                <w:sz w:val="18"/>
+                <w:szCs w:val="18"/>
+                <w:rtl/>
+              </w:rPr>
+              <w:t xml:space="preserve"> و</w:t>
+            </w:r>
+            <w:r>
+              <w:rPr>
+                <w:rFonts w:ascii="Courier New" w:cs="Courier New" w:eastAsia="Courier New" w:hAnsi="Courier New"/>
+                <w:b w:val="false"/>
+                <w:bCs w:val="false"/>
+                <w:color w:val="1F2937"/>
+                <w:sz w:val="16"/>
+                <w:szCs w:val="16"/>
+                <w:shd w:fill="F1F3F5" w:color="auto" w:val="clear"/>
+                <w:rtl/>
+              </w:rPr>
+              <w:t xml:space="preserve">‎usp_FailDataExport‎</w:t>
+            </w:r>
+            <w:r>
+              <w:rPr>
+                <w:rFonts w:ascii="Arial" w:cs="Arial" w:eastAsia="Arial" w:hAnsi="Arial"/>
+                <w:b w:val="false"/>
+                <w:bCs w:val="false"/>
+                <w:sz w:val="18"/>
+                <w:szCs w:val="18"/>
+                <w:rtl/>
+              </w:rPr>
+              <w:t xml:space="preserve"> و</w:t>
+            </w:r>
+            <w:r>
+              <w:rPr>
+                <w:rFonts w:ascii="Courier New" w:cs="Courier New" w:eastAsia="Courier New" w:hAnsi="Courier New"/>
+                <w:b w:val="false"/>
+                <w:bCs w:val="false"/>
+                <w:color w:val="1F2937"/>
+                <w:sz w:val="16"/>
+                <w:szCs w:val="16"/>
+                <w:shd w:fill="F1F3F5" w:color="auto" w:val="clear"/>
+                <w:rtl/>
+              </w:rPr>
+              <w:t xml:space="preserve">‎usp_ExpireDataExports‎</w:t>
+            </w:r>
+            <w:r>
+              <w:rPr>
+                <w:rFonts w:ascii="Arial" w:cs="Arial" w:eastAsia="Arial" w:hAnsi="Arial"/>
+                <w:b w:val="false"/>
+                <w:bCs w:val="false"/>
+                <w:sz w:val="18"/>
+                <w:szCs w:val="18"/>
+                <w:rtl/>
+              </w:rPr>
+              <w:t xml:space="preserve">، ADR 0008)</w:t>
             </w:r>
           </w:p>
         </w:tc>
@@ -38957,7 +39125,31 @@
           <w:szCs w:val="21"/>
           <w:rtl/>
         </w:rPr>
-        <w:t xml:space="preserve"> (نسخ ملفات الاكتمال، ADR 0006)</w:t>
+        <w:t xml:space="preserve"> (نسخ ملفات الاكتمال، ADR 0006) → </w:t>
+      </w:r>
+      <w:r>
+        <w:rPr>
+          <w:rFonts w:ascii="Courier New" w:cs="Courier New" w:eastAsia="Courier New" w:hAnsi="Courier New"/>
+          <w:b w:val="false"/>
+          <w:bCs w:val="false"/>
+          <w:color w:val="1F2937"/>
+          <w:sz w:val="18"/>
+          <w:szCs w:val="18"/>
+          <w:shd w:fill="F1F3F5" w:color="auto" w:val="clear"/>
+          <w:rtl/>
+        </w:rPr>
+        <w:t xml:space="preserve">‎042_data_export‎</w:t>
+      </w:r>
+      <w:r>
+        <w:rPr>
+          <w:rFonts w:ascii="Arial" w:cs="Arial" w:eastAsia="Arial" w:hAnsi="Arial"/>
+          <w:b w:val="false"/>
+          <w:bCs w:val="false"/>
+          <w:sz w:val="21"/>
+          <w:szCs w:val="21"/>
+          <w:rtl/>
+        </w:rPr>
+        <w:t xml:space="preserve"> (التصدير في كل حالة تسمح به، ADR 0008)</w:t>
       </w:r>
     </w:p>
     <w:p>
@@ -43103,6 +43295,30 @@
                 <w:rtl/>
               </w:rPr>
               <w:t xml:space="preserve"> 7 حالات (صفوف التدقيق التي تكتبها القاعدة، ADR 0007) و</w:t>
+            </w:r>
+            <w:r>
+              <w:rPr>
+                <w:rFonts w:ascii="Courier New" w:cs="Courier New" w:eastAsia="Courier New" w:hAnsi="Courier New"/>
+                <w:b w:val="false"/>
+                <w:bCs w:val="false"/>
+                <w:color w:val="1F2937"/>
+                <w:sz w:val="16"/>
+                <w:szCs w:val="16"/>
+                <w:shd w:fill="F1F3F5" w:color="auto" w:val="clear"/>
+                <w:rtl/>
+              </w:rPr>
+              <w:t xml:space="preserve">‎db/tests/data_export_tests.sql‎</w:t>
+            </w:r>
+            <w:r>
+              <w:rPr>
+                <w:rFonts w:ascii="Arial" w:cs="Arial" w:eastAsia="Arial" w:hAnsi="Arial"/>
+                <w:b w:val="false"/>
+                <w:bCs w:val="false"/>
+                <w:sz w:val="18"/>
+                <w:szCs w:val="18"/>
+                <w:rtl/>
+              </w:rPr>
+              <w:t xml:space="preserve"> 6 حالات (التصدير في المعلّق والمغلق، ADR 0008) و</w:t>
             </w:r>
             <w:r>
               <w:rPr>

</xml_diff>

<commit_message>
ADR 0009 and document updates for the service logins
- ADR 0009: the four logins and their roles, the a/b pair, provisioning by
  a DBA's personal account after deploy.sh, secret files, rotation, the
  guards, what stays operations (migrator, administrators, breakglass, sa,
  SQL Server Audit, secret stores).
- O-25 updated in erd_open_items; ADR 0004 points to ADR 0009.
- Design document (deploy step 14, checks), DOC-S08 (implementation note,
  DQ-S08-8 closed by ADR 0007) and DOC-S11 (provisioning after deploy.sh)
  updated; their Word files, the readiness volumes and the ERD Word file
  rebuilt.

Claude-Session: https://claude.ai/code/session_012HHcRrzuvMBTL2FYxXtsyv
</commit_message>
<xml_diff>
--- a/treasury-platform/docs/20-database-design.docx
+++ b/treasury-platform/docs/20-database-design.docx
@@ -39342,6 +39342,148 @@
     </w:p>
     <w:p>
       <w:pPr>
+        <w:pStyle w:val="ListParagraph"/>
+        <w:numPr>
+          <w:ilvl w:val="0"/>
+          <w:numId w:val="5"/>
+        </w:numPr>
+        <w:bidi/>
+        <w:spacing w:after="70" w:before="0" w:line="300"/>
+      </w:pPr>
+      <w:r>
+        <w:rPr>
+          <w:rFonts w:ascii="Arial" w:cs="Arial" w:eastAsia="Arial" w:hAnsi="Arial"/>
+          <w:b w:val="false"/>
+          <w:bCs w:val="false"/>
+          <w:sz w:val="21"/>
+          <w:szCs w:val="21"/>
+          <w:rtl/>
+        </w:rPr>
+        <w:t xml:space="preserve">بعد النشر، بحساب مدير شخصي يملك إنشاء الحسابات: </w:t>
+      </w:r>
+      <w:r>
+        <w:rPr>
+          <w:rFonts w:ascii="Courier New" w:cs="Courier New" w:eastAsia="Courier New" w:hAnsi="Courier New"/>
+          <w:b w:val="false"/>
+          <w:bCs w:val="false"/>
+          <w:color w:val="1F2937"/>
+          <w:sz w:val="18"/>
+          <w:szCs w:val="18"/>
+          <w:shd w:fill="F1F3F5" w:color="auto" w:val="clear"/>
+          <w:rtl/>
+        </w:rPr>
+        <w:t xml:space="preserve">‎tools/deploy/provision_logins.sh‎</w:t>
+      </w:r>
+      <w:r>
+        <w:rPr>
+          <w:rFonts w:ascii="Arial" w:cs="Arial" w:eastAsia="Arial" w:hAnsi="Arial"/>
+          <w:b w:val="false"/>
+          <w:bCs w:val="false"/>
+          <w:sz w:val="21"/>
+          <w:szCs w:val="21"/>
+          <w:rtl/>
+        </w:rPr>
+        <w:t xml:space="preserve"> ينشئ حسابات الخدمة الأربعة (</w:t>
+      </w:r>
+      <w:r>
+        <w:rPr>
+          <w:rFonts w:ascii="Courier New" w:cs="Courier New" w:eastAsia="Courier New" w:hAnsi="Courier New"/>
+          <w:b w:val="false"/>
+          <w:bCs w:val="false"/>
+          <w:color w:val="1F2937"/>
+          <w:sz w:val="18"/>
+          <w:szCs w:val="18"/>
+          <w:shd w:fill="F1F3F5" w:color="auto" w:val="clear"/>
+          <w:rtl/>
+        </w:rPr>
+        <w:t xml:space="preserve">‎bankfas_app‎</w:t>
+      </w:r>
+      <w:r>
+        <w:rPr>
+          <w:rFonts w:ascii="Arial" w:cs="Arial" w:eastAsia="Arial" w:hAnsi="Arial"/>
+          <w:b w:val="false"/>
+          <w:bCs w:val="false"/>
+          <w:sz w:val="21"/>
+          <w:szCs w:val="21"/>
+          <w:rtl/>
+        </w:rPr>
+        <w:t xml:space="preserve"> و</w:t>
+      </w:r>
+      <w:r>
+        <w:rPr>
+          <w:rFonts w:ascii="Courier New" w:cs="Courier New" w:eastAsia="Courier New" w:hAnsi="Courier New"/>
+          <w:b w:val="false"/>
+          <w:bCs w:val="false"/>
+          <w:color w:val="1F2937"/>
+          <w:sz w:val="18"/>
+          <w:szCs w:val="18"/>
+          <w:shd w:fill="F1F3F5" w:color="auto" w:val="clear"/>
+          <w:rtl/>
+        </w:rPr>
+        <w:t xml:space="preserve">‎bankfas_jobs‎</w:t>
+      </w:r>
+      <w:r>
+        <w:rPr>
+          <w:rFonts w:ascii="Arial" w:cs="Arial" w:eastAsia="Arial" w:hAnsi="Arial"/>
+          <w:b w:val="false"/>
+          <w:bCs w:val="false"/>
+          <w:sz w:val="21"/>
+          <w:szCs w:val="21"/>
+          <w:rtl/>
+        </w:rPr>
+        <w:t xml:space="preserve"> و</w:t>
+      </w:r>
+      <w:r>
+        <w:rPr>
+          <w:rFonts w:ascii="Courier New" w:cs="Courier New" w:eastAsia="Courier New" w:hAnsi="Courier New"/>
+          <w:b w:val="false"/>
+          <w:bCs w:val="false"/>
+          <w:color w:val="1F2937"/>
+          <w:sz w:val="18"/>
+          <w:szCs w:val="18"/>
+          <w:shd w:fill="F1F3F5" w:color="auto" w:val="clear"/>
+          <w:rtl/>
+        </w:rPr>
+        <w:t xml:space="preserve">‎bankfas_platform‎</w:t>
+      </w:r>
+      <w:r>
+        <w:rPr>
+          <w:rFonts w:ascii="Arial" w:cs="Arial" w:eastAsia="Arial" w:hAnsi="Arial"/>
+          <w:b w:val="false"/>
+          <w:bCs w:val="false"/>
+          <w:sz w:val="21"/>
+          <w:szCs w:val="21"/>
+          <w:rtl/>
+        </w:rPr>
+        <w:t xml:space="preserve"> و</w:t>
+      </w:r>
+      <w:r>
+        <w:rPr>
+          <w:rFonts w:ascii="Courier New" w:cs="Courier New" w:eastAsia="Courier New" w:hAnsi="Courier New"/>
+          <w:b w:val="false"/>
+          <w:bCs w:val="false"/>
+          <w:color w:val="1F2937"/>
+          <w:sz w:val="18"/>
+          <w:szCs w:val="18"/>
+          <w:shd w:fill="F1F3F5" w:color="auto" w:val="clear"/>
+          <w:rtl/>
+        </w:rPr>
+        <w:t xml:space="preserve">‎bankfas_support‎</w:t>
+      </w:r>
+      <w:r>
+        <w:rPr>
+          <w:rFonts w:ascii="Arial" w:cs="Arial" w:eastAsia="Arial" w:hAnsi="Arial"/>
+          <w:b w:val="false"/>
+          <w:bCs w:val="false"/>
+          <w:sz w:val="21"/>
+          <w:szCs w:val="21"/>
+          <w:rtl/>
+        </w:rPr>
+        <w:t xml:space="preserve">، كلٌّ بزوج a/b للتدوير) ويربط كلًا بدوره وحده، وأسرارها من ملفات خاصة لا من سطر الأوامر (ADR 0009، DOC-S08)</w:t>
+      </w:r>
+    </w:p>
+    <w:p>
+      <w:pPr>
         <w:bidi/>
         <w:spacing w:after="60" w:before="0"/>
       </w:pPr>
@@ -43319,6 +43461,30 @@
                 <w:rtl/>
               </w:rPr>
               <w:t xml:space="preserve"> 6 حالات (التصدير في المعلّق والمغلق، ADR 0008) و</w:t>
+            </w:r>
+            <w:r>
+              <w:rPr>
+                <w:rFonts w:ascii="Courier New" w:cs="Courier New" w:eastAsia="Courier New" w:hAnsi="Courier New"/>
+                <w:b w:val="false"/>
+                <w:bCs w:val="false"/>
+                <w:color w:val="1F2937"/>
+                <w:sz w:val="16"/>
+                <w:szCs w:val="16"/>
+                <w:shd w:fill="F1F3F5" w:color="auto" w:val="clear"/>
+                <w:rtl/>
+              </w:rPr>
+              <w:t xml:space="preserve">‎tools/ci/service_logins_check.sh‎</w:t>
+            </w:r>
+            <w:r>
+              <w:rPr>
+                <w:rFonts w:ascii="Arial" w:cs="Arial" w:eastAsia="Arial" w:hAnsi="Arial"/>
+                <w:b w:val="false"/>
+                <w:bCs w:val="false"/>
+                <w:sz w:val="18"/>
+                <w:szCs w:val="18"/>
+                <w:rtl/>
+              </w:rPr>
+              <w:t xml:space="preserve"> 6 فحوص (حسابات الخدمة بأسرارها وصلاحياتها، ADR 0009) و</w:t>
             </w:r>
             <w:r>
               <w:rPr>

</xml_diff>

<commit_message>
ADR 0010 and document updates for the deployment as db_owner
- ADR 0010: the administrator's preparation (empty database, disabled
  owner bankfas_owner, deployment login bankfas_migrator in db_owner), the
  deployment window, CI deploying the same way and its checks, the order of
  a production deployment, what stays operations.
- O-02 next step in erd_open_items points to the production path.
- Design document (deploy commands, verification), DOC-S08 (migrator done)
  and DOC-S11 (DQ-S11-1 implemented, DQ-S11-2 proved) updated; their Word
  files, the readiness volumes and the ERD Word file rebuilt.

Claude-Session: https://claude.ai/code/session_012HHcRrzuvMBTL2FYxXtsyv
</commit_message>
<xml_diff>
--- a/treasury-platform/docs/20-database-design.docx
+++ b/treasury-platform/docs/20-database-design.docx
@@ -38301,7 +38301,7 @@
           <w:szCs w:val="17"/>
           <w:rtl w:val="false"/>
         </w:rPr>
-        <w:t xml:space="preserve"># Production (Ubuntu 24.04 LTS, ADR 0001) and CI: the wrapper changes to db/ and runs deploy.sql</w:t>
+        <w:t xml:space="preserve"># Production (Ubuntu 24.04 LTS, ADR 0001) and CI (ADR 0010): an administrator prepares the database once and opens the</w:t>
       </w:r>
     </w:p>
     <w:p>
@@ -38328,7 +38328,142 @@
           <w:szCs w:val="17"/>
           <w:rtl w:val="false"/>
         </w:rPr>
-        <w:t xml:space="preserve">SQL_SERVER=&lt;server&gt; SQL_USER=&lt;login&gt; SQLCMDPASSWORD=&lt;secret&gt; tools/deploy/deploy.sh</w:t>
+        <w:t xml:space="preserve"># window; the deployment login (db_owner only) runs the wrapper, which changes to db/ and runs deploy.sql</w:t>
+      </w:r>
+    </w:p>
+    <w:p>
+      <w:pPr>
+        <w:keepNext/>
+        <w:keepLines/>
+        <w:pBdr>
+          <w:top w:val="single" w:color="BFC9D6" w:sz="4" w:space="4"/>
+          <w:left w:val="single" w:color="BFC9D6" w:sz="4" w:space="4"/>
+          <w:bottom w:val="single" w:color="BFC9D6" w:sz="4" w:space="4"/>
+          <w:right w:val="single" w:color="BFC9D6" w:sz="4" w:space="4"/>
+        </w:pBdr>
+        <w:shd w:fill="F1F3F5" w:color="auto" w:val="clear"/>
+        <w:bidi w:val="false"/>
+        <w:spacing w:after="0" w:before="0" w:line="260"/>
+        <w:ind w:left="120" w:right="120"/>
+        <w:jc w:val="left"/>
+      </w:pPr>
+      <w:r>
+        <w:rPr>
+          <w:rFonts w:ascii="Courier New" w:cs="Courier New" w:eastAsia="Courier New" w:hAnsi="Courier New"/>
+          <w:color w:val="1F2937"/>
+          <w:sz w:val="17"/>
+          <w:szCs w:val="17"/>
+          <w:rtl w:val="false"/>
+        </w:rPr>
+        <w:t xml:space="preserve">tools/deploy/prepare_database.sh prepare            # first time: empty BankFas, owner bankfas_owner, login bankfas_migrator</w:t>
+      </w:r>
+    </w:p>
+    <w:p>
+      <w:pPr>
+        <w:keepNext/>
+        <w:keepLines/>
+        <w:pBdr>
+          <w:top w:val="single" w:color="BFC9D6" w:sz="4" w:space="4"/>
+          <w:left w:val="single" w:color="BFC9D6" w:sz="4" w:space="4"/>
+          <w:bottom w:val="single" w:color="BFC9D6" w:sz="4" w:space="4"/>
+          <w:right w:val="single" w:color="BFC9D6" w:sz="4" w:space="4"/>
+        </w:pBdr>
+        <w:shd w:fill="F1F3F5" w:color="auto" w:val="clear"/>
+        <w:bidi w:val="false"/>
+        <w:spacing w:after="0" w:before="0" w:line="260"/>
+        <w:ind w:left="120" w:right="120"/>
+        <w:jc w:val="left"/>
+      </w:pPr>
+      <w:r>
+        <w:rPr>
+          <w:rFonts w:ascii="Courier New" w:cs="Courier New" w:eastAsia="Courier New" w:hAnsi="Courier New"/>
+          <w:color w:val="1F2937"/>
+          <w:sz w:val="17"/>
+          <w:szCs w:val="17"/>
+          <w:rtl w:val="false"/>
+        </w:rPr>
+        <w:t xml:space="preserve">tools/deploy/prepare_database.sh open</w:t>
+      </w:r>
+    </w:p>
+    <w:p>
+      <w:pPr>
+        <w:keepNext/>
+        <w:keepLines/>
+        <w:pBdr>
+          <w:top w:val="single" w:color="BFC9D6" w:sz="4" w:space="4"/>
+          <w:left w:val="single" w:color="BFC9D6" w:sz="4" w:space="4"/>
+          <w:bottom w:val="single" w:color="BFC9D6" w:sz="4" w:space="4"/>
+          <w:right w:val="single" w:color="BFC9D6" w:sz="4" w:space="4"/>
+        </w:pBdr>
+        <w:shd w:fill="F1F3F5" w:color="auto" w:val="clear"/>
+        <w:bidi w:val="false"/>
+        <w:spacing w:after="0" w:before="0" w:line="260"/>
+        <w:ind w:left="120" w:right="120"/>
+        <w:jc w:val="left"/>
+      </w:pPr>
+      <w:r>
+        <w:rPr>
+          <w:rFonts w:ascii="Courier New" w:cs="Courier New" w:eastAsia="Courier New" w:hAnsi="Courier New"/>
+          <w:color w:val="1F2937"/>
+          <w:sz w:val="17"/>
+          <w:szCs w:val="17"/>
+          <w:rtl w:val="false"/>
+        </w:rPr>
+        <w:t xml:space="preserve">SQL_SERVER=&lt;server&gt; SQL_USER=bankfas_migrator SQLCMDPASSWORD="$(cat &lt;secret file&gt;)" tools/deploy/deploy.sh</w:t>
+      </w:r>
+    </w:p>
+    <w:p>
+      <w:pPr>
+        <w:keepNext/>
+        <w:keepLines/>
+        <w:pBdr>
+          <w:top w:val="single" w:color="BFC9D6" w:sz="4" w:space="4"/>
+          <w:left w:val="single" w:color="BFC9D6" w:sz="4" w:space="4"/>
+          <w:bottom w:val="single" w:color="BFC9D6" w:sz="4" w:space="4"/>
+          <w:right w:val="single" w:color="BFC9D6" w:sz="4" w:space="4"/>
+        </w:pBdr>
+        <w:shd w:fill="F1F3F5" w:color="auto" w:val="clear"/>
+        <w:bidi w:val="false"/>
+        <w:spacing w:after="0" w:before="0" w:line="260"/>
+        <w:ind w:left="120" w:right="120"/>
+        <w:jc w:val="left"/>
+      </w:pPr>
+      <w:r>
+        <w:rPr>
+          <w:rFonts w:ascii="Courier New" w:cs="Courier New" w:eastAsia="Courier New" w:hAnsi="Courier New"/>
+          <w:color w:val="1F2937"/>
+          <w:sz w:val="17"/>
+          <w:szCs w:val="17"/>
+          <w:rtl w:val="false"/>
+        </w:rPr>
+        <w:t xml:space="preserve">tools/deploy/prepare_database.sh close</w:t>
+      </w:r>
+    </w:p>
+    <w:p>
+      <w:pPr>
+        <w:keepNext/>
+        <w:keepLines/>
+        <w:pBdr>
+          <w:top w:val="single" w:color="BFC9D6" w:sz="4" w:space="4"/>
+          <w:left w:val="single" w:color="BFC9D6" w:sz="4" w:space="4"/>
+          <w:bottom w:val="single" w:color="BFC9D6" w:sz="4" w:space="4"/>
+          <w:right w:val="single" w:color="BFC9D6" w:sz="4" w:space="4"/>
+        </w:pBdr>
+        <w:shd w:fill="F1F3F5" w:color="auto" w:val="clear"/>
+        <w:bidi w:val="false"/>
+        <w:spacing w:after="0" w:before="0" w:line="260"/>
+        <w:ind w:left="120" w:right="120"/>
+        <w:jc w:val="left"/>
+      </w:pPr>
+      <w:r>
+        <w:rPr>
+          <w:rFonts w:ascii="Courier New" w:cs="Courier New" w:eastAsia="Courier New" w:hAnsi="Courier New"/>
+          <w:color w:val="1F2937"/>
+          <w:sz w:val="17"/>
+          <w:szCs w:val="17"/>
+          <w:rtl w:val="false"/>
+        </w:rPr>
+        <w:t xml:space="preserve">tools/deploy/provision_logins.sh                    # the service logins (ADR 0009)</w:t>
       </w:r>
     </w:p>
     <w:p>
@@ -43035,7 +43170,55 @@
                 <w:szCs w:val="18"/>
                 <w:rtl/>
               </w:rPr>
-              <w:t xml:space="preserve"> (صورة Ubuntu 24.04، ومرّ أيضًا على صورة RHEL؛ ADR 0001) ثم مطابقة الكائنات المنشورة مع DDL المولَّد</w:t>
+              <w:t xml:space="preserve">، بحساب النشر </w:t>
+            </w:r>
+            <w:r>
+              <w:rPr>
+                <w:rFonts w:ascii="Courier New" w:cs="Courier New" w:eastAsia="Courier New" w:hAnsi="Courier New"/>
+                <w:b w:val="false"/>
+                <w:bCs w:val="false"/>
+                <w:color w:val="1F2937"/>
+                <w:sz w:val="16"/>
+                <w:szCs w:val="16"/>
+                <w:shd w:fill="F1F3F5" w:color="auto" w:val="clear"/>
+                <w:rtl/>
+              </w:rPr>
+              <w:t xml:space="preserve">‎bankfas_migrator‎</w:t>
+            </w:r>
+            <w:r>
+              <w:rPr>
+                <w:rFonts w:ascii="Arial" w:cs="Arial" w:eastAsia="Arial" w:hAnsi="Arial"/>
+                <w:b w:val="false"/>
+                <w:bCs w:val="false"/>
+                <w:sz w:val="18"/>
+                <w:szCs w:val="18"/>
+                <w:rtl/>
+              </w:rPr>
+              <w:t xml:space="preserve"> وصلاحية </w:t>
+            </w:r>
+            <w:r>
+              <w:rPr>
+                <w:rFonts w:ascii="Courier New" w:cs="Courier New" w:eastAsia="Courier New" w:hAnsi="Courier New"/>
+                <w:b w:val="false"/>
+                <w:bCs w:val="false"/>
+                <w:color w:val="1F2937"/>
+                <w:sz w:val="16"/>
+                <w:szCs w:val="16"/>
+                <w:shd w:fill="F1F3F5" w:color="auto" w:val="clear"/>
+                <w:rtl/>
+              </w:rPr>
+              <w:t xml:space="preserve">‎db_owner‎</w:t>
+            </w:r>
+            <w:r>
+              <w:rPr>
+                <w:rFonts w:ascii="Arial" w:cs="Arial" w:eastAsia="Arial" w:hAnsi="Arial"/>
+                <w:b w:val="false"/>
+                <w:bCs w:val="false"/>
+                <w:sz w:val="18"/>
+                <w:szCs w:val="18"/>
+                <w:rtl/>
+              </w:rPr>
+              <w:t xml:space="preserve"> وحدها كما في الإنتاج (ADR 0010) (صورة Ubuntu 24.04، ومرّ أيضًا على صورة RHEL؛ ADR 0001) ثم مطابقة الكائنات المنشورة مع DDL المولَّد</w:t>
             </w:r>
           </w:p>
         </w:tc>

</xml_diff>

<commit_message>
Register of recommendations for the 40 open design-review findings (O-15)
Each major and minor finding was re-checked against the current model, generated DDL and static
scripts, claim by claim, and the proposed model edits were tried on a scratch copy (dbgen check and
build pass). One finding is already resolved (DR-20) and four are partly resolved by later work.
The register recommends a batch to apply now (33 findings in whole or part), the parts that must
land before their slice, the sub-recommendations to reject with reasons, and ten business questions
with proposed answers. Awaiting the owner's approval; no schema change yet.

Co-Authored-By: Claude Opus 5.5 <noreply@anthropic.com>
Claude-Session: https://claude.ai/code/session_012HHcRrzuvMBTL2FYxXtsyv
</commit_message>
<xml_diff>
--- a/treasury-platform/docs/20-database-design.docx
+++ b/treasury-platform/docs/20-database-design.docx
@@ -47344,10 +47344,10 @@
         </w:tblBorders>
       </w:tblPr>
       <w:tblGrid>
-        <w:gridCol w:w="946"/>
-        <w:gridCol w:w="3421"/>
-        <w:gridCol w:w="1659"/>
-        <w:gridCol w:w="3838"/>
+        <w:gridCol w:w="942"/>
+        <w:gridCol w:w="3998"/>
+        <w:gridCol w:w="1486"/>
+        <w:gridCol w:w="3438"/>
       </w:tblGrid>
       <w:tr>
         <w:trPr>
@@ -47356,7 +47356,7 @@
         </w:trPr>
         <w:tc>
           <w:tcPr>
-            <w:tcW w:type="dxa" w:w="946"/>
+            <w:tcW w:type="dxa" w:w="942"/>
             <w:tcBorders>
               <w:top w:val="single" w:color="BFC9D6" w:sz="4"/>
               <w:left w:val="single" w:color="BFC9D6" w:sz="4"/>
@@ -47394,7 +47394,7 @@
         </w:tc>
         <w:tc>
           <w:tcPr>
-            <w:tcW w:type="dxa" w:w="3421"/>
+            <w:tcW w:type="dxa" w:w="3998"/>
             <w:tcBorders>
               <w:top w:val="single" w:color="BFC9D6" w:sz="4"/>
               <w:left w:val="single" w:color="BFC9D6" w:sz="4"/>
@@ -47432,7 +47432,7 @@
         </w:tc>
         <w:tc>
           <w:tcPr>
-            <w:tcW w:type="dxa" w:w="1659"/>
+            <w:tcW w:type="dxa" w:w="1486"/>
             <w:tcBorders>
               <w:top w:val="single" w:color="BFC9D6" w:sz="4"/>
               <w:left w:val="single" w:color="BFC9D6" w:sz="4"/>
@@ -47470,7 +47470,7 @@
         </w:tc>
         <w:tc>
           <w:tcPr>
-            <w:tcW w:type="dxa" w:w="3838"/>
+            <w:tcW w:type="dxa" w:w="3438"/>
             <w:tcBorders>
               <w:top w:val="single" w:color="BFC9D6" w:sz="4"/>
               <w:left w:val="single" w:color="BFC9D6" w:sz="4"/>
@@ -47513,7 +47513,7 @@
         </w:trPr>
         <w:tc>
           <w:tcPr>
-            <w:tcW w:type="dxa" w:w="946"/>
+            <w:tcW w:type="dxa" w:w="942"/>
             <w:tcBorders>
               <w:top w:val="single" w:color="BFC9D6" w:sz="4"/>
               <w:left w:val="single" w:color="BFC9D6" w:sz="4"/>
@@ -47549,7 +47549,7 @@
         </w:tc>
         <w:tc>
           <w:tcPr>
-            <w:tcW w:type="dxa" w:w="3421"/>
+            <w:tcW w:type="dxa" w:w="3998"/>
             <w:tcBorders>
               <w:top w:val="single" w:color="BFC9D6" w:sz="4"/>
               <w:left w:val="single" w:color="BFC9D6" w:sz="4"/>
@@ -47596,7 +47596,7 @@
         </w:tc>
         <w:tc>
           <w:tcPr>
-            <w:tcW w:type="dxa" w:w="1659"/>
+            <w:tcW w:type="dxa" w:w="1486"/>
             <w:tcBorders>
               <w:top w:val="single" w:color="BFC9D6" w:sz="4"/>
               <w:left w:val="single" w:color="BFC9D6" w:sz="4"/>
@@ -47667,7 +47667,7 @@
         </w:tc>
         <w:tc>
           <w:tcPr>
-            <w:tcW w:type="dxa" w:w="3838"/>
+            <w:tcW w:type="dxa" w:w="3438"/>
             <w:tcBorders>
               <w:top w:val="single" w:color="BFC9D6" w:sz="4"/>
               <w:left w:val="single" w:color="BFC9D6" w:sz="4"/>
@@ -47732,7 +47732,7 @@
         </w:trPr>
         <w:tc>
           <w:tcPr>
-            <w:tcW w:type="dxa" w:w="946"/>
+            <w:tcW w:type="dxa" w:w="942"/>
             <w:tcBorders>
               <w:top w:val="single" w:color="BFC9D6" w:sz="4"/>
               <w:left w:val="single" w:color="BFC9D6" w:sz="4"/>
@@ -47769,7 +47769,7 @@
         </w:tc>
         <w:tc>
           <w:tcPr>
-            <w:tcW w:type="dxa" w:w="3421"/>
+            <w:tcW w:type="dxa" w:w="3998"/>
             <w:tcBorders>
               <w:top w:val="single" w:color="BFC9D6" w:sz="4"/>
               <w:left w:val="single" w:color="BFC9D6" w:sz="4"/>
@@ -47806,7 +47806,7 @@
         </w:tc>
         <w:tc>
           <w:tcPr>
-            <w:tcW w:type="dxa" w:w="1659"/>
+            <w:tcW w:type="dxa" w:w="1486"/>
             <w:tcBorders>
               <w:top w:val="single" w:color="BFC9D6" w:sz="4"/>
               <w:left w:val="single" w:color="BFC9D6" w:sz="4"/>
@@ -47843,7 +47843,7 @@
         </w:tc>
         <w:tc>
           <w:tcPr>
-            <w:tcW w:type="dxa" w:w="3838"/>
+            <w:tcW w:type="dxa" w:w="3438"/>
             <w:tcBorders>
               <w:top w:val="single" w:color="BFC9D6" w:sz="4"/>
               <w:left w:val="single" w:color="BFC9D6" w:sz="4"/>
@@ -47885,7 +47885,7 @@
         </w:trPr>
         <w:tc>
           <w:tcPr>
-            <w:tcW w:type="dxa" w:w="946"/>
+            <w:tcW w:type="dxa" w:w="942"/>
             <w:tcBorders>
               <w:top w:val="single" w:color="BFC9D6" w:sz="4"/>
               <w:left w:val="single" w:color="BFC9D6" w:sz="4"/>
@@ -47921,7 +47921,7 @@
         </w:tc>
         <w:tc>
           <w:tcPr>
-            <w:tcW w:type="dxa" w:w="3421"/>
+            <w:tcW w:type="dxa" w:w="3998"/>
             <w:tcBorders>
               <w:top w:val="single" w:color="BFC9D6" w:sz="4"/>
               <w:left w:val="single" w:color="BFC9D6" w:sz="4"/>
@@ -47957,7 +47957,7 @@
         </w:tc>
         <w:tc>
           <w:tcPr>
-            <w:tcW w:type="dxa" w:w="1659"/>
+            <w:tcW w:type="dxa" w:w="1486"/>
             <w:tcBorders>
               <w:top w:val="single" w:color="BFC9D6" w:sz="4"/>
               <w:left w:val="single" w:color="BFC9D6" w:sz="4"/>
@@ -48004,7 +48004,7 @@
         </w:tc>
         <w:tc>
           <w:tcPr>
-            <w:tcW w:type="dxa" w:w="3838"/>
+            <w:tcW w:type="dxa" w:w="3438"/>
             <w:tcBorders>
               <w:top w:val="single" w:color="BFC9D6" w:sz="4"/>
               <w:left w:val="single" w:color="BFC9D6" w:sz="4"/>
@@ -48045,7 +48045,7 @@
         </w:trPr>
         <w:tc>
           <w:tcPr>
-            <w:tcW w:type="dxa" w:w="946"/>
+            <w:tcW w:type="dxa" w:w="942"/>
             <w:tcBorders>
               <w:top w:val="single" w:color="BFC9D6" w:sz="4"/>
               <w:left w:val="single" w:color="BFC9D6" w:sz="4"/>
@@ -48082,7 +48082,7 @@
         </w:tc>
         <w:tc>
           <w:tcPr>
-            <w:tcW w:type="dxa" w:w="3421"/>
+            <w:tcW w:type="dxa" w:w="3998"/>
             <w:tcBorders>
               <w:top w:val="single" w:color="BFC9D6" w:sz="4"/>
               <w:left w:val="single" w:color="BFC9D6" w:sz="4"/>
@@ -48132,7 +48132,7 @@
         </w:tc>
         <w:tc>
           <w:tcPr>
-            <w:tcW w:type="dxa" w:w="1659"/>
+            <w:tcW w:type="dxa" w:w="1486"/>
             <w:tcBorders>
               <w:top w:val="single" w:color="BFC9D6" w:sz="4"/>
               <w:left w:val="single" w:color="BFC9D6" w:sz="4"/>
@@ -48169,7 +48169,7 @@
         </w:tc>
         <w:tc>
           <w:tcPr>
-            <w:tcW w:type="dxa" w:w="3838"/>
+            <w:tcW w:type="dxa" w:w="3438"/>
             <w:tcBorders>
               <w:top w:val="single" w:color="BFC9D6" w:sz="4"/>
               <w:left w:val="single" w:color="BFC9D6" w:sz="4"/>
@@ -48211,7 +48211,7 @@
         </w:trPr>
         <w:tc>
           <w:tcPr>
-            <w:tcW w:type="dxa" w:w="946"/>
+            <w:tcW w:type="dxa" w:w="942"/>
             <w:tcBorders>
               <w:top w:val="single" w:color="BFC9D6" w:sz="4"/>
               <w:left w:val="single" w:color="BFC9D6" w:sz="4"/>
@@ -48247,7 +48247,7 @@
         </w:tc>
         <w:tc>
           <w:tcPr>
-            <w:tcW w:type="dxa" w:w="3421"/>
+            <w:tcW w:type="dxa" w:w="3998"/>
             <w:tcBorders>
               <w:top w:val="single" w:color="BFC9D6" w:sz="4"/>
               <w:left w:val="single" w:color="BFC9D6" w:sz="4"/>
@@ -48283,7 +48283,7 @@
         </w:tc>
         <w:tc>
           <w:tcPr>
-            <w:tcW w:type="dxa" w:w="1659"/>
+            <w:tcW w:type="dxa" w:w="1486"/>
             <w:tcBorders>
               <w:top w:val="single" w:color="BFC9D6" w:sz="4"/>
               <w:left w:val="single" w:color="BFC9D6" w:sz="4"/>
@@ -48319,7 +48319,7 @@
         </w:tc>
         <w:tc>
           <w:tcPr>
-            <w:tcW w:type="dxa" w:w="3838"/>
+            <w:tcW w:type="dxa" w:w="3438"/>
             <w:tcBorders>
               <w:top w:val="single" w:color="BFC9D6" w:sz="4"/>
               <w:left w:val="single" w:color="BFC9D6" w:sz="4"/>
@@ -48360,7 +48360,7 @@
         </w:trPr>
         <w:tc>
           <w:tcPr>
-            <w:tcW w:type="dxa" w:w="946"/>
+            <w:tcW w:type="dxa" w:w="942"/>
             <w:tcBorders>
               <w:top w:val="single" w:color="BFC9D6" w:sz="4"/>
               <w:left w:val="single" w:color="BFC9D6" w:sz="4"/>
@@ -48397,7 +48397,7 @@
         </w:tc>
         <w:tc>
           <w:tcPr>
-            <w:tcW w:type="dxa" w:w="3421"/>
+            <w:tcW w:type="dxa" w:w="3998"/>
             <w:tcBorders>
               <w:top w:val="single" w:color="BFC9D6" w:sz="4"/>
               <w:left w:val="single" w:color="BFC9D6" w:sz="4"/>
@@ -48434,7 +48434,7 @@
         </w:tc>
         <w:tc>
           <w:tcPr>
-            <w:tcW w:type="dxa" w:w="1659"/>
+            <w:tcW w:type="dxa" w:w="1486"/>
             <w:tcBorders>
               <w:top w:val="single" w:color="BFC9D6" w:sz="4"/>
               <w:left w:val="single" w:color="BFC9D6" w:sz="4"/>
@@ -48471,7 +48471,7 @@
         </w:tc>
         <w:tc>
           <w:tcPr>
-            <w:tcW w:type="dxa" w:w="3838"/>
+            <w:tcW w:type="dxa" w:w="3438"/>
             <w:tcBorders>
               <w:top w:val="single" w:color="BFC9D6" w:sz="4"/>
               <w:left w:val="single" w:color="BFC9D6" w:sz="4"/>
@@ -48513,7 +48513,7 @@
         </w:trPr>
         <w:tc>
           <w:tcPr>
-            <w:tcW w:type="dxa" w:w="946"/>
+            <w:tcW w:type="dxa" w:w="942"/>
             <w:tcBorders>
               <w:top w:val="single" w:color="BFC9D6" w:sz="4"/>
               <w:left w:val="single" w:color="BFC9D6" w:sz="4"/>
@@ -48549,7 +48549,7 @@
         </w:tc>
         <w:tc>
           <w:tcPr>
-            <w:tcW w:type="dxa" w:w="3421"/>
+            <w:tcW w:type="dxa" w:w="3998"/>
             <w:tcBorders>
               <w:top w:val="single" w:color="BFC9D6" w:sz="4"/>
               <w:left w:val="single" w:color="BFC9D6" w:sz="4"/>
@@ -48585,7 +48585,7 @@
         </w:tc>
         <w:tc>
           <w:tcPr>
-            <w:tcW w:type="dxa" w:w="1659"/>
+            <w:tcW w:type="dxa" w:w="1486"/>
             <w:tcBorders>
               <w:top w:val="single" w:color="BFC9D6" w:sz="4"/>
               <w:left w:val="single" w:color="BFC9D6" w:sz="4"/>
@@ -48621,7 +48621,7 @@
         </w:tc>
         <w:tc>
           <w:tcPr>
-            <w:tcW w:type="dxa" w:w="3838"/>
+            <w:tcW w:type="dxa" w:w="3438"/>
             <w:tcBorders>
               <w:top w:val="single" w:color="BFC9D6" w:sz="4"/>
               <w:left w:val="single" w:color="BFC9D6" w:sz="4"/>
@@ -48675,7 +48675,7 @@
         </w:trPr>
         <w:tc>
           <w:tcPr>
-            <w:tcW w:type="dxa" w:w="946"/>
+            <w:tcW w:type="dxa" w:w="942"/>
             <w:tcBorders>
               <w:top w:val="single" w:color="BFC9D6" w:sz="4"/>
               <w:left w:val="single" w:color="BFC9D6" w:sz="4"/>
@@ -48712,7 +48712,7 @@
         </w:tc>
         <w:tc>
           <w:tcPr>
-            <w:tcW w:type="dxa" w:w="3421"/>
+            <w:tcW w:type="dxa" w:w="3998"/>
             <w:tcBorders>
               <w:top w:val="single" w:color="BFC9D6" w:sz="4"/>
               <w:left w:val="single" w:color="BFC9D6" w:sz="4"/>
@@ -48749,7 +48749,7 @@
         </w:tc>
         <w:tc>
           <w:tcPr>
-            <w:tcW w:type="dxa" w:w="1659"/>
+            <w:tcW w:type="dxa" w:w="1486"/>
             <w:tcBorders>
               <w:top w:val="single" w:color="BFC9D6" w:sz="4"/>
               <w:left w:val="single" w:color="BFC9D6" w:sz="4"/>
@@ -48786,7 +48786,7 @@
         </w:tc>
         <w:tc>
           <w:tcPr>
-            <w:tcW w:type="dxa" w:w="3838"/>
+            <w:tcW w:type="dxa" w:w="3438"/>
             <w:tcBorders>
               <w:top w:val="single" w:color="BFC9D6" w:sz="4"/>
               <w:left w:val="single" w:color="BFC9D6" w:sz="4"/>
@@ -48828,7 +48828,7 @@
         </w:trPr>
         <w:tc>
           <w:tcPr>
-            <w:tcW w:type="dxa" w:w="946"/>
+            <w:tcW w:type="dxa" w:w="942"/>
             <w:tcBorders>
               <w:top w:val="single" w:color="BFC9D6" w:sz="4"/>
               <w:left w:val="single" w:color="BFC9D6" w:sz="4"/>
@@ -48864,7 +48864,7 @@
         </w:tc>
         <w:tc>
           <w:tcPr>
-            <w:tcW w:type="dxa" w:w="3421"/>
+            <w:tcW w:type="dxa" w:w="3998"/>
             <w:tcBorders>
               <w:top w:val="single" w:color="BFC9D6" w:sz="4"/>
               <w:left w:val="single" w:color="BFC9D6" w:sz="4"/>
@@ -48911,7 +48911,7 @@
         </w:tc>
         <w:tc>
           <w:tcPr>
-            <w:tcW w:type="dxa" w:w="1659"/>
+            <w:tcW w:type="dxa" w:w="1486"/>
             <w:tcBorders>
               <w:top w:val="single" w:color="BFC9D6" w:sz="4"/>
               <w:left w:val="single" w:color="BFC9D6" w:sz="4"/>
@@ -48947,7 +48947,7 @@
         </w:tc>
         <w:tc>
           <w:tcPr>
-            <w:tcW w:type="dxa" w:w="3838"/>
+            <w:tcW w:type="dxa" w:w="3438"/>
             <w:tcBorders>
               <w:top w:val="single" w:color="BFC9D6" w:sz="4"/>
               <w:left w:val="single" w:color="BFC9D6" w:sz="4"/>
@@ -49071,7 +49071,7 @@
         </w:trPr>
         <w:tc>
           <w:tcPr>
-            <w:tcW w:type="dxa" w:w="946"/>
+            <w:tcW w:type="dxa" w:w="942"/>
             <w:tcBorders>
               <w:top w:val="single" w:color="BFC9D6" w:sz="4"/>
               <w:left w:val="single" w:color="BFC9D6" w:sz="4"/>
@@ -49108,7 +49108,7 @@
         </w:tc>
         <w:tc>
           <w:tcPr>
-            <w:tcW w:type="dxa" w:w="3421"/>
+            <w:tcW w:type="dxa" w:w="3998"/>
             <w:tcBorders>
               <w:top w:val="single" w:color="BFC9D6" w:sz="4"/>
               <w:left w:val="single" w:color="BFC9D6" w:sz="4"/>
@@ -49156,7 +49156,7 @@
         </w:tc>
         <w:tc>
           <w:tcPr>
-            <w:tcW w:type="dxa" w:w="1659"/>
+            <w:tcW w:type="dxa" w:w="1486"/>
             <w:tcBorders>
               <w:top w:val="single" w:color="BFC9D6" w:sz="4"/>
               <w:left w:val="single" w:color="BFC9D6" w:sz="4"/>
@@ -49193,7 +49193,7 @@
         </w:tc>
         <w:tc>
           <w:tcPr>
-            <w:tcW w:type="dxa" w:w="3838"/>
+            <w:tcW w:type="dxa" w:w="3438"/>
             <w:tcBorders>
               <w:top w:val="single" w:color="BFC9D6" w:sz="4"/>
               <w:left w:val="single" w:color="BFC9D6" w:sz="4"/>
@@ -49342,7 +49342,7 @@
         </w:trPr>
         <w:tc>
           <w:tcPr>
-            <w:tcW w:type="dxa" w:w="946"/>
+            <w:tcW w:type="dxa" w:w="942"/>
             <w:tcBorders>
               <w:top w:val="single" w:color="BFC9D6" w:sz="4"/>
               <w:left w:val="single" w:color="BFC9D6" w:sz="4"/>
@@ -49378,7 +49378,7 @@
         </w:tc>
         <w:tc>
           <w:tcPr>
-            <w:tcW w:type="dxa" w:w="3421"/>
+            <w:tcW w:type="dxa" w:w="3998"/>
             <w:tcBorders>
               <w:top w:val="single" w:color="BFC9D6" w:sz="4"/>
               <w:left w:val="single" w:color="BFC9D6" w:sz="4"/>
@@ -49425,7 +49425,7 @@
         </w:tc>
         <w:tc>
           <w:tcPr>
-            <w:tcW w:type="dxa" w:w="1659"/>
+            <w:tcW w:type="dxa" w:w="1486"/>
             <w:tcBorders>
               <w:top w:val="single" w:color="BFC9D6" w:sz="4"/>
               <w:left w:val="single" w:color="BFC9D6" w:sz="4"/>
@@ -49472,7 +49472,7 @@
         </w:tc>
         <w:tc>
           <w:tcPr>
-            <w:tcW w:type="dxa" w:w="3838"/>
+            <w:tcW w:type="dxa" w:w="3438"/>
             <w:tcBorders>
               <w:top w:val="single" w:color="BFC9D6" w:sz="4"/>
               <w:left w:val="single" w:color="BFC9D6" w:sz="4"/>
@@ -49513,7 +49513,7 @@
         </w:trPr>
         <w:tc>
           <w:tcPr>
-            <w:tcW w:type="dxa" w:w="946"/>
+            <w:tcW w:type="dxa" w:w="942"/>
             <w:tcBorders>
               <w:top w:val="single" w:color="BFC9D6" w:sz="4"/>
               <w:left w:val="single" w:color="BFC9D6" w:sz="4"/>
@@ -49550,7 +49550,7 @@
         </w:tc>
         <w:tc>
           <w:tcPr>
-            <w:tcW w:type="dxa" w:w="3421"/>
+            <w:tcW w:type="dxa" w:w="3998"/>
             <w:tcBorders>
               <w:top w:val="single" w:color="BFC9D6" w:sz="4"/>
               <w:left w:val="single" w:color="BFC9D6" w:sz="4"/>
@@ -49587,7 +49587,7 @@
         </w:tc>
         <w:tc>
           <w:tcPr>
-            <w:tcW w:type="dxa" w:w="1659"/>
+            <w:tcW w:type="dxa" w:w="1486"/>
             <w:tcBorders>
               <w:top w:val="single" w:color="BFC9D6" w:sz="4"/>
               <w:left w:val="single" w:color="BFC9D6" w:sz="4"/>
@@ -49648,7 +49648,7 @@
         </w:tc>
         <w:tc>
           <w:tcPr>
-            <w:tcW w:type="dxa" w:w="3838"/>
+            <w:tcW w:type="dxa" w:w="3438"/>
             <w:tcBorders>
               <w:top w:val="single" w:color="BFC9D6" w:sz="4"/>
               <w:left w:val="single" w:color="BFC9D6" w:sz="4"/>
@@ -49773,7 +49773,7 @@
         </w:trPr>
         <w:tc>
           <w:tcPr>
-            <w:tcW w:type="dxa" w:w="946"/>
+            <w:tcW w:type="dxa" w:w="942"/>
             <w:tcBorders>
               <w:top w:val="single" w:color="BFC9D6" w:sz="4"/>
               <w:left w:val="single" w:color="BFC9D6" w:sz="4"/>
@@ -49809,7 +49809,7 @@
         </w:tc>
         <w:tc>
           <w:tcPr>
-            <w:tcW w:type="dxa" w:w="3421"/>
+            <w:tcW w:type="dxa" w:w="3998"/>
             <w:tcBorders>
               <w:top w:val="single" w:color="BFC9D6" w:sz="4"/>
               <w:left w:val="single" w:color="BFC9D6" w:sz="4"/>
@@ -49856,7 +49856,7 @@
         </w:tc>
         <w:tc>
           <w:tcPr>
-            <w:tcW w:type="dxa" w:w="1659"/>
+            <w:tcW w:type="dxa" w:w="1486"/>
             <w:tcBorders>
               <w:top w:val="single" w:color="BFC9D6" w:sz="4"/>
               <w:left w:val="single" w:color="BFC9D6" w:sz="4"/>
@@ -49892,7 +49892,7 @@
         </w:tc>
         <w:tc>
           <w:tcPr>
-            <w:tcW w:type="dxa" w:w="3838"/>
+            <w:tcW w:type="dxa" w:w="3438"/>
             <w:tcBorders>
               <w:top w:val="single" w:color="BFC9D6" w:sz="4"/>
               <w:left w:val="single" w:color="BFC9D6" w:sz="4"/>
@@ -49933,7 +49933,7 @@
         </w:trPr>
         <w:tc>
           <w:tcPr>
-            <w:tcW w:type="dxa" w:w="946"/>
+            <w:tcW w:type="dxa" w:w="942"/>
             <w:tcBorders>
               <w:top w:val="single" w:color="BFC9D6" w:sz="4"/>
               <w:left w:val="single" w:color="BFC9D6" w:sz="4"/>
@@ -49970,7 +49970,7 @@
         </w:tc>
         <w:tc>
           <w:tcPr>
-            <w:tcW w:type="dxa" w:w="3421"/>
+            <w:tcW w:type="dxa" w:w="3998"/>
             <w:tcBorders>
               <w:top w:val="single" w:color="BFC9D6" w:sz="4"/>
               <w:left w:val="single" w:color="BFC9D6" w:sz="4"/>
@@ -50007,7 +50007,7 @@
         </w:tc>
         <w:tc>
           <w:tcPr>
-            <w:tcW w:type="dxa" w:w="1659"/>
+            <w:tcW w:type="dxa" w:w="1486"/>
             <w:tcBorders>
               <w:top w:val="single" w:color="BFC9D6" w:sz="4"/>
               <w:left w:val="single" w:color="BFC9D6" w:sz="4"/>
@@ -50044,7 +50044,7 @@
         </w:tc>
         <w:tc>
           <w:tcPr>
-            <w:tcW w:type="dxa" w:w="3838"/>
+            <w:tcW w:type="dxa" w:w="3438"/>
             <w:tcBorders>
               <w:top w:val="single" w:color="BFC9D6" w:sz="4"/>
               <w:left w:val="single" w:color="BFC9D6" w:sz="4"/>
@@ -50086,7 +50086,7 @@
         </w:trPr>
         <w:tc>
           <w:tcPr>
-            <w:tcW w:type="dxa" w:w="946"/>
+            <w:tcW w:type="dxa" w:w="942"/>
             <w:tcBorders>
               <w:top w:val="single" w:color="BFC9D6" w:sz="4"/>
               <w:left w:val="single" w:color="BFC9D6" w:sz="4"/>
@@ -50122,7 +50122,7 @@
         </w:tc>
         <w:tc>
           <w:tcPr>
-            <w:tcW w:type="dxa" w:w="3421"/>
+            <w:tcW w:type="dxa" w:w="3998"/>
             <w:tcBorders>
               <w:top w:val="single" w:color="BFC9D6" w:sz="4"/>
               <w:left w:val="single" w:color="BFC9D6" w:sz="4"/>
@@ -50163,79 +50163,138 @@
                 <w:szCs w:val="18"/>
                 <w:rtl/>
               </w:rPr>
-              <w:t xml:space="preserve"> من المراجعة (§18.2) لم تُعتمد بعد</w:t>
-            </w:r>
-          </w:p>
-        </w:tc>
-        <w:tc>
-          <w:tcPr>
-            <w:tcW w:type="dxa" w:w="1659"/>
-            <w:tcBorders>
-              <w:top w:val="single" w:color="BFC9D6" w:sz="4"/>
-              <w:left w:val="single" w:color="BFC9D6" w:sz="4"/>
-              <w:bottom w:val="single" w:color="BFC9D6" w:sz="4"/>
-              <w:right w:val="single" w:color="BFC9D6" w:sz="4"/>
-            </w:tcBorders>
-            <w:tcMar>
-              <w:top w:type="dxa" w:w="50"/>
-              <w:left w:type="dxa" w:w="90"/>
-              <w:bottom w:type="dxa" w:w="50"/>
-              <w:right w:type="dxa" w:w="90"/>
-            </w:tcMar>
-            <w:vAlign w:val="top"/>
-          </w:tcPr>
-          <w:p>
-            <w:pPr>
-              <w:keepNext w:val="false"/>
-              <w:bidi/>
-              <w:spacing w:after="30" w:before="30" w:line="264"/>
-            </w:pPr>
-            <w:r>
-              <w:rPr>
-                <w:rFonts w:ascii="Arial" w:cs="Arial" w:eastAsia="Arial" w:hAnsi="Arial"/>
-                <w:b w:val="false"/>
-                <w:bCs w:val="false"/>
-                <w:sz w:val="18"/>
-                <w:szCs w:val="18"/>
-                <w:rtl/>
-              </w:rPr>
-              <w:t xml:space="preserve">بعضها يغيّر أعمدة أو قيودًا، فيتغير الـDDL قبل S0</w:t>
-            </w:r>
-          </w:p>
-        </w:tc>
-        <w:tc>
-          <w:tcPr>
-            <w:tcW w:type="dxa" w:w="3838"/>
-            <w:tcBorders>
-              <w:top w:val="single" w:color="BFC9D6" w:sz="4"/>
-              <w:left w:val="single" w:color="BFC9D6" w:sz="4"/>
-              <w:bottom w:val="single" w:color="BFC9D6" w:sz="4"/>
-              <w:right w:val="single" w:color="BFC9D6" w:sz="4"/>
-            </w:tcBorders>
-            <w:tcMar>
-              <w:top w:type="dxa" w:w="50"/>
-              <w:left w:type="dxa" w:w="90"/>
-              <w:bottom w:type="dxa" w:w="50"/>
-              <w:right w:type="dxa" w:w="90"/>
-            </w:tcMar>
-            <w:vAlign w:val="top"/>
-          </w:tcPr>
-          <w:p>
-            <w:pPr>
-              <w:keepNext w:val="false"/>
-              <w:bidi/>
-              <w:spacing w:after="30" w:before="30" w:line="264"/>
-            </w:pPr>
-            <w:r>
-              <w:rPr>
-                <w:rFonts w:ascii="Arial" w:cs="Arial" w:eastAsia="Arial" w:hAnsi="Arial"/>
-                <w:b w:val="false"/>
-                <w:bCs w:val="false"/>
-                <w:sz w:val="18"/>
-                <w:szCs w:val="18"/>
-                <w:rtl/>
-              </w:rPr>
-              <w:t xml:space="preserve">قرار لكل نتيجة: تُطبَّق قبل S0، أو تُؤجَّل بسبب مكتوب</w:t>
+              <w:t xml:space="preserve"> من المراجعة (</w:t>
+            </w:r>
+            <w:r>
+              <w:rPr>
+                <w:rFonts w:ascii="Courier New" w:cs="Courier New" w:eastAsia="Courier New" w:hAnsi="Courier New"/>
+                <w:b w:val="false"/>
+                <w:bCs w:val="false"/>
+                <w:color w:val="1F2937"/>
+                <w:sz w:val="16"/>
+                <w:szCs w:val="16"/>
+                <w:shd w:fill="F1F3F5" w:color="auto" w:val="clear"/>
+                <w:rtl/>
+              </w:rPr>
+              <w:t xml:space="preserve">‎docs/review/design-review-2026-10-11.json‎</w:t>
+            </w:r>
+            <w:r>
+              <w:rPr>
+                <w:rFonts w:ascii="Arial" w:cs="Arial" w:eastAsia="Arial" w:hAnsi="Arial"/>
+                <w:b w:val="false"/>
+                <w:bCs w:val="false"/>
+                <w:sz w:val="18"/>
+                <w:szCs w:val="18"/>
+                <w:rtl/>
+              </w:rPr>
+              <w:t xml:space="preserve">) لم تُعتمد بعد</w:t>
+            </w:r>
+          </w:p>
+        </w:tc>
+        <w:tc>
+          <w:tcPr>
+            <w:tcW w:type="dxa" w:w="1486"/>
+            <w:tcBorders>
+              <w:top w:val="single" w:color="BFC9D6" w:sz="4"/>
+              <w:left w:val="single" w:color="BFC9D6" w:sz="4"/>
+              <w:bottom w:val="single" w:color="BFC9D6" w:sz="4"/>
+              <w:right w:val="single" w:color="BFC9D6" w:sz="4"/>
+            </w:tcBorders>
+            <w:tcMar>
+              <w:top w:type="dxa" w:w="50"/>
+              <w:left w:type="dxa" w:w="90"/>
+              <w:bottom w:type="dxa" w:w="50"/>
+              <w:right w:type="dxa" w:w="90"/>
+            </w:tcMar>
+            <w:vAlign w:val="top"/>
+          </w:tcPr>
+          <w:p>
+            <w:pPr>
+              <w:keepNext w:val="false"/>
+              <w:bidi/>
+              <w:spacing w:after="30" w:before="30" w:line="264"/>
+            </w:pPr>
+            <w:r>
+              <w:rPr>
+                <w:rFonts w:ascii="Arial" w:cs="Arial" w:eastAsia="Arial" w:hAnsi="Arial"/>
+                <w:b w:val="false"/>
+                <w:bCs w:val="false"/>
+                <w:sz w:val="18"/>
+                <w:szCs w:val="18"/>
+                <w:rtl/>
+              </w:rPr>
+              <w:t xml:space="preserve">بعضها يغيّر أعمدة أو قيودًا، فيتغير الـDDL قبل كود جدولها</w:t>
+            </w:r>
+          </w:p>
+        </w:tc>
+        <w:tc>
+          <w:tcPr>
+            <w:tcW w:type="dxa" w:w="3438"/>
+            <w:tcBorders>
+              <w:top w:val="single" w:color="BFC9D6" w:sz="4"/>
+              <w:left w:val="single" w:color="BFC9D6" w:sz="4"/>
+              <w:bottom w:val="single" w:color="BFC9D6" w:sz="4"/>
+              <w:right w:val="single" w:color="BFC9D6" w:sz="4"/>
+            </w:tcBorders>
+            <w:tcMar>
+              <w:top w:type="dxa" w:w="50"/>
+              <w:left w:type="dxa" w:w="90"/>
+              <w:bottom w:type="dxa" w:w="50"/>
+              <w:right w:type="dxa" w:w="90"/>
+            </w:tcMar>
+            <w:vAlign w:val="top"/>
+          </w:tcPr>
+          <w:p>
+            <w:pPr>
+              <w:keepNext w:val="false"/>
+              <w:bidi/>
+              <w:spacing w:after="30" w:before="30" w:line="264"/>
+            </w:pPr>
+            <w:r>
+              <w:rPr>
+                <w:rFonts w:ascii="Arial" w:cs="Arial" w:eastAsia="Arial" w:hAnsi="Arial"/>
+                <w:b/>
+                <w:bCs/>
+                <w:sz w:val="18"/>
+                <w:szCs w:val="18"/>
+                <w:rtl/>
+              </w:rPr>
+              <w:t xml:space="preserve">سجل التوصيات جاهز (2026-10-13):</w:t>
+            </w:r>
+            <w:r>
+              <w:rPr>
+                <w:rFonts w:ascii="Arial" w:cs="Arial" w:eastAsia="Arial" w:hAnsi="Arial"/>
+                <w:b w:val="false"/>
+                <w:bCs w:val="false"/>
+                <w:sz w:val="18"/>
+                <w:szCs w:val="18"/>
+                <w:rtl/>
+              </w:rPr>
+              <w:t xml:space="preserve"> </w:t>
+            </w:r>
+            <w:r>
+              <w:rPr>
+                <w:rFonts w:ascii="Courier New" w:cs="Courier New" w:eastAsia="Courier New" w:hAnsi="Courier New"/>
+                <w:b w:val="false"/>
+                <w:bCs w:val="false"/>
+                <w:color w:val="1F2937"/>
+                <w:sz w:val="16"/>
+                <w:szCs w:val="16"/>
+                <w:shd w:fill="F1F3F5" w:color="auto" w:val="clear"/>
+                <w:rtl/>
+              </w:rPr>
+              <w:t xml:space="preserve">‎docs/32-review-findings-decisions.md‎</w:t>
+            </w:r>
+            <w:r>
+              <w:rPr>
+                <w:rFonts w:ascii="Arial" w:cs="Arial" w:eastAsia="Arial" w:hAnsi="Arial"/>
+                <w:b w:val="false"/>
+                <w:bCs w:val="false"/>
+                <w:sz w:val="18"/>
+                <w:szCs w:val="18"/>
+                <w:rtl/>
+              </w:rPr>
+              <w:t xml:space="preserve">، بانتظار اعتمادك. أُعيد فحص كل نتيجة: واحدة محلولة (DR-20)، وأربع محلولة جزئيًا. التوصية: 33 نتيجة كلها أو جزء منها تُطبَّق الآن، و6 قبل شرائحها، مع عشرة أسئلة عمل</w:t>
             </w:r>
           </w:p>
         </w:tc>
@@ -50308,7 +50367,31 @@
           <w:szCs w:val="21"/>
           <w:rtl/>
         </w:rPr>
-        <w:t xml:space="preserve">هل تعتمد تعديل المواصفة 13 (O-10)؟ وأيّ من النتائج الرئيسية الـ36 والطفيفة الـ4 تُطبَّق قبل S0 (O-15)؟</w:t>
+        <w:t xml:space="preserve">هل تعتمد تعديل المواصفة 13 (O-10)؟ وهل تعتمد سجل التوصيات لنتائج المراجعة الـ40 (O-15، </w:t>
+      </w:r>
+      <w:r>
+        <w:rPr>
+          <w:rFonts w:ascii="Courier New" w:cs="Courier New" w:eastAsia="Courier New" w:hAnsi="Courier New"/>
+          <w:b/>
+          <w:bCs/>
+          <w:color w:val="1F2937"/>
+          <w:sz w:val="18"/>
+          <w:szCs w:val="18"/>
+          <w:shd w:fill="F1F3F5" w:color="auto" w:val="clear"/>
+          <w:rtl/>
+        </w:rPr>
+        <w:t xml:space="preserve">‎docs/32-review-findings-decisions.md‎</w:t>
+      </w:r>
+      <w:r>
+        <w:rPr>
+          <w:rFonts w:ascii="Arial" w:cs="Arial" w:eastAsia="Arial" w:hAnsi="Arial"/>
+          <w:b/>
+          <w:bCs/>
+          <w:sz w:val="21"/>
+          <w:szCs w:val="21"/>
+          <w:rtl/>
+        </w:rPr>
+        <w:t xml:space="preserve">)؟</w:t>
       </w:r>
     </w:p>
     <w:p>

</xml_diff>

<commit_message>
Word files of the design document, owner decisions, design-and-ERD document and detailed analysis rebuilt (S1 entry conditions, O-10)
Co-Authored-By: Claude Opus 5.5 <noreply@anthropic.com>
Claude-Session: https://claude.ai/code/session_012HHcRrzuvMBTL2FYxXtsyv
</commit_message>
<xml_diff>
--- a/treasury-platform/docs/20-database-design.docx
+++ b/treasury-platform/docs/20-database-design.docx
@@ -35192,9 +35192,9 @@
         </w:tblBorders>
       </w:tblPr>
       <w:tblGrid>
-        <w:gridCol w:w="2877"/>
-        <w:gridCol w:w="5343"/>
-        <w:gridCol w:w="1644"/>
+        <w:gridCol w:w="2707"/>
+        <w:gridCol w:w="5030"/>
+        <w:gridCol w:w="2127"/>
       </w:tblGrid>
       <w:tr>
         <w:trPr>
@@ -35203,7 +35203,7 @@
         </w:trPr>
         <w:tc>
           <w:tcPr>
-            <w:tcW w:type="dxa" w:w="2877"/>
+            <w:tcW w:type="dxa" w:w="2707"/>
             <w:tcBorders>
               <w:top w:val="single" w:color="BFC9D6" w:sz="4"/>
               <w:left w:val="single" w:color="BFC9D6" w:sz="4"/>
@@ -35241,7 +35241,7 @@
         </w:tc>
         <w:tc>
           <w:tcPr>
-            <w:tcW w:type="dxa" w:w="5343"/>
+            <w:tcW w:type="dxa" w:w="5030"/>
             <w:tcBorders>
               <w:top w:val="single" w:color="BFC9D6" w:sz="4"/>
               <w:left w:val="single" w:color="BFC9D6" w:sz="4"/>
@@ -35279,7 +35279,7 @@
         </w:tc>
         <w:tc>
           <w:tcPr>
-            <w:tcW w:type="dxa" w:w="1644"/>
+            <w:tcW w:type="dxa" w:w="2127"/>
             <w:tcBorders>
               <w:top w:val="single" w:color="BFC9D6" w:sz="4"/>
               <w:left w:val="single" w:color="BFC9D6" w:sz="4"/>
@@ -35322,7 +35322,7 @@
         </w:trPr>
         <w:tc>
           <w:tcPr>
-            <w:tcW w:type="dxa" w:w="2877"/>
+            <w:tcW w:type="dxa" w:w="2707"/>
             <w:tcBorders>
               <w:top w:val="single" w:color="BFC9D6" w:sz="4"/>
               <w:left w:val="single" w:color="BFC9D6" w:sz="4"/>
@@ -35358,7 +35358,7 @@
         </w:tc>
         <w:tc>
           <w:tcPr>
-            <w:tcW w:type="dxa" w:w="5343"/>
+            <w:tcW w:type="dxa" w:w="5030"/>
             <w:tcBorders>
               <w:top w:val="single" w:color="BFC9D6" w:sz="4"/>
               <w:left w:val="single" w:color="BFC9D6" w:sz="4"/>
@@ -35551,7 +35551,7 @@
         </w:tc>
         <w:tc>
           <w:tcPr>
-            <w:tcW w:type="dxa" w:w="1644"/>
+            <w:tcW w:type="dxa" w:w="2127"/>
             <w:tcBorders>
               <w:top w:val="single" w:color="BFC9D6" w:sz="4"/>
               <w:left w:val="single" w:color="BFC9D6" w:sz="4"/>
@@ -35616,7 +35616,7 @@
         </w:trPr>
         <w:tc>
           <w:tcPr>
-            <w:tcW w:type="dxa" w:w="2877"/>
+            <w:tcW w:type="dxa" w:w="2707"/>
             <w:tcBorders>
               <w:top w:val="single" w:color="BFC9D6" w:sz="4"/>
               <w:left w:val="single" w:color="BFC9D6" w:sz="4"/>
@@ -35666,7 +35666,7 @@
         </w:tc>
         <w:tc>
           <w:tcPr>
-            <w:tcW w:type="dxa" w:w="5343"/>
+            <w:tcW w:type="dxa" w:w="5030"/>
             <w:tcBorders>
               <w:top w:val="single" w:color="BFC9D6" w:sz="4"/>
               <w:left w:val="single" w:color="BFC9D6" w:sz="4"/>
@@ -35740,7 +35740,7 @@
         </w:tc>
         <w:tc>
           <w:tcPr>
-            <w:tcW w:type="dxa" w:w="1644"/>
+            <w:tcW w:type="dxa" w:w="2127"/>
             <w:tcBorders>
               <w:top w:val="single" w:color="BFC9D6" w:sz="4"/>
               <w:left w:val="single" w:color="BFC9D6" w:sz="4"/>
@@ -35795,7 +35795,7 @@
         </w:trPr>
         <w:tc>
           <w:tcPr>
-            <w:tcW w:type="dxa" w:w="2877"/>
+            <w:tcW w:type="dxa" w:w="2707"/>
             <w:tcBorders>
               <w:top w:val="single" w:color="BFC9D6" w:sz="4"/>
               <w:left w:val="single" w:color="BFC9D6" w:sz="4"/>
@@ -35833,7 +35833,7 @@
         </w:tc>
         <w:tc>
           <w:tcPr>
-            <w:tcW w:type="dxa" w:w="5343"/>
+            <w:tcW w:type="dxa" w:w="5030"/>
             <w:tcBorders>
               <w:top w:val="single" w:color="BFC9D6" w:sz="4"/>
               <w:left w:val="single" w:color="BFC9D6" w:sz="4"/>
@@ -35978,7 +35978,7 @@
         </w:tc>
         <w:tc>
           <w:tcPr>
-            <w:tcW w:type="dxa" w:w="1644"/>
+            <w:tcW w:type="dxa" w:w="2127"/>
             <w:tcBorders>
               <w:top w:val="single" w:color="BFC9D6" w:sz="4"/>
               <w:left w:val="single" w:color="BFC9D6" w:sz="4"/>
@@ -36032,7 +36032,7 @@
         </w:trPr>
         <w:tc>
           <w:tcPr>
-            <w:tcW w:type="dxa" w:w="2877"/>
+            <w:tcW w:type="dxa" w:w="2707"/>
             <w:tcBorders>
               <w:top w:val="single" w:color="BFC9D6" w:sz="4"/>
               <w:left w:val="single" w:color="BFC9D6" w:sz="4"/>
@@ -36069,7 +36069,7 @@
         </w:tc>
         <w:tc>
           <w:tcPr>
-            <w:tcW w:type="dxa" w:w="5343"/>
+            <w:tcW w:type="dxa" w:w="5030"/>
             <w:tcBorders>
               <w:top w:val="single" w:color="BFC9D6" w:sz="4"/>
               <w:left w:val="single" w:color="BFC9D6" w:sz="4"/>
@@ -36154,7 +36154,7 @@
         </w:tc>
         <w:tc>
           <w:tcPr>
-            <w:tcW w:type="dxa" w:w="1644"/>
+            <w:tcW w:type="dxa" w:w="2127"/>
             <w:tcBorders>
               <w:top w:val="single" w:color="BFC9D6" w:sz="4"/>
               <w:left w:val="single" w:color="BFC9D6" w:sz="4"/>
@@ -36207,7 +36207,7 @@
         </w:trPr>
         <w:tc>
           <w:tcPr>
-            <w:tcW w:type="dxa" w:w="2877"/>
+            <w:tcW w:type="dxa" w:w="2707"/>
             <w:tcBorders>
               <w:top w:val="single" w:color="BFC9D6" w:sz="4"/>
               <w:left w:val="single" w:color="BFC9D6" w:sz="4"/>
@@ -36243,7 +36243,7 @@
         </w:tc>
         <w:tc>
           <w:tcPr>
-            <w:tcW w:type="dxa" w:w="5343"/>
+            <w:tcW w:type="dxa" w:w="5030"/>
             <w:tcBorders>
               <w:top w:val="single" w:color="BFC9D6" w:sz="4"/>
               <w:left w:val="single" w:color="BFC9D6" w:sz="4"/>
@@ -36316,37 +36316,37 @@
         </w:tc>
         <w:tc>
           <w:tcPr>
-            <w:tcW w:type="dxa" w:w="1644"/>
-            <w:tcBorders>
-              <w:top w:val="single" w:color="BFC9D6" w:sz="4"/>
-              <w:left w:val="single" w:color="BFC9D6" w:sz="4"/>
-              <w:bottom w:val="single" w:color="BFC9D6" w:sz="4"/>
-              <w:right w:val="single" w:color="BFC9D6" w:sz="4"/>
-            </w:tcBorders>
-            <w:tcMar>
-              <w:top w:type="dxa" w:w="50"/>
-              <w:left w:type="dxa" w:w="90"/>
-              <w:bottom w:type="dxa" w:w="50"/>
-              <w:right w:type="dxa" w:w="90"/>
-            </w:tcMar>
-            <w:vAlign w:val="top"/>
-          </w:tcPr>
-          <w:p>
-            <w:pPr>
-              <w:keepNext w:val="false"/>
-              <w:bidi/>
-              <w:spacing w:after="30" w:before="30" w:line="264"/>
-            </w:pPr>
-            <w:r>
-              <w:rPr>
-                <w:rFonts w:ascii="Arial" w:cs="Arial" w:eastAsia="Arial" w:hAnsi="Arial"/>
-                <w:b w:val="false"/>
-                <w:bCs w:val="false"/>
-                <w:sz w:val="18"/>
-                <w:szCs w:val="18"/>
-                <w:rtl/>
-              </w:rPr>
-              <w:t xml:space="preserve">— (افتراض يُؤكَّد، O-10)</w:t>
+            <w:tcW w:type="dxa" w:w="2127"/>
+            <w:tcBorders>
+              <w:top w:val="single" w:color="BFC9D6" w:sz="4"/>
+              <w:left w:val="single" w:color="BFC9D6" w:sz="4"/>
+              <w:bottom w:val="single" w:color="BFC9D6" w:sz="4"/>
+              <w:right w:val="single" w:color="BFC9D6" w:sz="4"/>
+            </w:tcBorders>
+            <w:tcMar>
+              <w:top w:type="dxa" w:w="50"/>
+              <w:left w:type="dxa" w:w="90"/>
+              <w:bottom w:type="dxa" w:w="50"/>
+              <w:right w:type="dxa" w:w="90"/>
+            </w:tcMar>
+            <w:vAlign w:val="top"/>
+          </w:tcPr>
+          <w:p>
+            <w:pPr>
+              <w:keepNext w:val="false"/>
+              <w:bidi/>
+              <w:spacing w:after="30" w:before="30" w:line="264"/>
+            </w:pPr>
+            <w:r>
+              <w:rPr>
+                <w:rFonts w:ascii="Arial" w:cs="Arial" w:eastAsia="Arial" w:hAnsi="Arial"/>
+                <w:b w:val="false"/>
+                <w:bCs w:val="false"/>
+                <w:sz w:val="18"/>
+                <w:szCs w:val="18"/>
+                <w:rtl/>
+              </w:rPr>
+              <w:t xml:space="preserve">— (قرار المالك 2026-10-12، DQ-F08-2)</w:t>
             </w:r>
           </w:p>
         </w:tc>
@@ -36357,7 +36357,7 @@
         </w:trPr>
         <w:tc>
           <w:tcPr>
-            <w:tcW w:type="dxa" w:w="2877"/>
+            <w:tcW w:type="dxa" w:w="2707"/>
             <w:tcBorders>
               <w:top w:val="single" w:color="BFC9D6" w:sz="4"/>
               <w:left w:val="single" w:color="BFC9D6" w:sz="4"/>
@@ -36394,7 +36394,7 @@
         </w:tc>
         <w:tc>
           <w:tcPr>
-            <w:tcW w:type="dxa" w:w="5343"/>
+            <w:tcW w:type="dxa" w:w="5030"/>
             <w:tcBorders>
               <w:top w:val="single" w:color="BFC9D6" w:sz="4"/>
               <w:left w:val="single" w:color="BFC9D6" w:sz="4"/>
@@ -36514,7 +36514,7 @@
         </w:tc>
         <w:tc>
           <w:tcPr>
-            <w:tcW w:type="dxa" w:w="1644"/>
+            <w:tcW w:type="dxa" w:w="2127"/>
             <w:tcBorders>
               <w:top w:val="single" w:color="BFC9D6" w:sz="4"/>
               <w:left w:val="single" w:color="BFC9D6" w:sz="4"/>
@@ -36556,7 +36556,7 @@
         </w:trPr>
         <w:tc>
           <w:tcPr>
-            <w:tcW w:type="dxa" w:w="2877"/>
+            <w:tcW w:type="dxa" w:w="2707"/>
             <w:tcBorders>
               <w:top w:val="single" w:color="BFC9D6" w:sz="4"/>
               <w:left w:val="single" w:color="BFC9D6" w:sz="4"/>
@@ -36592,7 +36592,7 @@
         </w:tc>
         <w:tc>
           <w:tcPr>
-            <w:tcW w:type="dxa" w:w="5343"/>
+            <w:tcW w:type="dxa" w:w="5030"/>
             <w:tcBorders>
               <w:top w:val="single" w:color="BFC9D6" w:sz="4"/>
               <w:left w:val="single" w:color="BFC9D6" w:sz="4"/>
@@ -36635,7 +36635,7 @@
                 <w:szCs w:val="18"/>
                 <w:rtl/>
               </w:rPr>
-              <w:t xml:space="preserve"> يظهر كـ«قيد التنفيذ» (</w:t>
+              <w:t xml:space="preserve"> يظهر كـ«تحت الإجراء» (</w:t>
             </w:r>
             <w:r>
               <w:rPr>
@@ -36659,13 +36659,13 @@
                 <w:szCs w:val="18"/>
                 <w:rtl/>
               </w:rPr>
-              <w:t xml:space="preserve">)</w:t>
-            </w:r>
-          </w:p>
-        </w:tc>
-        <w:tc>
-          <w:tcPr>
-            <w:tcW w:type="dxa" w:w="1644"/>
+              <w:t xml:space="preserve">) حتى الإقفال (DQ-F08-5)</w:t>
+            </w:r>
+          </w:p>
+        </w:tc>
+        <w:tc>
+          <w:tcPr>
+            <w:tcW w:type="dxa" w:w="2127"/>
             <w:tcBorders>
               <w:top w:val="single" w:color="BFC9D6" w:sz="4"/>
               <w:left w:val="single" w:color="BFC9D6" w:sz="4"/>
@@ -36863,7 +36863,7 @@
           <w:szCs w:val="21"/>
           <w:rtl/>
         </w:rPr>
-        <w:t xml:space="preserve">المواصفة 13 لم تُعدَّل بعد</w:t>
+        <w:t xml:space="preserve">عُدّلت المواصفة 13</w:t>
       </w:r>
       <w:r>
         <w:rPr>
@@ -36874,7 +36874,103 @@
           <w:szCs w:val="21"/>
           <w:rtl/>
         </w:rPr>
-        <w:t xml:space="preserve"> (O-10)، لذا هذا التغيير معلَّق لحين اعتماده رسميًا.</w:t>
+        <w:t xml:space="preserve"> بعد اعتماد المالك (2026-10-12، DQ-F08-1؛ O-10 محلول): BR-WFL-027 وFR-WFL-042 والصلاحية </w:t>
+      </w:r>
+      <w:r>
+        <w:rPr>
+          <w:rFonts w:ascii="Courier New" w:cs="Courier New" w:eastAsia="Courier New" w:hAnsi="Courier New"/>
+          <w:b w:val="false"/>
+          <w:bCs w:val="false"/>
+          <w:color w:val="1F2937"/>
+          <w:sz w:val="18"/>
+          <w:szCs w:val="18"/>
+          <w:shd w:fill="F1F3F5" w:color="auto" w:val="clear"/>
+          <w:rtl/>
+        </w:rPr>
+        <w:t xml:space="preserve">‎req.treasury.close‎</w:t>
+      </w:r>
+      <w:r>
+        <w:rPr>
+          <w:rFonts w:ascii="Arial" w:cs="Arial" w:eastAsia="Arial" w:hAnsi="Arial"/>
+          <w:b w:val="false"/>
+          <w:bCs w:val="false"/>
+          <w:sz w:val="21"/>
+          <w:szCs w:val="21"/>
+          <w:rtl/>
+        </w:rPr>
+        <w:t xml:space="preserve"> ومخطط الحالات والحدث </w:t>
+      </w:r>
+      <w:r>
+        <w:rPr>
+          <w:rFonts w:ascii="Courier New" w:cs="Courier New" w:eastAsia="Courier New" w:hAnsi="Courier New"/>
+          <w:b w:val="false"/>
+          <w:bCs w:val="false"/>
+          <w:color w:val="1F2937"/>
+          <w:sz w:val="18"/>
+          <w:szCs w:val="18"/>
+          <w:shd w:fill="F1F3F5" w:color="auto" w:val="clear"/>
+          <w:rtl/>
+        </w:rPr>
+        <w:t xml:space="preserve">‎REQ.READY_TO_CLOSE‎</w:t>
+      </w:r>
+      <w:r>
+        <w:rPr>
+          <w:rFonts w:ascii="Arial" w:cs="Arial" w:eastAsia="Arial" w:hAnsi="Arial"/>
+          <w:b w:val="false"/>
+          <w:bCs w:val="false"/>
+          <w:sz w:val="21"/>
+          <w:szCs w:val="21"/>
+          <w:rtl/>
+        </w:rPr>
+        <w:t xml:space="preserve">، وصار </w:t>
+      </w:r>
+      <w:r>
+        <w:rPr>
+          <w:rFonts w:ascii="Courier New" w:cs="Courier New" w:eastAsia="Courier New" w:hAnsi="Courier New"/>
+          <w:b w:val="false"/>
+          <w:bCs w:val="false"/>
+          <w:color w:val="1F2937"/>
+          <w:sz w:val="18"/>
+          <w:szCs w:val="18"/>
+          <w:shd w:fill="F1F3F5" w:color="auto" w:val="clear"/>
+          <w:rtl/>
+        </w:rPr>
+        <w:t xml:space="preserve">‎CLOSE‎</w:t>
+      </w:r>
+      <w:r>
+        <w:rPr>
+          <w:rFonts w:ascii="Arial" w:cs="Arial" w:eastAsia="Arial" w:hAnsi="Arial"/>
+          <w:b w:val="false"/>
+          <w:bCs w:val="false"/>
+          <w:sz w:val="21"/>
+          <w:szCs w:val="21"/>
+          <w:rtl/>
+        </w:rPr>
+        <w:t xml:space="preserve"> إجراء خروج للمثيل النهائي في </w:t>
+      </w:r>
+      <w:r>
+        <w:rPr>
+          <w:rFonts w:ascii="Courier New" w:cs="Courier New" w:eastAsia="Courier New" w:hAnsi="Courier New"/>
+          <w:b w:val="false"/>
+          <w:bCs w:val="false"/>
+          <w:color w:val="1F2937"/>
+          <w:sz w:val="18"/>
+          <w:szCs w:val="18"/>
+          <w:shd w:fill="F1F3F5" w:color="auto" w:val="clear"/>
+          <w:rtl/>
+        </w:rPr>
+        <w:t xml:space="preserve">‎wfl.RequestStageInstance‎</w:t>
+      </w:r>
+      <w:r>
+        <w:rPr>
+          <w:rFonts w:ascii="Arial" w:cs="Arial" w:eastAsia="Arial" w:hAnsi="Arial"/>
+          <w:b w:val="false"/>
+          <w:bCs w:val="false"/>
+          <w:sz w:val="21"/>
+          <w:szCs w:val="21"/>
+          <w:rtl/>
+        </w:rPr>
+        <w:t xml:space="preserve"> (DQ-F08-6).</w:t>
       </w:r>
     </w:p>
     <w:p>
@@ -49211,7 +49307,7 @@
                 <w:szCs w:val="18"/>
                 <w:rtl/>
               </w:rPr>
-              <w:t xml:space="preserve">الوثيقة تتبع قرار الإقفال، والمواصفة ما زالت تقول إن الإكمال تلقائي عند المرحلة الأخيرة</w:t>
+              <w:t xml:space="preserve">المواصفة كانت تجعل الإكمال تلقائيًا عند المرحلة الأخيرة</w:t>
             </w:r>
           </w:p>
         </w:tc>
@@ -49239,113 +49335,6 @@
               <w:bidi/>
               <w:spacing w:after="30" w:before="30" w:line="264"/>
             </w:pPr>
-            <w:r>
-              <w:rPr>
-                <w:rFonts w:ascii="Arial" w:cs="Arial" w:eastAsia="Arial" w:hAnsi="Arial"/>
-                <w:b w:val="false"/>
-                <w:bCs w:val="false"/>
-                <w:sz w:val="18"/>
-                <w:szCs w:val="18"/>
-                <w:rtl/>
-              </w:rPr>
-              <w:t xml:space="preserve">تحديث </w:t>
-            </w:r>
-            <w:r>
-              <w:rPr>
-                <w:rFonts w:ascii="Courier New" w:cs="Courier New" w:eastAsia="Courier New" w:hAnsi="Courier New"/>
-                <w:b w:val="false"/>
-                <w:bCs w:val="false"/>
-                <w:color w:val="1F2937"/>
-                <w:sz w:val="16"/>
-                <w:szCs w:val="16"/>
-                <w:shd w:fill="F1F3F5" w:color="auto" w:val="clear"/>
-                <w:rtl/>
-              </w:rPr>
-              <w:t xml:space="preserve">‎13‎</w:t>
-            </w:r>
-            <w:r>
-              <w:rPr>
-                <w:rFonts w:ascii="Arial" w:cs="Arial" w:eastAsia="Arial" w:hAnsi="Arial"/>
-                <w:b w:val="false"/>
-                <w:bCs w:val="false"/>
-                <w:sz w:val="18"/>
-                <w:szCs w:val="18"/>
-                <w:rtl/>
-              </w:rPr>
-              <w:t xml:space="preserve"> (حقل </w:t>
-            </w:r>
-            <w:r>
-              <w:rPr>
-                <w:rFonts w:ascii="Courier New" w:cs="Courier New" w:eastAsia="Courier New" w:hAnsi="Courier New"/>
-                <w:b w:val="false"/>
-                <w:bCs w:val="false"/>
-                <w:color w:val="1F2937"/>
-                <w:sz w:val="16"/>
-                <w:szCs w:val="16"/>
-                <w:shd w:fill="F1F3F5" w:color="auto" w:val="clear"/>
-                <w:rtl/>
-              </w:rPr>
-              <w:t xml:space="preserve">‎Status‎</w:t>
-            </w:r>
-            <w:r>
-              <w:rPr>
-                <w:rFonts w:ascii="Arial" w:cs="Arial" w:eastAsia="Arial" w:hAnsi="Arial"/>
-                <w:b w:val="false"/>
-                <w:bCs w:val="false"/>
-                <w:sz w:val="18"/>
-                <w:szCs w:val="18"/>
-                <w:rtl/>
-              </w:rPr>
-              <w:t xml:space="preserve">، جدول الحالات، </w:t>
-            </w:r>
-            <w:r>
-              <w:rPr>
-                <w:rFonts w:ascii="Courier New" w:cs="Courier New" w:eastAsia="Courier New" w:hAnsi="Courier New"/>
-                <w:b w:val="false"/>
-                <w:bCs w:val="false"/>
-                <w:color w:val="1F2937"/>
-                <w:sz w:val="16"/>
-                <w:szCs w:val="16"/>
-                <w:shd w:fill="F1F3F5" w:color="auto" w:val="clear"/>
-                <w:rtl/>
-              </w:rPr>
-              <w:t xml:space="preserve">‎ExternalPhase‎</w:t>
-            </w:r>
-            <w:r>
-              <w:rPr>
-                <w:rFonts w:ascii="Arial" w:cs="Arial" w:eastAsia="Arial" w:hAnsi="Arial"/>
-                <w:b w:val="false"/>
-                <w:bCs w:val="false"/>
-                <w:sz w:val="18"/>
-                <w:szCs w:val="18"/>
-                <w:rtl/>
-              </w:rPr>
-              <w:t xml:space="preserve">، </w:t>
-            </w:r>
-            <w:r>
-              <w:rPr>
-                <w:rFonts w:ascii="Courier New" w:cs="Courier New" w:eastAsia="Courier New" w:hAnsi="Courier New"/>
-                <w:b w:val="false"/>
-                <w:bCs w:val="false"/>
-                <w:color w:val="1F2937"/>
-                <w:sz w:val="16"/>
-                <w:szCs w:val="16"/>
-                <w:shd w:fill="F1F3F5" w:color="auto" w:val="clear"/>
-                <w:rtl/>
-              </w:rPr>
-              <w:t xml:space="preserve">‎FR-WFL‎</w:t>
-            </w:r>
-            <w:r>
-              <w:rPr>
-                <w:rFonts w:ascii="Arial" w:cs="Arial" w:eastAsia="Arial" w:hAnsi="Arial"/>
-                <w:b w:val="false"/>
-                <w:bCs w:val="false"/>
-                <w:sz w:val="18"/>
-                <w:szCs w:val="18"/>
-                <w:rtl/>
-              </w:rPr>
-              <w:t xml:space="preserve">) بعد موافقتك؛ </w:t>
-            </w:r>
             <w:r>
               <w:rPr>
                 <w:rFonts w:ascii="Arial" w:cs="Arial" w:eastAsia="Arial" w:hAnsi="Arial"/>
@@ -49355,7 +49344,90 @@
                 <w:szCs w:val="18"/>
                 <w:rtl/>
               </w:rPr>
-              <w:t xml:space="preserve">أكّد أيضًا أن الرفض والإلغاء يبقيان فوريين</w:t>
+              <w:t xml:space="preserve">محلول (2026-10-13):</w:t>
+            </w:r>
+            <w:r>
+              <w:rPr>
+                <w:rFonts w:ascii="Arial" w:cs="Arial" w:eastAsia="Arial" w:hAnsi="Arial"/>
+                <w:b w:val="false"/>
+                <w:bCs w:val="false"/>
+                <w:sz w:val="18"/>
+                <w:szCs w:val="18"/>
+                <w:rtl/>
+              </w:rPr>
+              <w:t xml:space="preserve"> اعتمد المالك النموذج الموحّد (DQ-F08-1، والرفض والإلغاء فوريان DQ-F08-2)، وعُدّلت المواصفة 13 (BR-WFL-027، FR-WFL-042، مخطط الحالات، </w:t>
+            </w:r>
+            <w:r>
+              <w:rPr>
+                <w:rFonts w:ascii="Courier New" w:cs="Courier New" w:eastAsia="Courier New" w:hAnsi="Courier New"/>
+                <w:b w:val="false"/>
+                <w:bCs w:val="false"/>
+                <w:color w:val="1F2937"/>
+                <w:sz w:val="16"/>
+                <w:szCs w:val="16"/>
+                <w:shd w:fill="F1F3F5" w:color="auto" w:val="clear"/>
+                <w:rtl/>
+              </w:rPr>
+              <w:t xml:space="preserve">‎REQ.READY_TO_CLOSE‎</w:t>
+            </w:r>
+            <w:r>
+              <w:rPr>
+                <w:rFonts w:ascii="Arial" w:cs="Arial" w:eastAsia="Arial" w:hAnsi="Arial"/>
+                <w:b w:val="false"/>
+                <w:bCs w:val="false"/>
+                <w:sz w:val="18"/>
+                <w:szCs w:val="18"/>
+                <w:rtl/>
+              </w:rPr>
+              <w:t xml:space="preserve">)، وأُضيف </w:t>
+            </w:r>
+            <w:r>
+              <w:rPr>
+                <w:rFonts w:ascii="Courier New" w:cs="Courier New" w:eastAsia="Courier New" w:hAnsi="Courier New"/>
+                <w:b w:val="false"/>
+                <w:bCs w:val="false"/>
+                <w:color w:val="1F2937"/>
+                <w:sz w:val="16"/>
+                <w:szCs w:val="16"/>
+                <w:shd w:fill="F1F3F5" w:color="auto" w:val="clear"/>
+                <w:rtl/>
+              </w:rPr>
+              <w:t xml:space="preserve">‎CLOSE‎</w:t>
+            </w:r>
+            <w:r>
+              <w:rPr>
+                <w:rFonts w:ascii="Arial" w:cs="Arial" w:eastAsia="Arial" w:hAnsi="Arial"/>
+                <w:b w:val="false"/>
+                <w:bCs w:val="false"/>
+                <w:sz w:val="18"/>
+                <w:szCs w:val="18"/>
+                <w:rtl/>
+              </w:rPr>
+              <w:t xml:space="preserve"> إلى </w:t>
+            </w:r>
+            <w:r>
+              <w:rPr>
+                <w:rFonts w:ascii="Courier New" w:cs="Courier New" w:eastAsia="Courier New" w:hAnsi="Courier New"/>
+                <w:b w:val="false"/>
+                <w:bCs w:val="false"/>
+                <w:color w:val="1F2937"/>
+                <w:sz w:val="16"/>
+                <w:szCs w:val="16"/>
+                <w:shd w:fill="F1F3F5" w:color="auto" w:val="clear"/>
+                <w:rtl/>
+              </w:rPr>
+              <w:t xml:space="preserve">‎ExitAction‎</w:t>
+            </w:r>
+            <w:r>
+              <w:rPr>
+                <w:rFonts w:ascii="Arial" w:cs="Arial" w:eastAsia="Arial" w:hAnsi="Arial"/>
+                <w:b w:val="false"/>
+                <w:bCs w:val="false"/>
+                <w:sz w:val="18"/>
+                <w:szCs w:val="18"/>
+                <w:rtl/>
+              </w:rPr>
+              <w:t xml:space="preserve"> (DQ-F08-6)</w:t>
             </w:r>
           </w:p>
         </w:tc>
@@ -50428,29 +50500,7 @@
           <w:szCs w:val="21"/>
           <w:rtl/>
         </w:rPr>
-        <w:t xml:space="preserve"> لهذا الإصدار، خاصة القرارات DB-14 إلى DB-21 والنقاط O-9 إلى O-13 و O-15، والأسئلة التي تحتاج قرارك: </w:t>
-      </w:r>
-      <w:r>
-        <w:rPr>
-          <w:rFonts w:ascii="Arial" w:cs="Arial" w:eastAsia="Arial" w:hAnsi="Arial"/>
-          <w:b/>
-          <w:bCs/>
-          <w:sz w:val="21"/>
-          <w:szCs w:val="21"/>
-          <w:rtl/>
-        </w:rPr>
-        <w:t xml:space="preserve">هل تعتمد تعديل المواصفة 13 (O-10)؟</w:t>
-      </w:r>
-      <w:r>
-        <w:rPr>
-          <w:rFonts w:ascii="Arial" w:cs="Arial" w:eastAsia="Arial" w:hAnsi="Arial"/>
-          <w:b w:val="false"/>
-          <w:bCs w:val="false"/>
-          <w:sz w:val="21"/>
-          <w:szCs w:val="21"/>
-          <w:rtl/>
-        </w:rPr>
-        <w:t xml:space="preserve"> نتائج المراجعة الـ40 (O-15) قُرّرت وطُبّقت دفعتها الأولى (ADR 0011).</w:t>
+        <w:t xml:space="preserve"> لهذا الإصدار، خاصة القرارات DB-14 إلى DB-21 والنقاط O-9 إلى O-13 و O-15، وما بقي من البنود المفتوحة في §16. تعديل المواصفة 13 (O-10) ونتائج المراجعة الـ40 (O-15) حُسما وطُبّقا (DQ-F08-1، ADR 0011).</w:t>
       </w:r>
     </w:p>
     <w:p>

</xml_diff>

<commit_message>
Word files of the design document, the design-and-ERD document and the relationship charts rebuilt (ADR 0012)
Co-Authored-By: Claude Opus 5.5 <noreply@anthropic.com>
Claude-Session: https://claude.ai/code/session_012HHcRrzuvMBTL2FYxXtsyv
</commit_message>
<xml_diff>
--- a/treasury-platform/docs/20-database-design.docx
+++ b/treasury-platform/docs/20-database-design.docx
@@ -38421,7 +38421,7 @@
           <w:szCs w:val="17"/>
           <w:rtl w:val="false"/>
         </w:rPr>
-        <w:t xml:space="preserve"># Production (Ubuntu 24.04 LTS, ADR 0001) and CI (ADR 0010): an administrator prepares the database once and opens the</w:t>
+        <w:t xml:space="preserve"># Production (Ubuntu 24.04 LTS, ADR 0001) and CI (ADR 0010, ADR 0012): an administrator starts the server audit and</w:t>
       </w:r>
     </w:p>
     <w:p>
@@ -38448,7 +38448,7 @@
           <w:szCs w:val="17"/>
           <w:rtl w:val="false"/>
         </w:rPr>
-        <w:t xml:space="preserve"># window; the deployment login (db_owner only) runs the wrapper, which changes to db/ and runs deploy.sql</w:t>
+        <w:t xml:space="preserve"># prepares the database once, then opens the window; the deployment login (db_owner only) runs the wrapper, which</w:t>
       </w:r>
     </w:p>
     <w:p>
@@ -38475,7 +38475,7 @@
           <w:szCs w:val="17"/>
           <w:rtl w:val="false"/>
         </w:rPr>
-        <w:t xml:space="preserve">tools/deploy/prepare_database.sh prepare            # first time: empty BankFas, owner bankfas_owner, login bankfas_migrator</w:t>
+        <w:t xml:space="preserve"># changes to db/ and runs deploy.sql. Each step declares itself in the audit with BANKFAS_CHANGE_REF.</w:t>
       </w:r>
     </w:p>
     <w:p>
@@ -38502,7 +38502,7 @@
           <w:szCs w:val="17"/>
           <w:rtl w:val="false"/>
         </w:rPr>
-        <w:t xml:space="preserve">tools/deploy/prepare_database.sh open</w:t>
+        <w:t xml:space="preserve">tools/deploy/server_audit.sh apply                  # first time: SQL Server Audit before anything else (ADR 0012)</w:t>
       </w:r>
     </w:p>
     <w:p>
@@ -38529,7 +38529,7 @@
           <w:szCs w:val="17"/>
           <w:rtl w:val="false"/>
         </w:rPr>
-        <w:t xml:space="preserve">SQL_SERVER=&lt;server&gt; SQL_USER=bankfas_migrator SQLCMDPASSWORD="$(cat &lt;secret file&gt;)" tools/deploy/deploy.sh</w:t>
+        <w:t xml:space="preserve">tools/deploy/prepare_database.sh prepare            # first time: empty BankFas, owner bankfas_owner, login bankfas_migrator</w:t>
       </w:r>
     </w:p>
     <w:p>
@@ -38556,7 +38556,7 @@
           <w:szCs w:val="17"/>
           <w:rtl w:val="false"/>
         </w:rPr>
-        <w:t xml:space="preserve">tools/deploy/prepare_database.sh close</w:t>
+        <w:t xml:space="preserve">tools/deploy/prepare_database.sh open</w:t>
       </w:r>
     </w:p>
     <w:p>
@@ -38583,7 +38583,7 @@
           <w:szCs w:val="17"/>
           <w:rtl w:val="false"/>
         </w:rPr>
-        <w:t xml:space="preserve">tools/deploy/provision_logins.sh                    # the service logins (ADR 0009)</w:t>
+        <w:t xml:space="preserve">SQL_SERVER=&lt;server&gt; SQL_USER=bankfas_migrator SQLCMDPASSWORD="$(cat &lt;secret file&gt;)" tools/deploy/deploy.sh</w:t>
       </w:r>
     </w:p>
     <w:p>
@@ -38610,6 +38610,87 @@
           <w:szCs w:val="17"/>
           <w:rtl w:val="false"/>
         </w:rPr>
+        <w:t xml:space="preserve">tools/deploy/server_audit.sh apply                  # the database audit specification, inside the window</w:t>
+      </w:r>
+    </w:p>
+    <w:p>
+      <w:pPr>
+        <w:keepNext/>
+        <w:keepLines/>
+        <w:pBdr>
+          <w:top w:val="single" w:color="BFC9D6" w:sz="4" w:space="4"/>
+          <w:left w:val="single" w:color="BFC9D6" w:sz="4" w:space="4"/>
+          <w:bottom w:val="single" w:color="BFC9D6" w:sz="4" w:space="4"/>
+          <w:right w:val="single" w:color="BFC9D6" w:sz="4" w:space="4"/>
+        </w:pBdr>
+        <w:shd w:fill="F1F3F5" w:color="auto" w:val="clear"/>
+        <w:bidi w:val="false"/>
+        <w:spacing w:after="0" w:before="0" w:line="260"/>
+        <w:ind w:left="120" w:right="120"/>
+        <w:jc w:val="left"/>
+      </w:pPr>
+      <w:r>
+        <w:rPr>
+          <w:rFonts w:ascii="Courier New" w:cs="Courier New" w:eastAsia="Courier New" w:hAnsi="Courier New"/>
+          <w:color w:val="1F2937"/>
+          <w:sz w:val="17"/>
+          <w:szCs w:val="17"/>
+          <w:rtl w:val="false"/>
+        </w:rPr>
+        <w:t xml:space="preserve">tools/deploy/provision_logins.sh                    # the service logins (ADR 0009), inside the window</w:t>
+      </w:r>
+    </w:p>
+    <w:p>
+      <w:pPr>
+        <w:keepNext/>
+        <w:keepLines/>
+        <w:pBdr>
+          <w:top w:val="single" w:color="BFC9D6" w:sz="4" w:space="4"/>
+          <w:left w:val="single" w:color="BFC9D6" w:sz="4" w:space="4"/>
+          <w:bottom w:val="single" w:color="BFC9D6" w:sz="4" w:space="4"/>
+          <w:right w:val="single" w:color="BFC9D6" w:sz="4" w:space="4"/>
+        </w:pBdr>
+        <w:shd w:fill="F1F3F5" w:color="auto" w:val="clear"/>
+        <w:bidi w:val="false"/>
+        <w:spacing w:after="0" w:before="0" w:line="260"/>
+        <w:ind w:left="120" w:right="120"/>
+        <w:jc w:val="left"/>
+      </w:pPr>
+      <w:r>
+        <w:rPr>
+          <w:rFonts w:ascii="Courier New" w:cs="Courier New" w:eastAsia="Courier New" w:hAnsi="Courier New"/>
+          <w:color w:val="1F2937"/>
+          <w:sz w:val="17"/>
+          <w:szCs w:val="17"/>
+          <w:rtl w:val="false"/>
+        </w:rPr>
+        <w:t xml:space="preserve">tools/deploy/prepare_database.sh close</w:t>
+      </w:r>
+    </w:p>
+    <w:p>
+      <w:pPr>
+        <w:keepNext/>
+        <w:keepLines/>
+        <w:pBdr>
+          <w:top w:val="single" w:color="BFC9D6" w:sz="4" w:space="4"/>
+          <w:left w:val="single" w:color="BFC9D6" w:sz="4" w:space="4"/>
+          <w:bottom w:val="single" w:color="BFC9D6" w:sz="4" w:space="4"/>
+          <w:right w:val="single" w:color="BFC9D6" w:sz="4" w:space="4"/>
+        </w:pBdr>
+        <w:shd w:fill="F1F3F5" w:color="auto" w:val="clear"/>
+        <w:bidi w:val="false"/>
+        <w:spacing w:after="0" w:before="0" w:line="260"/>
+        <w:ind w:left="120" w:right="120"/>
+        <w:jc w:val="left"/>
+      </w:pPr>
+      <w:r>
+        <w:rPr>
+          <w:rFonts w:ascii="Courier New" w:cs="Courier New" w:eastAsia="Courier New" w:hAnsi="Courier New"/>
+          <w:color w:val="1F2937"/>
+          <w:sz w:val="17"/>
+          <w:szCs w:val="17"/>
+          <w:rtl w:val="false"/>
+        </w:rPr>
         <w:t xml:space="preserve"># The same thing by hand: cd db &amp;&amp; sqlcmd -S &lt;server&gt; -U &lt;login&gt; -I -b -i deploy.sql</w:t>
       </w:r>
     </w:p>
@@ -39614,7 +39695,101 @@
           <w:szCs w:val="21"/>
           <w:rtl/>
         </w:rPr>
-        <w:t xml:space="preserve">بعد النشر، بحساب مدير شخصي يملك إنشاء الحسابات: </w:t>
+        <w:t xml:space="preserve">بعد النشر وداخل النافذة، بحساب مدير شخصي: </w:t>
+      </w:r>
+      <w:r>
+        <w:rPr>
+          <w:rFonts w:ascii="Courier New" w:cs="Courier New" w:eastAsia="Courier New" w:hAnsi="Courier New"/>
+          <w:b w:val="false"/>
+          <w:bCs w:val="false"/>
+          <w:color w:val="1F2937"/>
+          <w:sz w:val="18"/>
+          <w:szCs w:val="18"/>
+          <w:shd w:fill="F1F3F5" w:color="auto" w:val="clear"/>
+          <w:rtl/>
+        </w:rPr>
+        <w:t xml:space="preserve">‎tools/deploy/server_audit.sh apply‎</w:t>
+      </w:r>
+      <w:r>
+        <w:rPr>
+          <w:rFonts w:ascii="Arial" w:cs="Arial" w:eastAsia="Arial" w:hAnsi="Arial"/>
+          <w:b w:val="false"/>
+          <w:bCs w:val="false"/>
+          <w:sz w:val="21"/>
+          <w:szCs w:val="21"/>
+          <w:rtl/>
+        </w:rPr>
+        <w:t xml:space="preserve"> يضيف مواصفة تدقيق القاعدة على جداول التدقيق، بعد أن شغّله المدير مرة قبل النشر الأول فبدأ تدقيق الخادم (SQL Server Audit) وسُجّل النشر نفسه. وكل سكربت في </w:t>
+      </w:r>
+      <w:r>
+        <w:rPr>
+          <w:rFonts w:ascii="Courier New" w:cs="Courier New" w:eastAsia="Courier New" w:hAnsi="Courier New"/>
+          <w:b w:val="false"/>
+          <w:bCs w:val="false"/>
+          <w:color w:val="1F2937"/>
+          <w:sz w:val="18"/>
+          <w:szCs w:val="18"/>
+          <w:shd w:fill="F1F3F5" w:color="auto" w:val="clear"/>
+          <w:rtl/>
+        </w:rPr>
+        <w:t xml:space="preserve">‎tools/deploy‎</w:t>
+      </w:r>
+      <w:r>
+        <w:rPr>
+          <w:rFonts w:ascii="Arial" w:cs="Arial" w:eastAsia="Arial" w:hAnsi="Arial"/>
+          <w:b w:val="false"/>
+          <w:bCs w:val="false"/>
+          <w:sz w:val="21"/>
+          <w:szCs w:val="21"/>
+          <w:rtl/>
+        </w:rPr>
+        <w:t xml:space="preserve"> يعلن عمله في التدقيق، فتنبيهات AL-18 لا تنطلق إلا لما يقع خارج نافذة معلنة (</w:t>
+      </w:r>
+      <w:r>
+        <w:rPr>
+          <w:rFonts w:ascii="Courier New" w:cs="Courier New" w:eastAsia="Courier New" w:hAnsi="Courier New"/>
+          <w:b w:val="false"/>
+          <w:bCs w:val="false"/>
+          <w:color w:val="1F2937"/>
+          <w:sz w:val="18"/>
+          <w:szCs w:val="18"/>
+          <w:shd w:fill="F1F3F5" w:color="auto" w:val="clear"/>
+          <w:rtl/>
+        </w:rPr>
+        <w:t xml:space="preserve">‎server_audit.sh alerts‎</w:t>
+      </w:r>
+      <w:r>
+        <w:rPr>
+          <w:rFonts w:ascii="Arial" w:cs="Arial" w:eastAsia="Arial" w:hAnsi="Arial"/>
+          <w:b w:val="false"/>
+          <w:bCs w:val="false"/>
+          <w:sz w:val="21"/>
+          <w:szCs w:val="21"/>
+          <w:rtl/>
+        </w:rPr>
+        <w:t xml:space="preserve">؛ ADR 0012، DOC-S08 §10)</w:t>
+      </w:r>
+    </w:p>
+    <w:p>
+      <w:pPr>
+        <w:pStyle w:val="ListParagraph"/>
+        <w:numPr>
+          <w:ilvl w:val="0"/>
+          <w:numId w:val="5"/>
+        </w:numPr>
+        <w:bidi/>
+        <w:spacing w:after="70" w:before="0" w:line="300"/>
+      </w:pPr>
+      <w:r>
+        <w:rPr>
+          <w:rFonts w:ascii="Arial" w:cs="Arial" w:eastAsia="Arial" w:hAnsi="Arial"/>
+          <w:b w:val="false"/>
+          <w:bCs w:val="false"/>
+          <w:sz w:val="21"/>
+          <w:szCs w:val="21"/>
+          <w:rtl/>
+        </w:rPr>
+        <w:t xml:space="preserve">داخل النافذة أيضًا، بحساب مدير شخصي يملك إنشاء الحسابات: </w:t>
       </w:r>
       <w:r>
         <w:rPr>
@@ -43788,6 +43963,54 @@
                 <w:rtl/>
               </w:rPr>
               <w:t xml:space="preserve"> 6 فحوص (حسابات الخدمة بأسرارها وصلاحياتها، ADR 0009) و</w:t>
+            </w:r>
+            <w:r>
+              <w:rPr>
+                <w:rFonts w:ascii="Courier New" w:cs="Courier New" w:eastAsia="Courier New" w:hAnsi="Courier New"/>
+                <w:b w:val="false"/>
+                <w:bCs w:val="false"/>
+                <w:color w:val="1F2937"/>
+                <w:sz w:val="16"/>
+                <w:szCs w:val="16"/>
+                <w:shd w:fill="F1F3F5" w:color="auto" w:val="clear"/>
+                <w:rtl/>
+              </w:rPr>
+              <w:t xml:space="preserve">‎db/tests/review_fixes_tests.sql‎</w:t>
+            </w:r>
+            <w:r>
+              <w:rPr>
+                <w:rFonts w:ascii="Arial" w:cs="Arial" w:eastAsia="Arial" w:hAnsi="Arial"/>
+                <w:b w:val="false"/>
+                <w:bCs w:val="false"/>
+                <w:sz w:val="18"/>
+                <w:szCs w:val="18"/>
+                <w:rtl/>
+              </w:rPr>
+              <w:t xml:space="preserve"> 21 حالة (إصلاحات المراجعة، ADR 0011) و</w:t>
+            </w:r>
+            <w:r>
+              <w:rPr>
+                <w:rFonts w:ascii="Courier New" w:cs="Courier New" w:eastAsia="Courier New" w:hAnsi="Courier New"/>
+                <w:b w:val="false"/>
+                <w:bCs w:val="false"/>
+                <w:color w:val="1F2937"/>
+                <w:sz w:val="16"/>
+                <w:szCs w:val="16"/>
+                <w:shd w:fill="F1F3F5" w:color="auto" w:val="clear"/>
+                <w:rtl/>
+              </w:rPr>
+              <w:t xml:space="preserve">‎tools/ci/server_audit_check.sh‎</w:t>
+            </w:r>
+            <w:r>
+              <w:rPr>
+                <w:rFonts w:ascii="Arial" w:cs="Arial" w:eastAsia="Arial" w:hAnsi="Arial"/>
+                <w:b w:val="false"/>
+                <w:bCs w:val="false"/>
+                <w:sz w:val="18"/>
+                <w:szCs w:val="18"/>
+                <w:rtl/>
+              </w:rPr>
+              <w:t xml:space="preserve"> 7 فحوص (تدقيق الخادم ونوافذه وقواعد AL-18، ADR 0012) و</w:t>
             </w:r>
             <w:r>
               <w:rPr>

</xml_diff>

<commit_message>
Word files of the design document, the design-and-ERD document and the relationship charts rebuilt (ADR 0013)
Co-Authored-By: Claude Opus 5.5 <noreply@anthropic.com>
Claude-Session: https://claude.ai/code/session_012HHcRrzuvMBTL2FYxXtsyv
</commit_message>
<xml_diff>
--- a/treasury-platform/docs/20-database-design.docx
+++ b/treasury-platform/docs/20-database-design.docx
@@ -38664,7 +38664,88 @@
           <w:szCs w:val="17"/>
           <w:rtl w:val="false"/>
         </w:rPr>
+        <w:t xml:space="preserve">tools/deploy/provision_monitor.sh                   # the monitoring login bankfas_monitor, view rights only (ADR 0013)</w:t>
+      </w:r>
+    </w:p>
+    <w:p>
+      <w:pPr>
+        <w:keepNext/>
+        <w:keepLines/>
+        <w:pBdr>
+          <w:top w:val="single" w:color="BFC9D6" w:sz="4" w:space="4"/>
+          <w:left w:val="single" w:color="BFC9D6" w:sz="4" w:space="4"/>
+          <w:bottom w:val="single" w:color="BFC9D6" w:sz="4" w:space="4"/>
+          <w:right w:val="single" w:color="BFC9D6" w:sz="4" w:space="4"/>
+        </w:pBdr>
+        <w:shd w:fill="F1F3F5" w:color="auto" w:val="clear"/>
+        <w:bidi w:val="false"/>
+        <w:spacing w:after="0" w:before="0" w:line="260"/>
+        <w:ind w:left="120" w:right="120"/>
+        <w:jc w:val="left"/>
+      </w:pPr>
+      <w:r>
+        <w:rPr>
+          <w:rFonts w:ascii="Courier New" w:cs="Courier New" w:eastAsia="Courier New" w:hAnsi="Courier New"/>
+          <w:color w:val="1F2937"/>
+          <w:sz w:val="17"/>
+          <w:szCs w:val="17"/>
+          <w:rtl w:val="false"/>
+        </w:rPr>
         <w:t xml:space="preserve">tools/deploy/prepare_database.sh close</w:t>
+      </w:r>
+    </w:p>
+    <w:p>
+      <w:pPr>
+        <w:keepNext/>
+        <w:keepLines/>
+        <w:pBdr>
+          <w:top w:val="single" w:color="BFC9D6" w:sz="4" w:space="4"/>
+          <w:left w:val="single" w:color="BFC9D6" w:sz="4" w:space="4"/>
+          <w:bottom w:val="single" w:color="BFC9D6" w:sz="4" w:space="4"/>
+          <w:right w:val="single" w:color="BFC9D6" w:sz="4" w:space="4"/>
+        </w:pBdr>
+        <w:shd w:fill="F1F3F5" w:color="auto" w:val="clear"/>
+        <w:bidi w:val="false"/>
+        <w:spacing w:after="0" w:before="0" w:line="260"/>
+        <w:ind w:left="120" w:right="120"/>
+        <w:jc w:val="left"/>
+      </w:pPr>
+      <w:r>
+        <w:rPr>
+          <w:rFonts w:ascii="Courier New" w:cs="Courier New" w:eastAsia="Courier New" w:hAnsi="Courier New"/>
+          <w:color w:val="1F2937"/>
+          <w:sz w:val="17"/>
+          <w:szCs w:val="17"/>
+          <w:rtl w:val="false"/>
+        </w:rPr>
+        <w:t xml:space="preserve">SQL_USER=bankfas_monitor tools/dbgen/check_deployed.py --server &lt;server&gt;   # the post-deployment check (DOC-S11 section 8.2)</w:t>
+      </w:r>
+    </w:p>
+    <w:p>
+      <w:pPr>
+        <w:keepNext/>
+        <w:keepLines/>
+        <w:pBdr>
+          <w:top w:val="single" w:color="BFC9D6" w:sz="4" w:space="4"/>
+          <w:left w:val="single" w:color="BFC9D6" w:sz="4" w:space="4"/>
+          <w:bottom w:val="single" w:color="BFC9D6" w:sz="4" w:space="4"/>
+          <w:right w:val="single" w:color="BFC9D6" w:sz="4" w:space="4"/>
+        </w:pBdr>
+        <w:shd w:fill="F1F3F5" w:color="auto" w:val="clear"/>
+        <w:bidi w:val="false"/>
+        <w:spacing w:after="0" w:before="0" w:line="260"/>
+        <w:ind w:left="120" w:right="120"/>
+        <w:jc w:val="left"/>
+      </w:pPr>
+      <w:r>
+        <w:rPr>
+          <w:rFonts w:ascii="Courier New" w:cs="Courier New" w:eastAsia="Courier New" w:hAnsi="Courier New"/>
+          <w:color w:val="1F2937"/>
+          <w:sz w:val="17"/>
+          <w:szCs w:val="17"/>
+          <w:rtl w:val="false"/>
+        </w:rPr>
+        <w:t xml:space="preserve"># No tool trusts the server certificate by itself; only CI sets SQLCMD_OPTS=-C (DQ-S05-7, ADR 0013).</w:t>
       </w:r>
     </w:p>
     <w:p>
@@ -44011,6 +44092,30 @@
                 <w:rtl/>
               </w:rPr>
               <w:t xml:space="preserve"> 7 فحوص (تدقيق الخادم ونوافذه وقواعد AL-18، ADR 0012) و</w:t>
+            </w:r>
+            <w:r>
+              <w:rPr>
+                <w:rFonts w:ascii="Courier New" w:cs="Courier New" w:eastAsia="Courier New" w:hAnsi="Courier New"/>
+                <w:b w:val="false"/>
+                <w:bCs w:val="false"/>
+                <w:color w:val="1F2937"/>
+                <w:sz w:val="16"/>
+                <w:szCs w:val="16"/>
+                <w:shd w:fill="F1F3F5" w:color="auto" w:val="clear"/>
+                <w:rtl/>
+              </w:rPr>
+              <w:t xml:space="preserve">‎tools/ci/monitor_login_check.sh‎</w:t>
+            </w:r>
+            <w:r>
+              <w:rPr>
+                <w:rFonts w:ascii="Arial" w:cs="Arial" w:eastAsia="Arial" w:hAnsi="Arial"/>
+                <w:b w:val="false"/>
+                <w:bCs w:val="false"/>
+                <w:sz w:val="18"/>
+                <w:szCs w:val="18"/>
+                <w:rtl/>
+              </w:rPr>
+              <w:t xml:space="preserve"> 6 فحوص (حساب المراقبة بصلاحيات العرض وحدها، ADR 0013) و</w:t>
             </w:r>
             <w:r>
               <w:rPr>

</xml_diff>

<commit_message>
Word files of the design document, the design-and-ERD document and the relationship charts rebuilt (ADR 0014)
Co-Authored-By: Claude Opus 5.5 <noreply@anthropic.com>
Claude-Session: https://claude.ai/code/session_012HHcRrzuvMBTL2FYxXtsyv
</commit_message>
<xml_diff>
--- a/treasury-platform/docs/20-database-design.docx
+++ b/treasury-platform/docs/20-database-design.docx
@@ -38610,7 +38610,7 @@
           <w:szCs w:val="17"/>
           <w:rtl w:val="false"/>
         </w:rPr>
-        <w:t xml:space="preserve">tools/deploy/server_audit.sh apply                  # the database audit specification, inside the window</w:t>
+        <w:t xml:space="preserve">#   deploy.sh first runs db/ops/deploy_preflight.sql (ADR 0014): not sa nor a sysadmin, the SQL Server build and Ubuntu</w:t>
       </w:r>
     </w:p>
     <w:p>
@@ -38637,7 +38637,7 @@
           <w:szCs w:val="17"/>
           <w:rtl w:val="false"/>
         </w:rPr>
-        <w:t xml:space="preserve">tools/deploy/provision_logins.sh                    # the service logins (ADR 0009), inside the window</w:t>
+        <w:t xml:space="preserve">#   release of versions.json (gate G4), BankFas present in its collation and empty; nothing runs otherwise</w:t>
       </w:r>
     </w:p>
     <w:p>
@@ -38664,7 +38664,7 @@
           <w:szCs w:val="17"/>
           <w:rtl w:val="false"/>
         </w:rPr>
-        <w:t xml:space="preserve">tools/deploy/provision_monitor.sh                   # the monitoring login bankfas_monitor, view rights only (ADR 0013)</w:t>
+        <w:t xml:space="preserve">tools/deploy/server_audit.sh apply                  # the database audit specification, inside the window</w:t>
       </w:r>
     </w:p>
     <w:p>
@@ -38691,7 +38691,7 @@
           <w:szCs w:val="17"/>
           <w:rtl w:val="false"/>
         </w:rPr>
-        <w:t xml:space="preserve">tools/deploy/prepare_database.sh close</w:t>
+        <w:t xml:space="preserve">tools/deploy/provision_logins.sh                    # the service logins (ADR 0009), inside the window</w:t>
       </w:r>
     </w:p>
     <w:p>
@@ -38718,7 +38718,7 @@
           <w:szCs w:val="17"/>
           <w:rtl w:val="false"/>
         </w:rPr>
-        <w:t xml:space="preserve">SQL_USER=bankfas_monitor tools/dbgen/check_deployed.py --server &lt;server&gt;   # the post-deployment check (DOC-S11 section 8.2)</w:t>
+        <w:t xml:space="preserve">tools/deploy/provision_monitor.sh                   # the monitoring login bankfas_monitor, view rights only (ADR 0013)</w:t>
       </w:r>
     </w:p>
     <w:p>
@@ -38745,7 +38745,88 @@
           <w:szCs w:val="17"/>
           <w:rtl w:val="false"/>
         </w:rPr>
-        <w:t xml:space="preserve"># No tool trusts the server certificate by itself; only CI sets SQLCMD_OPTS=-C (DQ-S05-7, ADR 0013).</w:t>
+        <w:t xml:space="preserve">tools/deploy/prepare_database.sh close</w:t>
+      </w:r>
+    </w:p>
+    <w:p>
+      <w:pPr>
+        <w:keepNext/>
+        <w:keepLines/>
+        <w:pBdr>
+          <w:top w:val="single" w:color="BFC9D6" w:sz="4" w:space="4"/>
+          <w:left w:val="single" w:color="BFC9D6" w:sz="4" w:space="4"/>
+          <w:bottom w:val="single" w:color="BFC9D6" w:sz="4" w:space="4"/>
+          <w:right w:val="single" w:color="BFC9D6" w:sz="4" w:space="4"/>
+        </w:pBdr>
+        <w:shd w:fill="F1F3F5" w:color="auto" w:val="clear"/>
+        <w:bidi w:val="false"/>
+        <w:spacing w:after="0" w:before="0" w:line="260"/>
+        <w:ind w:left="120" w:right="120"/>
+        <w:jc w:val="left"/>
+      </w:pPr>
+      <w:r>
+        <w:rPr>
+          <w:rFonts w:ascii="Courier New" w:cs="Courier New" w:eastAsia="Courier New" w:hAnsi="Courier New"/>
+          <w:color w:val="1F2937"/>
+          <w:sz w:val="17"/>
+          <w:szCs w:val="17"/>
+          <w:rtl w:val="false"/>
+        </w:rPr>
+        <w:t xml:space="preserve">SQL_USER=bankfas_monitor tools/dbgen/check_deployed.py --server &lt;server&gt;   # the post-deployment check (DOC-S11 section 8.2)</w:t>
+      </w:r>
+    </w:p>
+    <w:p>
+      <w:pPr>
+        <w:keepNext/>
+        <w:keepLines/>
+        <w:pBdr>
+          <w:top w:val="single" w:color="BFC9D6" w:sz="4" w:space="4"/>
+          <w:left w:val="single" w:color="BFC9D6" w:sz="4" w:space="4"/>
+          <w:bottom w:val="single" w:color="BFC9D6" w:sz="4" w:space="4"/>
+          <w:right w:val="single" w:color="BFC9D6" w:sz="4" w:space="4"/>
+        </w:pBdr>
+        <w:shd w:fill="F1F3F5" w:color="auto" w:val="clear"/>
+        <w:bidi w:val="false"/>
+        <w:spacing w:after="0" w:before="0" w:line="260"/>
+        <w:ind w:left="120" w:right="120"/>
+        <w:jc w:val="left"/>
+      </w:pPr>
+      <w:r>
+        <w:rPr>
+          <w:rFonts w:ascii="Courier New" w:cs="Courier New" w:eastAsia="Courier New" w:hAnsi="Courier New"/>
+          <w:color w:val="1F2937"/>
+          <w:sz w:val="17"/>
+          <w:szCs w:val="17"/>
+          <w:rtl w:val="false"/>
+        </w:rPr>
+        <w:t xml:space="preserve"># No tool trusts the server certificate by itself; only CI sets SQLCMD_OPTS=-C (DQ-S05-7, ADR 0013). Every tool refuses</w:t>
+      </w:r>
+    </w:p>
+    <w:p>
+      <w:pPr>
+        <w:keepNext/>
+        <w:keepLines/>
+        <w:pBdr>
+          <w:top w:val="single" w:color="BFC9D6" w:sz="4" w:space="4"/>
+          <w:left w:val="single" w:color="BFC9D6" w:sz="4" w:space="4"/>
+          <w:bottom w:val="single" w:color="BFC9D6" w:sz="4" w:space="4"/>
+          <w:right w:val="single" w:color="BFC9D6" w:sz="4" w:space="4"/>
+        </w:pBdr>
+        <w:shd w:fill="F1F3F5" w:color="auto" w:val="clear"/>
+        <w:bidi w:val="false"/>
+        <w:spacing w:after="0" w:before="0" w:line="260"/>
+        <w:ind w:left="120" w:right="120"/>
+        <w:jc w:val="left"/>
+      </w:pPr>
+      <w:r>
+        <w:rPr>
+          <w:rFonts w:ascii="Courier New" w:cs="Courier New" w:eastAsia="Courier New" w:hAnsi="Courier New"/>
+          <w:color w:val="1F2937"/>
+          <w:sz w:val="17"/>
+          <w:szCs w:val="17"/>
+          <w:rtl w:val="false"/>
+        </w:rPr>
+        <w:t xml:space="preserve"># -C, and the administrator scripts refuse sa, unless CI's allowances are set (DQ-S11-6, ADR 0014).</w:t>
       </w:r>
     </w:p>
     <w:p>
@@ -44116,6 +44197,30 @@
                 <w:rtl/>
               </w:rPr>
               <w:t xml:space="preserve"> 6 فحوص (حساب المراقبة بصلاحيات العرض وحدها، ADR 0013) و</w:t>
+            </w:r>
+            <w:r>
+              <w:rPr>
+                <w:rFonts w:ascii="Courier New" w:cs="Courier New" w:eastAsia="Courier New" w:hAnsi="Courier New"/>
+                <w:b w:val="false"/>
+                <w:bCs w:val="false"/>
+                <w:color w:val="1F2937"/>
+                <w:sz w:val="16"/>
+                <w:szCs w:val="16"/>
+                <w:shd w:fill="F1F3F5" w:color="auto" w:val="clear"/>
+                <w:rtl/>
+              </w:rPr>
+              <w:t xml:space="preserve">‎tools/ci/deploy_preflight_check.sh‎</w:t>
+            </w:r>
+            <w:r>
+              <w:rPr>
+                <w:rFonts w:ascii="Arial" w:cs="Arial" w:eastAsia="Arial" w:hAnsi="Arial"/>
+                <w:b w:val="false"/>
+                <w:bCs w:val="false"/>
+                <w:sz w:val="18"/>
+                <w:szCs w:val="18"/>
+                <w:rtl/>
+              </w:rPr>
+              <w:t xml:space="preserve"> 5 فحوص (الفحص التمهيدي للنشر وبوابة G4، ADR 0014) و</w:t>
             </w:r>
             <w:r>
               <w:rPr>

</xml_diff>

<commit_message>
Word files rebuilt for the slice entry conditions and the external review package
The design document, the design-and-ERD document, the relationship charts, the detailed analysis, the review
register, the readiness documents and both readiness volumes, and the new external review package.

Co-Authored-By: Claude Opus 5.5 <noreply@anthropic.com>
Claude-Session: https://claude.ai/code/session_012HHcRrzuvMBTL2FYxXtsyv
</commit_message>
<xml_diff>
--- a/treasury-platform/docs/20-database-design.docx
+++ b/treasury-platform/docs/20-database-design.docx
@@ -39647,7 +39647,55 @@
           <w:szCs w:val="21"/>
           <w:rtl/>
         </w:rPr>
-        <w:t xml:space="preserve"> (التصدير في كل حالة تسمح به، ADR 0008)</w:t>
+        <w:t xml:space="preserve"> (التصدير في كل حالة تسمح به، ADR 0008) → </w:t>
+      </w:r>
+      <w:r>
+        <w:rPr>
+          <w:rFonts w:ascii="Courier New" w:cs="Courier New" w:eastAsia="Courier New" w:hAnsi="Courier New"/>
+          <w:b w:val="false"/>
+          <w:bCs w:val="false"/>
+          <w:color w:val="1F2937"/>
+          <w:sz w:val="18"/>
+          <w:szCs w:val="18"/>
+          <w:shd w:fill="F1F3F5" w:color="auto" w:val="clear"/>
+          <w:rtl/>
+        </w:rPr>
+        <w:t xml:space="preserve">‎043_review_guards‎</w:t>
+      </w:r>
+      <w:r>
+        <w:rPr>
+          <w:rFonts w:ascii="Arial" w:cs="Arial" w:eastAsia="Arial" w:hAnsi="Arial"/>
+          <w:b w:val="false"/>
+          <w:bCs w:val="false"/>
+          <w:sz w:val="21"/>
+          <w:szCs w:val="21"/>
+          <w:rtl/>
+        </w:rPr>
+        <w:t xml:space="preserve"> (حراس الدفعة أ، ADR 0011) → </w:t>
+      </w:r>
+      <w:r>
+        <w:rPr>
+          <w:rFonts w:ascii="Courier New" w:cs="Courier New" w:eastAsia="Courier New" w:hAnsi="Courier New"/>
+          <w:b w:val="false"/>
+          <w:bCs w:val="false"/>
+          <w:color w:val="1F2937"/>
+          <w:sz w:val="18"/>
+          <w:szCs w:val="18"/>
+          <w:shd w:fill="F1F3F5" w:color="auto" w:val="clear"/>
+          <w:rtl/>
+        </w:rPr>
+        <w:t xml:space="preserve">‎044_entry_guards‎</w:t>
+      </w:r>
+      <w:r>
+        <w:rPr>
+          <w:rFonts w:ascii="Arial" w:cs="Arial" w:eastAsia="Arial" w:hAnsi="Arial"/>
+          <w:b w:val="false"/>
+          <w:bCs w:val="false"/>
+          <w:sz w:val="21"/>
+          <w:szCs w:val="21"/>
+          <w:rtl/>
+        </w:rPr>
+        <w:t xml:space="preserve"> (شروط دخول الشرائح S1-ب إلى S4، ADR 0011)</w:t>
       </w:r>
     </w:p>
     <w:p>
@@ -42337,7 +42385,7 @@
                 <w:szCs w:val="18"/>
                 <w:rtl/>
               </w:rPr>
-              <w:t xml:space="preserve"> — 198 جدولًا / 3,324 عمودًا؛ لا مراجع معلّقة؛ لا مخالفة لقواعد النطاق</w:t>
+              <w:t xml:space="preserve"> — 199 جدولًا / 3,370 عمودًا؛ لا مراجع معلّقة؛ لا مخالفة لقواعد النطاق</w:t>
             </w:r>
           </w:p>
         </w:tc>
@@ -42793,7 +42841,7 @@
                 <w:szCs w:val="18"/>
                 <w:rtl/>
               </w:rPr>
-              <w:t xml:space="preserve">التحقق من الإصلاحات الحرجة (</w:t>
+              <w:t xml:space="preserve">التحقق من الإصلاحات (</w:t>
             </w:r>
             <w:r>
               <w:rPr>
@@ -42865,7 +42913,20 @@
                 <w:szCs w:val="18"/>
                 <w:rtl/>
               </w:rPr>
-              <w:t xml:space="preserve"> — 24 من 24</w:t>
+              <w:t xml:space="preserve"> — 75 من 75، في الخطوة 3 من </w:t>
+            </w:r>
+            <w:r>
+              <w:rPr>
+                <w:rFonts w:ascii="Courier New" w:cs="Courier New" w:eastAsia="Courier New" w:hAnsi="Courier New"/>
+                <w:b w:val="false"/>
+                <w:bCs w:val="false"/>
+                <w:color w:val="1F2937"/>
+                <w:sz w:val="16"/>
+                <w:szCs w:val="16"/>
+                <w:shd w:fill="F1F3F5" w:color="auto" w:val="clear"/>
+                <w:rtl/>
+              </w:rPr>
+              <w:t xml:space="preserve">‎db_ci.sh‎</w:t>
             </w:r>
           </w:p>
         </w:tc>
@@ -42902,7 +42963,7 @@
                 <w:szCs w:val="18"/>
                 <w:rtl/>
               </w:rPr>
-              <w:t xml:space="preserve">يفحص أن كل إصلاح من DR-01 إلى DR-10 موجود في DDL المولَّد، لا في الوثيقة وحدها</w:t>
+              <w:t xml:space="preserve">يفحص أن كل إصلاح من DR-01 إلى DR-50 موجود في DDL المولَّد أو في الحارس الثابت (043، 044)، لا في الوثيقة وحدها</w:t>
             </w:r>
           </w:p>
         </w:tc>
@@ -44148,7 +44209,7 @@
                 <w:szCs w:val="18"/>
                 <w:rtl/>
               </w:rPr>
-              <w:t xml:space="preserve"> 21 حالة (إصلاحات المراجعة، ADR 0011) و</w:t>
+              <w:t xml:space="preserve"> 34 حالة (إصلاحات المراجعة وشروط دخول الشرائح S1 إلى S4، ADR 0011) و</w:t>
             </w:r>
             <w:r>
               <w:rPr>
@@ -48214,7 +48275,7 @@
                 <w:szCs w:val="18"/>
                 <w:rtl/>
               </w:rPr>
-              <w:t xml:space="preserve"> مع 41 حالة عزل و6 لقاعدة الحصص</w:t>
+              <w:t xml:space="preserve"> مع 48 حالة عزل و6 لقاعدة الحصص و34 لإصلاحات المراجعة، في 22 خطوة</w:t>
             </w:r>
           </w:p>
         </w:tc>
@@ -50871,7 +50932,55 @@
                 <w:szCs w:val="18"/>
                 <w:rtl/>
               </w:rPr>
-              <w:t xml:space="preserve"> في CI)؛ ست نتائج والأجزاء الباقية شروط دخول لشرائحها (S1 إلى S4)، وDR-20 محلولة بـ DR-02</w:t>
+              <w:t xml:space="preserve"> في CI)؛ والدفعة (ب)، شروط دخول الشرائح S1 إلى S4، منفّذة كلها في اليوم نفسه (النموذج و</w:t>
+            </w:r>
+            <w:r>
+              <w:rPr>
+                <w:rFonts w:ascii="Courier New" w:cs="Courier New" w:eastAsia="Courier New" w:hAnsi="Courier New"/>
+                <w:b w:val="false"/>
+                <w:bCs w:val="false"/>
+                <w:color w:val="1F2937"/>
+                <w:sz w:val="16"/>
+                <w:szCs w:val="16"/>
+                <w:shd w:fill="F1F3F5" w:color="auto" w:val="clear"/>
+                <w:rtl/>
+              </w:rPr>
+              <w:t xml:space="preserve">‎044_entry_guards.sql‎</w:t>
+            </w:r>
+            <w:r>
+              <w:rPr>
+                <w:rFonts w:ascii="Arial" w:cs="Arial" w:eastAsia="Arial" w:hAnsi="Arial"/>
+                <w:b w:val="false"/>
+                <w:bCs w:val="false"/>
+                <w:sz w:val="18"/>
+                <w:szCs w:val="18"/>
+                <w:rtl/>
+              </w:rPr>
+              <w:t xml:space="preserve">، الاختبارات RF19 إلى RF34؛ 75 إصلاحًا يفحصها </w:t>
+            </w:r>
+            <w:r>
+              <w:rPr>
+                <w:rFonts w:ascii="Courier New" w:cs="Courier New" w:eastAsia="Courier New" w:hAnsi="Courier New"/>
+                <w:b w:val="false"/>
+                <w:bCs w:val="false"/>
+                <w:color w:val="1F2937"/>
+                <w:sz w:val="16"/>
+                <w:szCs w:val="16"/>
+                <w:shd w:fill="F1F3F5" w:color="auto" w:val="clear"/>
+                <w:rtl/>
+              </w:rPr>
+              <w:t xml:space="preserve">‎check_review_fixes.py‎</w:t>
+            </w:r>
+            <w:r>
+              <w:rPr>
+                <w:rFonts w:ascii="Arial" w:cs="Arial" w:eastAsia="Arial" w:hAnsi="Arial"/>
+                <w:b w:val="false"/>
+                <w:bCs w:val="false"/>
+                <w:sz w:val="18"/>
+                <w:szCs w:val="18"/>
+                <w:rtl/>
+              </w:rPr>
+              <w:t xml:space="preserve">)؛ وDR-20 محلولة بـ DR-02، ويبقى مؤجلًا مرساة البصمة الخارجية (مع O-13) وفحص المفاتيح المتقاعدة (DR-20)</w:t>
             </w:r>
           </w:p>
         </w:tc>

</xml_diff>